<commit_message>
Fix stale openai.* module description in README and Kindle guide
The structure/appendix listing still described openai.* as an HTTPS
client for OpenAI, left over from before the 3de15ed browser-side move —
it now only stores/hands back the API key. Regenerated the .docx/.pdf
to match.

Co-Authored-By: Claude Sonnet 5 <noreply@anthropic.com>
</commit_message>
<xml_diff>
--- a/docs/iot-camera-printer-guide.docx
+++ b/docs/iot-camera-printer-guide.docx
@@ -2,6 +2,40 @@
 <file path=word/document.xml><?xml version="1.0" encoding="utf-8"?>
 <w:document xmlns:w="http://schemas.openxmlformats.org/wordprocessingml/2006/main" xmlns:m="http://schemas.openxmlformats.org/officeDocument/2006/math" xmlns:r="http://schemas.openxmlformats.org/officeDocument/2006/relationships" xmlns:o="urn:schemas-microsoft-com:office:office" xmlns:v="urn:schemas-microsoft-com:vml" xmlns:w10="urn:schemas-microsoft-com:office:word" xmlns:a="http://schemas.openxmlformats.org/drawingml/2006/main" xmlns:pic="http://schemas.openxmlformats.org/drawingml/2006/picture" xmlns:wp="http://schemas.openxmlformats.org/drawingml/2006/wordprocessingDrawing">
   <w:body>
+    <w:p>
+      <w:pPr>
+        <w:pStyle w:val="Title"/>
+      </w:pPr>
+      <w:r>
+        <w:rPr>
+          <w:rFonts w:hint="eastAsia"/>
+        </w:rPr>
+        <w:t xml:space="preserve">M5Stackで始める</w:t>
+      </w:r>
+      <w:r>
+        <w:t xml:space="preserve"> IoTカメラ &amp; プリンター </w:t>
+      </w:r>
+      <w:r>
+        <w:rPr>
+          <w:rFonts w:hint="eastAsia"/>
+        </w:rPr>
+        <w:t xml:space="preserve">電子工作超入門</w:t>
+      </w:r>
+    </w:p>
+    <w:p>
+      <w:pPr>
+        <w:pStyle w:val="Subtitle"/>
+      </w:pPr>
+      <w:r>
+        <w:t xml:space="preserve">ATOM Printer × M5StickV × </w:t>
+      </w:r>
+      <w:r>
+        <w:rPr>
+          <w:rFonts w:hint="eastAsia"/>
+        </w:rPr>
+        <w:t xml:space="preserve">M5Paperで作る、AIカメラと感熱印刷のしくみ</w:t>
+      </w:r>
+    </w:p>
     <w:sdt>
       <w:sdtPr>
         <w:docPartObj>
@@ -28,51 +62,7 @@
         </w:p>
       </w:sdtContent>
     </w:sdt>
-    <w:bookmarkStart w:id="88" w:name="m5stackで始める-iotカメラ-プリンター-電子工作超入門"/>
-    <w:p>
-      <w:pPr>
-        <w:pStyle w:val="Heading1"/>
-      </w:pPr>
-      <w:r>
-        <w:rPr>
-          <w:rFonts w:hint="eastAsia"/>
-        </w:rPr>
-        <w:t xml:space="preserve">M5Stackで始める</w:t>
-      </w:r>
-      <w:r>
-        <w:t xml:space="preserve"> IoTカメラ &amp; プリンター </w:t>
-      </w:r>
-      <w:r>
-        <w:rPr>
-          <w:rFonts w:hint="eastAsia"/>
-        </w:rPr>
-        <w:t xml:space="preserve">電子工作超入門</w:t>
-      </w:r>
-    </w:p>
-    <w:bookmarkStart w:id="9" w:name="X13aa4e3afba791ed1b27c72f52f69d5036984f4"/>
-    <w:p>
-      <w:pPr>
-        <w:pStyle w:val="Heading3"/>
-      </w:pPr>
-      <w:r>
-        <w:t xml:space="preserve">ATOM Printer × M5StickV × </w:t>
-      </w:r>
-      <w:r>
-        <w:rPr>
-          <w:rFonts w:hint="eastAsia"/>
-        </w:rPr>
-        <w:t xml:space="preserve">M5Paperで作る、AIカメラと感熱印刷のしくみ</w:t>
-      </w:r>
-    </w:p>
-    <w:p>
-      <w:r>
-        <w:pict>
-          <v:rect style="width:0;height:1.5pt" o:hralign="center" o:hrstd="t" o:hr="t"/>
-        </w:pict>
-      </w:r>
-    </w:p>
-    <w:bookmarkEnd w:id="9"/>
-    <w:bookmarkStart w:id="13" w:name="はじめに"/>
+    <w:bookmarkStart w:id="12" w:name="はじめに"/>
     <w:p>
       <w:pPr>
         <w:pStyle w:val="Heading2"/>
@@ -237,7 +227,7 @@
         <w:t xml:space="preserve">これは架空の説明ではなく、本書が題材にしている実際のオープンソースプロジェクト「m5web」の仕様に基づいています。ファームウェアのソースコードも、配線も、通信プロトコルも、すべて実在するものです。本書を読み終える頃には、あなたの手元にも同じものが（あるいはあなた自身のアイデアを加えた発展版が）動いているはずです。</w:t>
       </w:r>
     </w:p>
-    <w:bookmarkStart w:id="10" w:name="本書の対象読者"/>
+    <w:bookmarkStart w:id="9" w:name="本書の対象読者"/>
     <w:p>
       <w:pPr>
         <w:pStyle w:val="Heading3"/>
@@ -323,8 +313,8 @@
         <w:t xml:space="preserve">電子工作もプログラミングも「はじめて」という方でも読み進められるよう、第1章では前提知識をゼロから説明します。すでに詳しい方は第1章を読み飛ばして第2章から読んでも構いません。</w:t>
       </w:r>
     </w:p>
-    <w:bookmarkEnd w:id="10"/>
-    <w:bookmarkStart w:id="11" w:name="本書で扱わないこと"/>
+    <w:bookmarkEnd w:id="9"/>
+    <w:bookmarkStart w:id="10" w:name="本書で扱わないこと"/>
     <w:p>
       <w:pPr>
         <w:pStyle w:val="Heading3"/>
@@ -366,8 +356,8 @@
         <w:t xml:space="preserve">C++・Pythonそのものの文法入門（コードは掲載しますが、初歩的な文法解説は最小限にとどめます）</w:t>
       </w:r>
     </w:p>
-    <w:bookmarkEnd w:id="11"/>
-    <w:bookmarkStart w:id="12" w:name="完成すると何ができるか"/>
+    <w:bookmarkEnd w:id="10"/>
+    <w:bookmarkStart w:id="11" w:name="完成すると何ができるか"/>
     <w:p>
       <w:pPr>
         <w:pStyle w:val="Heading3"/>
@@ -609,9 +599,9 @@
         </w:pict>
       </w:r>
     </w:p>
+    <w:bookmarkEnd w:id="11"/>
     <w:bookmarkEnd w:id="12"/>
-    <w:bookmarkEnd w:id="13"/>
-    <w:bookmarkStart w:id="19" w:name="第1章-iotの基礎知識"/>
+    <w:bookmarkStart w:id="18" w:name="第1章-iotの基礎知識"/>
     <w:p>
       <w:pPr>
         <w:pStyle w:val="Heading2"/>
@@ -632,7 +622,7 @@
         <w:t xml:space="preserve">IoTの基礎知識</w:t>
       </w:r>
     </w:p>
-    <w:bookmarkStart w:id="14" w:name="iotとは何か"/>
+    <w:bookmarkStart w:id="13" w:name="iotとは何か"/>
     <w:p>
       <w:pPr>
         <w:pStyle w:val="Heading3"/>
@@ -769,8 +759,8 @@
         <w:t xml:space="preserve">からです。</w:t>
       </w:r>
     </w:p>
-    <w:bookmarkEnd w:id="14"/>
-    <w:bookmarkStart w:id="15" w:name="マイコンとコンピューターの違い"/>
+    <w:bookmarkEnd w:id="13"/>
+    <w:bookmarkStart w:id="14" w:name="マイコンとコンピューターの違い"/>
     <w:p>
       <w:pPr>
         <w:pStyle w:val="Heading3"/>
@@ -1117,8 +1107,8 @@
         <w:t xml:space="preserve">という関数を電源が切れるまでずっと繰り返します。これは後の章で実際のコードを見ながら確認します。</w:t>
       </w:r>
     </w:p>
-    <w:bookmarkEnd w:id="15"/>
-    <w:bookmarkStart w:id="16" w:name="通信方式のミニ辞典"/>
+    <w:bookmarkEnd w:id="14"/>
+    <w:bookmarkStart w:id="15" w:name="通信方式のミニ辞典"/>
     <w:p>
       <w:pPr>
         <w:pStyle w:val="Heading3"/>
@@ -1242,8 +1232,8 @@
         <w:t xml:space="preserve">Liteは、内部にごく小さなWebサーバーを持っており、iPhoneのブラウザやM5Paperからの「この写真をちょうだい（GETリクエスト）」「これを印刷して（POSTリクエスト）」といった要求に応答します。この「Webサーバーとしてのマイコン」という考え方が、本書のキモになる部分です。</w:t>
       </w:r>
     </w:p>
-    <w:bookmarkEnd w:id="16"/>
-    <w:bookmarkStart w:id="17" w:name="なぜこの3台なのか"/>
+    <w:bookmarkEnd w:id="15"/>
+    <w:bookmarkStart w:id="16" w:name="なぜこの3台なのか"/>
     <w:p>
       <w:pPr>
         <w:pStyle w:val="Heading3"/>
@@ -1376,8 +1366,8 @@
         <w:t xml:space="preserve">Liteが中心（ハブ）となり、M5StickVからはUARTで、iPhoneやM5PaperからはWi-Fi経由のHTTPで、それぞれ接続する構成になっています。</w:t>
       </w:r>
     </w:p>
-    <w:bookmarkEnd w:id="17"/>
-    <w:bookmarkStart w:id="18" w:name="本書のシステム全体を図で理解する"/>
+    <w:bookmarkEnd w:id="16"/>
+    <w:bookmarkStart w:id="17" w:name="本書のシステム全体を図で理解する"/>
     <w:p>
       <w:pPr>
         <w:pStyle w:val="Heading3"/>
@@ -1753,9 +1743,9 @@
         </w:pict>
       </w:r>
     </w:p>
+    <w:bookmarkEnd w:id="17"/>
     <w:bookmarkEnd w:id="18"/>
-    <w:bookmarkEnd w:id="19"/>
-    <w:bookmarkStart w:id="23" w:name="第2章-プロジェクトの全体像"/>
+    <w:bookmarkStart w:id="22" w:name="第2章-プロジェクトの全体像"/>
     <w:p>
       <w:pPr>
         <w:pStyle w:val="Heading2"/>
@@ -1776,7 +1766,7 @@
         <w:t xml:space="preserve">プロジェクトの全体像</w:t>
       </w:r>
     </w:p>
-    <w:bookmarkStart w:id="20" w:name="完成品のユーザー体験を先に確認する"/>
+    <w:bookmarkStart w:id="19" w:name="完成品のユーザー体験を先に確認する"/>
     <w:p>
       <w:pPr>
         <w:pStyle w:val="Heading3"/>
@@ -2113,8 +2103,8 @@
         <w:t xml:space="preserve">Liteの仕組みを共有しているという点が、このプロジェクトの設計の面白さです。</w:t>
       </w:r>
     </w:p>
-    <w:bookmarkEnd w:id="20"/>
-    <w:bookmarkStart w:id="21" w:name="プロジェクトを構成するソフトウェアの全体地図"/>
+    <w:bookmarkEnd w:id="19"/>
+    <w:bookmarkStart w:id="20" w:name="プロジェクトを構成するソフトウェアの全体地図"/>
     <w:p>
       <w:pPr>
         <w:pStyle w:val="Heading3"/>
@@ -2476,8 +2466,8 @@
         <w:t xml:space="preserve">Lite内蔵のフラッシュメモリ（LittleFS）が非力なため、依存ライブラリを増やしたくないという設計判断です。</w:t>
       </w:r>
     </w:p>
-    <w:bookmarkEnd w:id="21"/>
-    <w:bookmarkStart w:id="22" w:name="atom-lite中心というアーキテクチャの利点"/>
+    <w:bookmarkEnd w:id="20"/>
+    <w:bookmarkStart w:id="21" w:name="atom-lite中心というアーキテクチャの利点"/>
     <w:p>
       <w:pPr>
         <w:pStyle w:val="Heading3"/>
@@ -2654,9 +2644,9 @@
         </w:pict>
       </w:r>
     </w:p>
+    <w:bookmarkEnd w:id="21"/>
     <w:bookmarkEnd w:id="22"/>
-    <w:bookmarkEnd w:id="23"/>
-    <w:bookmarkStart w:id="29" w:name="第3章-使用デバイスの解説"/>
+    <w:bookmarkStart w:id="28" w:name="第3章-使用デバイスの解説"/>
     <w:p>
       <w:pPr>
         <w:pStyle w:val="Heading2"/>
@@ -2677,7 +2667,7 @@
         <w:t xml:space="preserve">使用デバイスの解説</w:t>
       </w:r>
     </w:p>
-    <w:bookmarkStart w:id="24" w:name="m5stackとは製品ラインナップ"/>
+    <w:bookmarkStart w:id="23" w:name="m5stackとは製品ラインナップ"/>
     <w:p>
       <w:pPr>
         <w:pStyle w:val="Heading3"/>
@@ -3357,8 +3347,8 @@
         <w:t xml:space="preserve">IDEの開発環境構築でも、この点に改めて触れます。</w:t>
       </w:r>
     </w:p>
-    <w:bookmarkEnd w:id="24"/>
-    <w:bookmarkStart w:id="25" w:name="atom-printer-kitatom-lite-58mm感熱プリンター"/>
+    <w:bookmarkEnd w:id="23"/>
+    <w:bookmarkStart w:id="24" w:name="atom-printer-kitatom-lite-58mm感熱プリンター"/>
     <w:p>
       <w:pPr>
         <w:pStyle w:val="Heading3"/>
@@ -3776,8 +3766,8 @@
         <w:t xml:space="preserve">）を前提に解説します。</w:t>
       </w:r>
     </w:p>
-    <w:bookmarkEnd w:id="25"/>
-    <w:bookmarkStart w:id="26" w:name="m5stickvkendryte-k210搭載aiカメラ"/>
+    <w:bookmarkEnd w:id="24"/>
+    <w:bookmarkStart w:id="25" w:name="m5stickvkendryte-k210搭載aiカメラ"/>
     <w:p>
       <w:pPr>
         <w:pStyle w:val="Heading3"/>
@@ -4213,8 +4203,8 @@
         <w:t xml:space="preserve">K210は高性能なAIチップですが、MicroPythonが自由に使えるヒープメモリ（プログラムが動的に確保できる作業用メモリ）は非常に限られています。本書の第6章で詳しく扱いますが、「384×512ピクセル程度の画像バッファを1つ作っただけでメモリ不足になる」という制約が、実際のプログラム設計に大きな影響を与えています。小型AIカメラを使いこなす上で、こうしたメモリ制約への対処は避けて通れないテーマです。</w:t>
       </w:r>
     </w:p>
-    <w:bookmarkEnd w:id="26"/>
-    <w:bookmarkStart w:id="27" w:name="m5papercolor電子ペーパー端末"/>
+    <w:bookmarkEnd w:id="25"/>
+    <w:bookmarkStart w:id="26" w:name="m5papercolor電子ペーパー端末"/>
     <w:p>
       <w:pPr>
         <w:pStyle w:val="Heading3"/>
@@ -4545,8 +4535,8 @@
         <w:t xml:space="preserve">Blanchon氏）の3つを使用します。</w:t>
       </w:r>
     </w:p>
-    <w:bookmarkEnd w:id="27"/>
-    <w:bookmarkStart w:id="28" w:name="部品リストのまとめ"/>
+    <w:bookmarkEnd w:id="26"/>
+    <w:bookmarkStart w:id="27" w:name="部品リストのまとめ"/>
     <w:p>
       <w:pPr>
         <w:pStyle w:val="Heading3"/>
@@ -4761,9 +4751,9 @@
         </w:pict>
       </w:r>
     </w:p>
+    <w:bookmarkEnd w:id="27"/>
     <w:bookmarkEnd w:id="28"/>
-    <w:bookmarkEnd w:id="29"/>
-    <w:bookmarkStart w:id="38" w:name="第4章-開発環境を準備する"/>
+    <w:bookmarkStart w:id="37" w:name="第4章-開発環境を準備する"/>
     <w:p>
       <w:pPr>
         <w:pStyle w:val="Heading2"/>
@@ -4917,7 +4907,7 @@
         </w:tc>
       </w:tr>
     </w:tbl>
-    <w:bookmarkStart w:id="31" w:name="platformioのセットアップatom-lite用推奨"/>
+    <w:bookmarkStart w:id="30" w:name="platformioのセットアップatom-lite用推奨"/>
     <w:p>
       <w:pPr>
         <w:pStyle w:val="Heading3"/>
@@ -4995,7 +4985,7 @@
           <w:numId w:val="1013"/>
         </w:numPr>
       </w:pPr>
-      <w:hyperlink r:id="rId30">
+      <w:hyperlink r:id="rId29">
         <w:r>
           <w:rPr>
             <w:rStyle w:val="Hyperlink"/>
@@ -5301,8 +5291,8 @@
         <w:t xml:space="preserve">missing」という表示になってしまいます。両方を必ずセットで実行する習慣をつけましょう。</w:t>
       </w:r>
     </w:p>
-    <w:bookmarkEnd w:id="31"/>
-    <w:bookmarkStart w:id="34" w:name="m5stackシリーズをarduino-ideで利用するための設定方法"/>
+    <w:bookmarkEnd w:id="30"/>
+    <w:bookmarkStart w:id="33" w:name="m5stackシリーズをarduino-ideで利用するための設定方法"/>
     <w:p>
       <w:pPr>
         <w:pStyle w:val="Heading3"/>
@@ -5405,7 +5395,7 @@
       <w:pPr>
         <w:pStyle w:val="BodyText"/>
       </w:pPr>
-      <w:hyperlink r:id="rId32">
+      <w:hyperlink r:id="rId31">
         <w:r>
           <w:rPr>
             <w:rStyle w:val="Hyperlink"/>
@@ -6885,7 +6875,7 @@
         </w:rPr>
         <w:t xml:space="preserve">2.x系では</w:t>
       </w:r>
-      <w:hyperlink r:id="rId33">
+      <w:hyperlink r:id="rId32">
         <w:r>
           <w:rPr>
             <w:rStyle w:val="Hyperlink"/>
@@ -7163,8 +7153,8 @@
         <w:t xml:space="preserve">：esp32ボードパッケージのバージョンと、インストールしたM5Stack公式ライブラリのバージョンの組み合わせが対応していない可能性があります。ライブラリのGitHubリポジトリのREADMEやリリースノートで、動作確認済みのesp32パッケージバージョンを確認してください。</w:t>
       </w:r>
     </w:p>
-    <w:bookmarkEnd w:id="34"/>
-    <w:bookmarkStart w:id="36" w:name="maixpy-ideのセットアップm5stickv用"/>
+    <w:bookmarkEnd w:id="33"/>
+    <w:bookmarkStart w:id="35" w:name="maixpy-ideのセットアップm5stickv用"/>
     <w:p>
       <w:pPr>
         <w:pStyle w:val="Heading3"/>
@@ -7211,7 +7201,7 @@
           <w:numId w:val="1015"/>
         </w:numPr>
       </w:pPr>
-      <w:hyperlink r:id="rId35">
+      <w:hyperlink r:id="rId34">
         <w:r>
           <w:rPr>
             <w:rStyle w:val="Hyperlink"/>
@@ -7312,8 +7302,8 @@
         <w:t xml:space="preserve">として保存するという流れになります。</w:t>
       </w:r>
     </w:p>
-    <w:bookmarkEnd w:id="36"/>
-    <w:bookmarkStart w:id="37" w:name="開発環境準備のチェックリスト"/>
+    <w:bookmarkEnd w:id="35"/>
+    <w:bookmarkStart w:id="36" w:name="開発環境準備のチェックリスト"/>
     <w:p>
       <w:pPr>
         <w:pStyle w:val="Heading3"/>
@@ -7471,9 +7461,9 @@
         </w:pict>
       </w:r>
     </w:p>
+    <w:bookmarkEnd w:id="36"/>
     <w:bookmarkEnd w:id="37"/>
-    <w:bookmarkEnd w:id="38"/>
-    <w:bookmarkStart w:id="43" w:name="第5章-atom-printer-kitを組み立てる"/>
+    <w:bookmarkStart w:id="42" w:name="第5章-atom-printer-kitを組み立てる"/>
     <w:p>
       <w:pPr>
         <w:pStyle w:val="Heading2"/>
@@ -7514,7 +7504,7 @@
         <w:t xml:space="preserve">Kitのセットアップを行います。この章が終わると、iPhoneのブラウザから写真をアップロードして印刷できる、単体でも動くシステムが完成します。</w:t>
       </w:r>
     </w:p>
-    <w:bookmarkStart w:id="39" w:name="配線を確認する"/>
+    <w:bookmarkStart w:id="38" w:name="配線を確認する"/>
     <w:p>
       <w:pPr>
         <w:pStyle w:val="Heading3"/>
@@ -7696,8 +7686,8 @@
         <w:t xml:space="preserve">Lite本体へのUSB給電と、プリンターへのDC12V給電は別系統です。両方が入って初めて印刷可能な状態になります。</w:t>
       </w:r>
     </w:p>
-    <w:bookmarkEnd w:id="39"/>
-    <w:bookmarkStart w:id="40" w:name="ファームウェアを書き込む"/>
+    <w:bookmarkEnd w:id="38"/>
+    <w:bookmarkStart w:id="39" w:name="ファームウェアを書き込む"/>
     <w:p>
       <w:pPr>
         <w:pStyle w:val="Heading3"/>
@@ -7914,8 +7904,8 @@
         <w:t xml:space="preserve">フォルダの内容をLittleFSへアップロードします。</w:t>
       </w:r>
     </w:p>
-    <w:bookmarkEnd w:id="40"/>
-    <w:bookmarkStart w:id="41" w:name="初回のwi-fi設定"/>
+    <w:bookmarkEnd w:id="39"/>
+    <w:bookmarkStart w:id="40" w:name="初回のwi-fi設定"/>
     <w:p>
       <w:pPr>
         <w:pStyle w:val="Heading3"/>
@@ -8182,8 +8172,8 @@
         <w:t xml:space="preserve">Lite本体のボタンを5秒以上長押しすると、保存済みのWi-Fi設定が消去されて再起動し、再びアクセスポイントモードに戻ります。接続済みの状態から別のネットワークへ切り替えたいだけであれば、リセットせずに、後述する設定タブの「Wi-Fi設定」カードから変更できます。</w:t>
       </w:r>
     </w:p>
-    <w:bookmarkEnd w:id="41"/>
-    <w:bookmarkStart w:id="42" w:name="web-uim5webページの使い方"/>
+    <w:bookmarkEnd w:id="40"/>
+    <w:bookmarkStart w:id="41" w:name="web-uim5webページの使い方"/>
     <w:p>
       <w:pPr>
         <w:pStyle w:val="Heading3"/>
@@ -8763,9 +8753,9 @@
         </w:pict>
       </w:r>
     </w:p>
+    <w:bookmarkEnd w:id="41"/>
     <w:bookmarkEnd w:id="42"/>
-    <w:bookmarkEnd w:id="43"/>
-    <w:bookmarkStart w:id="54" w:name="第6章-m5stickvカメラ連携を構築する"/>
+    <w:bookmarkStart w:id="53" w:name="第6章-m5stickvカメラ連携を構築する"/>
     <w:p>
       <w:pPr>
         <w:pStyle w:val="Heading2"/>
@@ -8829,7 +8819,7 @@
         <w:t xml:space="preserve">で実現されています。</w:t>
       </w:r>
     </w:p>
-    <w:bookmarkStart w:id="44" w:name="配線"/>
+    <w:bookmarkStart w:id="43" w:name="配線"/>
     <w:p>
       <w:pPr>
         <w:pStyle w:val="Heading3"/>
@@ -9079,8 +9069,8 @@
         </w:tc>
       </w:tr>
     </w:tbl>
-    <w:bookmarkEnd w:id="44"/>
-    <w:bookmarkStart w:id="45" w:name="m5stickv側スクリプトの書き込み"/>
+    <w:bookmarkEnd w:id="43"/>
+    <w:bookmarkStart w:id="44" w:name="m5stickv側スクリプトの書き込み"/>
     <w:p>
       <w:pPr>
         <w:pStyle w:val="Heading3"/>
@@ -9306,8 +9296,8 @@
         <w:t xml:space="preserve">です（通常のファームウェア書き込みだけで対応済みです）。</w:t>
       </w:r>
     </w:p>
-    <w:bookmarkEnd w:id="45"/>
-    <w:bookmarkStart w:id="46" w:name="撮影の流れとledの合図"/>
+    <w:bookmarkEnd w:id="44"/>
+    <w:bookmarkStart w:id="45" w:name="撮影の流れとledの合図"/>
     <w:p>
       <w:pPr>
         <w:pStyle w:val="Heading3"/>
@@ -9543,8 +9533,8 @@
         <w:t xml:space="preserve">ファイルが見つからない・読み込めないといった状況でもエラーで処理を止めることはなく、無音のまま撮影・送信が続行されます。</w:t>
       </w:r>
     </w:p>
-    <w:bookmarkEnd w:id="46"/>
-    <w:bookmarkStart w:id="47" w:name="カメラの向きの補正"/>
+    <w:bookmarkEnd w:id="45"/>
+    <w:bookmarkStart w:id="46" w:name="カメラの向きの補正"/>
     <w:p>
       <w:pPr>
         <w:pStyle w:val="Heading3"/>
@@ -9830,8 +9820,8 @@
         <w:t xml:space="preserve">内の座標変換式を直接書き換えます。式の導出根拠は関数のdocstringに記載されています。</w:t>
       </w:r>
     </w:p>
-    <w:bookmarkEnd w:id="47"/>
-    <w:bookmarkStart w:id="48" w:name="顔検出のしくみ"/>
+    <w:bookmarkEnd w:id="46"/>
+    <w:bookmarkStart w:id="47" w:name="顔検出のしくみ"/>
     <w:p>
       <w:pPr>
         <w:pStyle w:val="Heading3"/>
@@ -10013,8 +10003,8 @@
         <w:t xml:space="preserve">現時点では顔以外の判定（物体分類など）は実装されていませんが、K210のKPU機能を使った物体分類モデルを追加すれば、同じラベル欄に乗せる形で拡張できる設計になっています。</w:t>
       </w:r>
     </w:p>
-    <w:bookmarkEnd w:id="48"/>
-    <w:bookmarkStart w:id="49" w:name="印刷時のキャプション時刻検出ラベル"/>
+    <w:bookmarkEnd w:id="47"/>
+    <w:bookmarkStart w:id="48" w:name="印刷時のキャプション時刻検出ラベル"/>
     <w:p>
       <w:pPr>
         <w:pStyle w:val="Heading3"/>
@@ -10200,8 +10190,8 @@
         <w:t xml:space="preserve">画像の高さがキャプション帯（18ドット）以下という極端に小さい写真の場合は、キャプション自体が省略されます。</w:t>
       </w:r>
     </w:p>
-    <w:bookmarkEnd w:id="49"/>
-    <w:bookmarkStart w:id="50" w:name="web上での確認印刷モード"/>
+    <w:bookmarkEnd w:id="48"/>
+    <w:bookmarkStart w:id="49" w:name="web上での確認印刷モード"/>
     <w:p>
       <w:pPr>
         <w:pStyle w:val="Heading3"/>
@@ -10483,8 +10473,8 @@
         <w:t xml:space="preserve">、M5StickV側から届いたグレースケール画像をディザリング変換する前に適用されます。既に受信・表示中の1枚には遡って反映されません。</w:t>
       </w:r>
     </w:p>
-    <w:bookmarkEnd w:id="50"/>
-    <w:bookmarkStart w:id="51" w:name="atom-lite本体のrgb-ledによる状態表示"/>
+    <w:bookmarkEnd w:id="49"/>
+    <w:bookmarkStart w:id="50" w:name="atom-lite本体のrgb-ledによる状態表示"/>
     <w:p>
       <w:pPr>
         <w:pStyle w:val="Heading3"/>
@@ -10663,8 +10653,8 @@
         <w:t xml:space="preserve">Lite本体のLEDを見るだけで「再印刷できる写真がある」「確認待ちの写真がある」という状態を把握できます。</w:t>
       </w:r>
     </w:p>
-    <w:bookmarkEnd w:id="51"/>
-    <w:bookmarkStart w:id="52" w:name="通信プロトコルの詳細"/>
+    <w:bookmarkEnd w:id="50"/>
+    <w:bookmarkStart w:id="51" w:name="通信プロトコルの詳細"/>
     <w:p>
       <w:pPr>
         <w:pStyle w:val="Heading3"/>
@@ -10917,8 +10907,8 @@
         <w:t xml:space="preserve">このプロトコル設計を読み解くと、「未検証のデータを不用意に印刷してしまわない」という安全性への配慮が随所に見られます。</w:t>
       </w:r>
     </w:p>
-    <w:bookmarkEnd w:id="52"/>
-    <w:bookmarkStart w:id="53" w:name="既知の注意点"/>
+    <w:bookmarkEnd w:id="51"/>
+    <w:bookmarkStart w:id="52" w:name="既知の注意点"/>
     <w:p>
       <w:pPr>
         <w:pStyle w:val="Heading3"/>
@@ -11356,9 +11346,9 @@
         </w:pict>
       </w:r>
     </w:p>
+    <w:bookmarkEnd w:id="52"/>
     <w:bookmarkEnd w:id="53"/>
-    <w:bookmarkEnd w:id="54"/>
-    <w:bookmarkStart w:id="59" w:name="第7章-m5papercolorで写真を確認印刷する"/>
+    <w:bookmarkStart w:id="58" w:name="第7章-m5papercolorで写真を確認印刷する"/>
     <w:p>
       <w:pPr>
         <w:pStyle w:val="Heading2"/>
@@ -11390,7 +11380,7 @@
         <w:t xml:space="preserve">本章では、iPhoneのブラウザを使わずに、M5PaperColor単体でギャラリー（M5StickVカメラ撮影・アップロード両方の保存履歴）を確認・印刷できるようにします。</w:t>
       </w:r>
     </w:p>
-    <w:bookmarkStart w:id="55" w:name="m5papercolorの役割"/>
+    <w:bookmarkStart w:id="54" w:name="m5papercolorの役割"/>
     <w:p>
       <w:pPr>
         <w:pStyle w:val="Heading3"/>
@@ -11520,8 +11510,8 @@
         <w:t xml:space="preserve">Lite側を変更せずに新しい入り口を増やせる――が実際に体現されています。</w:t>
       </w:r>
     </w:p>
-    <w:bookmarkEnd w:id="55"/>
-    <w:bookmarkStart w:id="56" w:name="導入手順"/>
+    <w:bookmarkEnd w:id="54"/>
+    <w:bookmarkStart w:id="55" w:name="導入手順"/>
     <w:p>
       <w:pPr>
         <w:pStyle w:val="Heading3"/>
@@ -11768,8 +11758,8 @@
         <w:t xml:space="preserve">Liteと同じWi-Fiネットワークを選んでパスワードを入力すると、本機のAPは終了して指定したネットワークにクライアントとして参加します。設定はNVSに保存され、次回起動時から自動的にそのネットワークへ接続します。</w:t>
       </w:r>
     </w:p>
-    <w:bookmarkEnd w:id="56"/>
-    <w:bookmarkStart w:id="57" w:name="使い方"/>
+    <w:bookmarkEnd w:id="55"/>
+    <w:bookmarkStart w:id="56" w:name="使い方"/>
     <w:p>
       <w:pPr>
         <w:pStyle w:val="Heading3"/>
@@ -11935,8 +11925,8 @@
         <w:t xml:space="preserve">Lite本体のNVSに保存され、M5PaperColor側は5秒おきにこの設定自体を確認しているため、M5PaperColorを再起動しなくても切り替えがすぐに反映されます。いずれの方式でも、選択中の写真は（新しい写真が増えて順番がずれても）IDで追跡され続けます。フラッシュ本体からの削除は現状m5webページ側でのみ行えます。</w:t>
       </w:r>
     </w:p>
-    <w:bookmarkEnd w:id="57"/>
-    <w:bookmarkStart w:id="58" w:name="既知の注意点-1"/>
+    <w:bookmarkEnd w:id="56"/>
+    <w:bookmarkStart w:id="57" w:name="既知の注意点-1"/>
     <w:p>
       <w:pPr>
         <w:pStyle w:val="Heading3"/>
@@ -12175,9 +12165,9 @@
         </w:pict>
       </w:r>
     </w:p>
+    <w:bookmarkEnd w:id="57"/>
     <w:bookmarkEnd w:id="58"/>
-    <w:bookmarkEnd w:id="59"/>
-    <w:bookmarkStart w:id="65" w:name="第8章-プログラムから使うweb-api"/>
+    <w:bookmarkStart w:id="64" w:name="第8章-プログラムから使うweb-api"/>
     <w:p>
       <w:pPr>
         <w:pStyle w:val="Heading2"/>
@@ -12263,7 +12253,7 @@
         <w:t xml:space="preserve">（またはIPアドレス）です。</w:t>
       </w:r>
     </w:p>
-    <w:bookmarkStart w:id="60" w:name="apiリファレンス"/>
+    <w:bookmarkStart w:id="59" w:name="apiリファレンス"/>
     <w:p>
       <w:pPr>
         <w:pStyle w:val="Heading3"/>
@@ -13754,311 +13744,311 @@
         </w:tc>
       </w:tr>
     </w:tbl>
+    <w:bookmarkEnd w:id="59"/>
+    <w:bookmarkStart w:id="60" w:name="curlでの基本操作"/>
+    <w:p>
+      <w:pPr>
+        <w:pStyle w:val="Heading3"/>
+      </w:pPr>
+      <w:r>
+        <w:t xml:space="preserve">8.2　</w:t>
+      </w:r>
+      <w:r>
+        <w:rPr>
+          <w:rFonts w:hint="eastAsia"/>
+        </w:rPr>
+        <w:t xml:space="preserve">curlでの基本操作</w:t>
+      </w:r>
+    </w:p>
+    <w:p>
+      <w:pPr>
+        <w:pStyle w:val="SourceCode"/>
+      </w:pPr>
+      <w:r>
+        <w:rPr>
+          <w:rStyle w:val="VariableTok"/>
+        </w:rPr>
+        <w:t xml:space="preserve">HOST</w:t>
+      </w:r>
+      <w:r>
+        <w:rPr>
+          <w:rStyle w:val="OperatorTok"/>
+        </w:rPr>
+        <w:t xml:space="preserve">=</w:t>
+      </w:r>
+      <w:r>
+        <w:rPr>
+          <w:rStyle w:val="NormalTok"/>
+        </w:rPr>
+        <w:t xml:space="preserve">http://m5web.local</w:t>
+      </w:r>
+      <w:r>
+        <w:br/>
+      </w:r>
+      <w:r>
+        <w:br/>
+      </w:r>
+      <w:r>
+        <w:rPr>
+          <w:rStyle w:val="CommentTok"/>
+        </w:rPr>
+        <w:t xml:space="preserve"># テキスト印刷</w:t>
+      </w:r>
+      <w:r>
+        <w:br/>
+      </w:r>
+      <w:r>
+        <w:rPr>
+          <w:rStyle w:val="ExtensionTok"/>
+        </w:rPr>
+        <w:t xml:space="preserve">curl</w:t>
+      </w:r>
+      <w:r>
+        <w:rPr>
+          <w:rStyle w:val="NormalTok"/>
+        </w:rPr>
+        <w:t xml:space="preserve"> </w:t>
+      </w:r>
+      <w:r>
+        <w:rPr>
+          <w:rStyle w:val="AttributeTok"/>
+        </w:rPr>
+        <w:t xml:space="preserve">-X</w:t>
+      </w:r>
+      <w:r>
+        <w:rPr>
+          <w:rStyle w:val="NormalTok"/>
+        </w:rPr>
+        <w:t xml:space="preserve"> POST </w:t>
+      </w:r>
+      <w:r>
+        <w:rPr>
+          <w:rStyle w:val="StringTok"/>
+        </w:rPr>
+        <w:t xml:space="preserve">"</w:t>
+      </w:r>
+      <w:r>
+        <w:rPr>
+          <w:rStyle w:val="VariableTok"/>
+        </w:rPr>
+        <w:t xml:space="preserve">$HOST</w:t>
+      </w:r>
+      <w:r>
+        <w:rPr>
+          <w:rStyle w:val="StringTok"/>
+        </w:rPr>
+        <w:t xml:space="preserve">/api/print/text"</w:t>
+      </w:r>
+      <w:r>
+        <w:rPr>
+          <w:rStyle w:val="NormalTok"/>
+        </w:rPr>
+        <w:t xml:space="preserve"> </w:t>
+      </w:r>
+      <w:r>
+        <w:rPr>
+          <w:rStyle w:val="AttributeTok"/>
+        </w:rPr>
+        <w:t xml:space="preserve">--data-urlencode</w:t>
+      </w:r>
+      <w:r>
+        <w:rPr>
+          <w:rStyle w:val="NormalTok"/>
+        </w:rPr>
+        <w:t xml:space="preserve"> </w:t>
+      </w:r>
+      <w:r>
+        <w:rPr>
+          <w:rStyle w:val="StringTok"/>
+        </w:rPr>
+        <w:t xml:space="preserve">"text=Hello from a script"</w:t>
+      </w:r>
+      <w:r>
+        <w:br/>
+      </w:r>
+      <w:r>
+        <w:br/>
+      </w:r>
+      <w:r>
+        <w:rPr>
+          <w:rStyle w:val="CommentTok"/>
+        </w:rPr>
+        <w:t xml:space="preserve"># QRコード印刷</w:t>
+      </w:r>
+      <w:r>
+        <w:br/>
+      </w:r>
+      <w:r>
+        <w:rPr>
+          <w:rStyle w:val="ExtensionTok"/>
+        </w:rPr>
+        <w:t xml:space="preserve">curl</w:t>
+      </w:r>
+      <w:r>
+        <w:rPr>
+          <w:rStyle w:val="NormalTok"/>
+        </w:rPr>
+        <w:t xml:space="preserve"> </w:t>
+      </w:r>
+      <w:r>
+        <w:rPr>
+          <w:rStyle w:val="AttributeTok"/>
+        </w:rPr>
+        <w:t xml:space="preserve">-X</w:t>
+      </w:r>
+      <w:r>
+        <w:rPr>
+          <w:rStyle w:val="NormalTok"/>
+        </w:rPr>
+        <w:t xml:space="preserve"> POST </w:t>
+      </w:r>
+      <w:r>
+        <w:rPr>
+          <w:rStyle w:val="StringTok"/>
+        </w:rPr>
+        <w:t xml:space="preserve">"</w:t>
+      </w:r>
+      <w:r>
+        <w:rPr>
+          <w:rStyle w:val="VariableTok"/>
+        </w:rPr>
+        <w:t xml:space="preserve">$HOST</w:t>
+      </w:r>
+      <w:r>
+        <w:rPr>
+          <w:rStyle w:val="StringTok"/>
+        </w:rPr>
+        <w:t xml:space="preserve">/api/print/qr"</w:t>
+      </w:r>
+      <w:r>
+        <w:rPr>
+          <w:rStyle w:val="NormalTok"/>
+        </w:rPr>
+        <w:t xml:space="preserve"> </w:t>
+      </w:r>
+      <w:r>
+        <w:rPr>
+          <w:rStyle w:val="AttributeTok"/>
+        </w:rPr>
+        <w:t xml:space="preserve">--data-urlencode</w:t>
+      </w:r>
+      <w:r>
+        <w:rPr>
+          <w:rStyle w:val="NormalTok"/>
+        </w:rPr>
+        <w:t xml:space="preserve"> </w:t>
+      </w:r>
+      <w:r>
+        <w:rPr>
+          <w:rStyle w:val="StringTok"/>
+        </w:rPr>
+        <w:t xml:space="preserve">"url=https://example.com"</w:t>
+      </w:r>
+      <w:r>
+        <w:br/>
+      </w:r>
+      <w:r>
+        <w:br/>
+      </w:r>
+      <w:r>
+        <w:rPr>
+          <w:rStyle w:val="CommentTok"/>
+        </w:rPr>
+        <w:t xml:space="preserve"># 配線確認用テストページ</w:t>
+      </w:r>
+      <w:r>
+        <w:br/>
+      </w:r>
+      <w:r>
+        <w:rPr>
+          <w:rStyle w:val="ExtensionTok"/>
+        </w:rPr>
+        <w:t xml:space="preserve">curl</w:t>
+      </w:r>
+      <w:r>
+        <w:rPr>
+          <w:rStyle w:val="NormalTok"/>
+        </w:rPr>
+        <w:t xml:space="preserve"> </w:t>
+      </w:r>
+      <w:r>
+        <w:rPr>
+          <w:rStyle w:val="AttributeTok"/>
+        </w:rPr>
+        <w:t xml:space="preserve">-X</w:t>
+      </w:r>
+      <w:r>
+        <w:rPr>
+          <w:rStyle w:val="NormalTok"/>
+        </w:rPr>
+        <w:t xml:space="preserve"> POST </w:t>
+      </w:r>
+      <w:r>
+        <w:rPr>
+          <w:rStyle w:val="StringTok"/>
+        </w:rPr>
+        <w:t xml:space="preserve">"</w:t>
+      </w:r>
+      <w:r>
+        <w:rPr>
+          <w:rStyle w:val="VariableTok"/>
+        </w:rPr>
+        <w:t xml:space="preserve">$HOST</w:t>
+      </w:r>
+      <w:r>
+        <w:rPr>
+          <w:rStyle w:val="StringTok"/>
+        </w:rPr>
+        <w:t xml:space="preserve">/api/print/test"</w:t>
+      </w:r>
+      <w:r>
+        <w:br/>
+      </w:r>
+      <w:r>
+        <w:br/>
+      </w:r>
+      <w:r>
+        <w:rPr>
+          <w:rStyle w:val="CommentTok"/>
+        </w:rPr>
+        <w:t xml:space="preserve"># 状態確認</w:t>
+      </w:r>
+      <w:r>
+        <w:br/>
+      </w:r>
+      <w:r>
+        <w:rPr>
+          <w:rStyle w:val="ExtensionTok"/>
+        </w:rPr>
+        <w:t xml:space="preserve">curl</w:t>
+      </w:r>
+      <w:r>
+        <w:rPr>
+          <w:rStyle w:val="NormalTok"/>
+        </w:rPr>
+        <w:t xml:space="preserve"> </w:t>
+      </w:r>
+      <w:r>
+        <w:rPr>
+          <w:rStyle w:val="StringTok"/>
+        </w:rPr>
+        <w:t xml:space="preserve">"</w:t>
+      </w:r>
+      <w:r>
+        <w:rPr>
+          <w:rStyle w:val="VariableTok"/>
+        </w:rPr>
+        <w:t xml:space="preserve">$HOST</w:t>
+      </w:r>
+      <w:r>
+        <w:rPr>
+          <w:rStyle w:val="StringTok"/>
+        </w:rPr>
+        <w:t xml:space="preserve">/api/status"</w:t>
+      </w:r>
+    </w:p>
     <w:bookmarkEnd w:id="60"/>
-    <w:bookmarkStart w:id="61" w:name="curlでの基本操作"/>
-    <w:p>
-      <w:pPr>
-        <w:pStyle w:val="Heading3"/>
-      </w:pPr>
-      <w:r>
-        <w:t xml:space="preserve">8.2　</w:t>
-      </w:r>
-      <w:r>
-        <w:rPr>
-          <w:rFonts w:hint="eastAsia"/>
-        </w:rPr>
-        <w:t xml:space="preserve">curlでの基本操作</w:t>
-      </w:r>
-    </w:p>
-    <w:p>
-      <w:pPr>
-        <w:pStyle w:val="SourceCode"/>
-      </w:pPr>
-      <w:r>
-        <w:rPr>
-          <w:rStyle w:val="VariableTok"/>
-        </w:rPr>
-        <w:t xml:space="preserve">HOST</w:t>
-      </w:r>
-      <w:r>
-        <w:rPr>
-          <w:rStyle w:val="OperatorTok"/>
-        </w:rPr>
-        <w:t xml:space="preserve">=</w:t>
-      </w:r>
-      <w:r>
-        <w:rPr>
-          <w:rStyle w:val="NormalTok"/>
-        </w:rPr>
-        <w:t xml:space="preserve">http://m5web.local</w:t>
-      </w:r>
-      <w:r>
-        <w:br/>
-      </w:r>
-      <w:r>
-        <w:br/>
-      </w:r>
-      <w:r>
-        <w:rPr>
-          <w:rStyle w:val="CommentTok"/>
-        </w:rPr>
-        <w:t xml:space="preserve"># テキスト印刷</w:t>
-      </w:r>
-      <w:r>
-        <w:br/>
-      </w:r>
-      <w:r>
-        <w:rPr>
-          <w:rStyle w:val="ExtensionTok"/>
-        </w:rPr>
-        <w:t xml:space="preserve">curl</w:t>
-      </w:r>
-      <w:r>
-        <w:rPr>
-          <w:rStyle w:val="NormalTok"/>
-        </w:rPr>
-        <w:t xml:space="preserve"> </w:t>
-      </w:r>
-      <w:r>
-        <w:rPr>
-          <w:rStyle w:val="AttributeTok"/>
-        </w:rPr>
-        <w:t xml:space="preserve">-X</w:t>
-      </w:r>
-      <w:r>
-        <w:rPr>
-          <w:rStyle w:val="NormalTok"/>
-        </w:rPr>
-        <w:t xml:space="preserve"> POST </w:t>
-      </w:r>
-      <w:r>
-        <w:rPr>
-          <w:rStyle w:val="StringTok"/>
-        </w:rPr>
-        <w:t xml:space="preserve">"</w:t>
-      </w:r>
-      <w:r>
-        <w:rPr>
-          <w:rStyle w:val="VariableTok"/>
-        </w:rPr>
-        <w:t xml:space="preserve">$HOST</w:t>
-      </w:r>
-      <w:r>
-        <w:rPr>
-          <w:rStyle w:val="StringTok"/>
-        </w:rPr>
-        <w:t xml:space="preserve">/api/print/text"</w:t>
-      </w:r>
-      <w:r>
-        <w:rPr>
-          <w:rStyle w:val="NormalTok"/>
-        </w:rPr>
-        <w:t xml:space="preserve"> </w:t>
-      </w:r>
-      <w:r>
-        <w:rPr>
-          <w:rStyle w:val="AttributeTok"/>
-        </w:rPr>
-        <w:t xml:space="preserve">--data-urlencode</w:t>
-      </w:r>
-      <w:r>
-        <w:rPr>
-          <w:rStyle w:val="NormalTok"/>
-        </w:rPr>
-        <w:t xml:space="preserve"> </w:t>
-      </w:r>
-      <w:r>
-        <w:rPr>
-          <w:rStyle w:val="StringTok"/>
-        </w:rPr>
-        <w:t xml:space="preserve">"text=Hello from a script"</w:t>
-      </w:r>
-      <w:r>
-        <w:br/>
-      </w:r>
-      <w:r>
-        <w:br/>
-      </w:r>
-      <w:r>
-        <w:rPr>
-          <w:rStyle w:val="CommentTok"/>
-        </w:rPr>
-        <w:t xml:space="preserve"># QRコード印刷</w:t>
-      </w:r>
-      <w:r>
-        <w:br/>
-      </w:r>
-      <w:r>
-        <w:rPr>
-          <w:rStyle w:val="ExtensionTok"/>
-        </w:rPr>
-        <w:t xml:space="preserve">curl</w:t>
-      </w:r>
-      <w:r>
-        <w:rPr>
-          <w:rStyle w:val="NormalTok"/>
-        </w:rPr>
-        <w:t xml:space="preserve"> </w:t>
-      </w:r>
-      <w:r>
-        <w:rPr>
-          <w:rStyle w:val="AttributeTok"/>
-        </w:rPr>
-        <w:t xml:space="preserve">-X</w:t>
-      </w:r>
-      <w:r>
-        <w:rPr>
-          <w:rStyle w:val="NormalTok"/>
-        </w:rPr>
-        <w:t xml:space="preserve"> POST </w:t>
-      </w:r>
-      <w:r>
-        <w:rPr>
-          <w:rStyle w:val="StringTok"/>
-        </w:rPr>
-        <w:t xml:space="preserve">"</w:t>
-      </w:r>
-      <w:r>
-        <w:rPr>
-          <w:rStyle w:val="VariableTok"/>
-        </w:rPr>
-        <w:t xml:space="preserve">$HOST</w:t>
-      </w:r>
-      <w:r>
-        <w:rPr>
-          <w:rStyle w:val="StringTok"/>
-        </w:rPr>
-        <w:t xml:space="preserve">/api/print/qr"</w:t>
-      </w:r>
-      <w:r>
-        <w:rPr>
-          <w:rStyle w:val="NormalTok"/>
-        </w:rPr>
-        <w:t xml:space="preserve"> </w:t>
-      </w:r>
-      <w:r>
-        <w:rPr>
-          <w:rStyle w:val="AttributeTok"/>
-        </w:rPr>
-        <w:t xml:space="preserve">--data-urlencode</w:t>
-      </w:r>
-      <w:r>
-        <w:rPr>
-          <w:rStyle w:val="NormalTok"/>
-        </w:rPr>
-        <w:t xml:space="preserve"> </w:t>
-      </w:r>
-      <w:r>
-        <w:rPr>
-          <w:rStyle w:val="StringTok"/>
-        </w:rPr>
-        <w:t xml:space="preserve">"url=https://example.com"</w:t>
-      </w:r>
-      <w:r>
-        <w:br/>
-      </w:r>
-      <w:r>
-        <w:br/>
-      </w:r>
-      <w:r>
-        <w:rPr>
-          <w:rStyle w:val="CommentTok"/>
-        </w:rPr>
-        <w:t xml:space="preserve"># 配線確認用テストページ</w:t>
-      </w:r>
-      <w:r>
-        <w:br/>
-      </w:r>
-      <w:r>
-        <w:rPr>
-          <w:rStyle w:val="ExtensionTok"/>
-        </w:rPr>
-        <w:t xml:space="preserve">curl</w:t>
-      </w:r>
-      <w:r>
-        <w:rPr>
-          <w:rStyle w:val="NormalTok"/>
-        </w:rPr>
-        <w:t xml:space="preserve"> </w:t>
-      </w:r>
-      <w:r>
-        <w:rPr>
-          <w:rStyle w:val="AttributeTok"/>
-        </w:rPr>
-        <w:t xml:space="preserve">-X</w:t>
-      </w:r>
-      <w:r>
-        <w:rPr>
-          <w:rStyle w:val="NormalTok"/>
-        </w:rPr>
-        <w:t xml:space="preserve"> POST </w:t>
-      </w:r>
-      <w:r>
-        <w:rPr>
-          <w:rStyle w:val="StringTok"/>
-        </w:rPr>
-        <w:t xml:space="preserve">"</w:t>
-      </w:r>
-      <w:r>
-        <w:rPr>
-          <w:rStyle w:val="VariableTok"/>
-        </w:rPr>
-        <w:t xml:space="preserve">$HOST</w:t>
-      </w:r>
-      <w:r>
-        <w:rPr>
-          <w:rStyle w:val="StringTok"/>
-        </w:rPr>
-        <w:t xml:space="preserve">/api/print/test"</w:t>
-      </w:r>
-      <w:r>
-        <w:br/>
-      </w:r>
-      <w:r>
-        <w:br/>
-      </w:r>
-      <w:r>
-        <w:rPr>
-          <w:rStyle w:val="CommentTok"/>
-        </w:rPr>
-        <w:t xml:space="preserve"># 状態確認</w:t>
-      </w:r>
-      <w:r>
-        <w:br/>
-      </w:r>
-      <w:r>
-        <w:rPr>
-          <w:rStyle w:val="ExtensionTok"/>
-        </w:rPr>
-        <w:t xml:space="preserve">curl</w:t>
-      </w:r>
-      <w:r>
-        <w:rPr>
-          <w:rStyle w:val="NormalTok"/>
-        </w:rPr>
-        <w:t xml:space="preserve"> </w:t>
-      </w:r>
-      <w:r>
-        <w:rPr>
-          <w:rStyle w:val="StringTok"/>
-        </w:rPr>
-        <w:t xml:space="preserve">"</w:t>
-      </w:r>
-      <w:r>
-        <w:rPr>
-          <w:rStyle w:val="VariableTok"/>
-        </w:rPr>
-        <w:t xml:space="preserve">$HOST</w:t>
-      </w:r>
-      <w:r>
-        <w:rPr>
-          <w:rStyle w:val="StringTok"/>
-        </w:rPr>
-        <w:t xml:space="preserve">/api/status"</w:t>
-      </w:r>
-    </w:p>
-    <w:bookmarkEnd w:id="61"/>
-    <w:bookmarkStart w:id="62" w:name="pythonから画像を印刷する"/>
+    <w:bookmarkStart w:id="61" w:name="pythonから画像を印刷する"/>
     <w:p>
       <w:pPr>
         <w:pStyle w:val="Heading3"/>
@@ -15084,8 +15074,8 @@
         <w:t xml:space="preserve">このAPIを応用すれば、例えば「定期的に天気予報を取得して印刷する」「チャットボットの返答を印刷する」といった、写真以外の自動化にも展開できます。</w:t>
       </w:r>
     </w:p>
-    <w:bookmarkEnd w:id="62"/>
-    <w:bookmarkStart w:id="64" w:name="俳句生成openai連携"/>
+    <w:bookmarkEnd w:id="61"/>
+    <w:bookmarkStart w:id="63" w:name="俳句生成openai連携"/>
     <w:p>
       <w:pPr>
         <w:pStyle w:val="Heading3"/>
@@ -15477,7 +15467,7 @@
         </w:rPr>
         <w:t xml:space="preserve">利用の前提として、設定タブの「OpenAI設定」カードでAPIキーを登録しておく必要があります（</w:t>
       </w:r>
-      <w:hyperlink r:id="rId63">
+      <w:hyperlink r:id="rId62">
         <w:r>
           <w:rPr>
             <w:rStyle w:val="Hyperlink"/>
@@ -15936,9 +15926,9 @@
         </w:pict>
       </w:r>
     </w:p>
+    <w:bookmarkEnd w:id="63"/>
     <w:bookmarkEnd w:id="64"/>
-    <w:bookmarkEnd w:id="65"/>
-    <w:bookmarkStart w:id="69" w:name="第9章-印刷のしくみを覗く"/>
+    <w:bookmarkStart w:id="68" w:name="第9章-印刷のしくみを覗く"/>
     <w:p>
       <w:pPr>
         <w:pStyle w:val="Heading2"/>
@@ -15970,7 +15960,7 @@
         <w:t xml:space="preserve">ここまでの章で「印刷される」という結果は何度も登場しましたが、本章ではその裏側にある技術――白黒変換のアルゴリズムと、プリンターへの命令の送り方――を掘り下げます。</w:t>
       </w:r>
     </w:p>
-    <w:bookmarkStart w:id="66" w:name="誤差拡散floydsteinbergとは何か"/>
+    <w:bookmarkStart w:id="65" w:name="誤差拡散floydsteinbergとは何か"/>
     <w:p>
       <w:pPr>
         <w:pStyle w:val="Heading3"/>
@@ -16096,8 +16086,8 @@
         <w:t xml:space="preserve">する実装になっています。</w:t>
       </w:r>
     </w:p>
-    <w:bookmarkEnd w:id="66"/>
-    <w:bookmarkStart w:id="67" w:name="プリンターへの命令方式escpos風コマンド"/>
+    <w:bookmarkEnd w:id="65"/>
+    <w:bookmarkStart w:id="66" w:name="プリンターへの命令方式escpos風コマンド"/>
     <w:p>
       <w:pPr>
         <w:pStyle w:val="Heading3"/>
@@ -16205,8 +16195,8 @@
         <w:t xml:space="preserve">Lite側、QRコードの生成はプリンター側、という役割分担になっています。</w:t>
       </w:r>
     </w:p>
-    <w:bookmarkEnd w:id="67"/>
-    <w:bookmarkStart w:id="68" w:name="印刷サイズの制限"/>
+    <w:bookmarkEnd w:id="66"/>
+    <w:bookmarkStart w:id="67" w:name="印刷サイズの制限"/>
     <w:p>
       <w:pPr>
         <w:pStyle w:val="Heading3"/>
@@ -16305,9 +16295,9 @@
         </w:pict>
       </w:r>
     </w:p>
+    <w:bookmarkEnd w:id="67"/>
     <w:bookmarkEnd w:id="68"/>
-    <w:bookmarkEnd w:id="69"/>
-    <w:bookmarkStart w:id="77" w:name="第10章-トラブルシューティング"/>
+    <w:bookmarkStart w:id="76" w:name="第10章-トラブルシューティング"/>
     <w:p>
       <w:pPr>
         <w:pStyle w:val="Heading2"/>
@@ -16333,7 +16323,7 @@
         <w:t xml:space="preserve">実際に手を動かす中でよく遭遇するトラブルと、その対処法をまとめます。</w:t>
       </w:r>
     </w:p>
-    <w:bookmarkStart w:id="70" w:name="atom-liteが起動しない書き込みできない"/>
+    <w:bookmarkStart w:id="69" w:name="atom-liteが起動しない書き込みできない"/>
     <w:p>
       <w:pPr>
         <w:pStyle w:val="Heading3"/>
@@ -16417,8 +16407,8 @@
         <w:t xml:space="preserve">書き込み中にエラーが出る場合、ボード上のリセットボタンを押しながら書き込みを開始する、といった機種特有の作法が必要な場合があります。</w:t>
       </w:r>
     </w:p>
-    <w:bookmarkEnd w:id="70"/>
-    <w:bookmarkStart w:id="71" w:name="httpm5web.localにアクセスできない"/>
+    <w:bookmarkEnd w:id="69"/>
+    <w:bookmarkStart w:id="70" w:name="httpm5web.localにアクセスできない"/>
     <w:p>
       <w:pPr>
         <w:pStyle w:val="Heading3"/>
@@ -16541,8 +16531,8 @@
         <w:t xml:space="preserve">（またはLittleFSへのアップロード）を実行し忘れています。第5章の手順を再確認してください。</w:t>
       </w:r>
     </w:p>
-    <w:bookmarkEnd w:id="71"/>
-    <w:bookmarkStart w:id="72" w:name="プリンターが反応しない印刷ボタンを押しても何も起きない"/>
+    <w:bookmarkEnd w:id="70"/>
+    <w:bookmarkStart w:id="71" w:name="プリンターが反応しない印刷ボタンを押しても何も起きない"/>
     <w:p>
       <w:pPr>
         <w:pStyle w:val="Heading3"/>
@@ -16635,8 +16625,8 @@
         <w:t xml:space="preserve">UIを介さずに印刷できるか切り分けてみてください。</w:t>
       </w:r>
     </w:p>
-    <w:bookmarkEnd w:id="72"/>
-    <w:bookmarkStart w:id="73" w:name="m5stickvからatom-liteに写真が届かない"/>
+    <w:bookmarkEnd w:id="71"/>
+    <w:bookmarkStart w:id="72" w:name="m5stickvからatom-liteに写真が届かない"/>
     <w:p>
       <w:pPr>
         <w:pStyle w:val="Heading3"/>
@@ -16717,8 +16707,8 @@
         <w:t xml:space="preserve">IDEのシリアルコンソールで、M5StickV側のログにエラーが出ていないか確認してください。</w:t>
       </w:r>
     </w:p>
-    <w:bookmarkEnd w:id="73"/>
-    <w:bookmarkStart w:id="74" w:name="顔検出が効かないクラッシュする"/>
+    <w:bookmarkEnd w:id="72"/>
+    <w:bookmarkStart w:id="73" w:name="顔検出が効かないクラッシュする"/>
     <w:p>
       <w:pPr>
         <w:pStyle w:val="Heading3"/>
@@ -16823,8 +16813,8 @@
         <w:t xml:space="preserve">パラメータを調整してください。</w:t>
       </w:r>
     </w:p>
-    <w:bookmarkEnd w:id="74"/>
-    <w:bookmarkStart w:id="75" w:name="撮った写真の向きがおかしい"/>
+    <w:bookmarkEnd w:id="73"/>
+    <w:bookmarkStart w:id="74" w:name="撮った写真の向きがおかしい"/>
     <w:p>
       <w:pPr>
         <w:pStyle w:val="Heading3"/>
@@ -16908,8 +16898,8 @@
         <w:t xml:space="preserve">版のループへの切り替えを試してください。</w:t>
       </w:r>
     </w:p>
-    <w:bookmarkEnd w:id="75"/>
-    <w:bookmarkStart w:id="76" w:name="m5papercolorの画面が更新されないボタンが反応しない音が鳴らない"/>
+    <w:bookmarkEnd w:id="74"/>
+    <w:bookmarkStart w:id="75" w:name="m5papercolorの画面が更新されないボタンが反応しない音が鳴らない"/>
     <w:p>
       <w:pPr>
         <w:pStyle w:val="Heading3"/>
@@ -17111,68 +17101,68 @@
         </w:pict>
       </w:r>
     </w:p>
+    <w:bookmarkEnd w:id="75"/>
     <w:bookmarkEnd w:id="76"/>
+    <w:bookmarkStart w:id="81" w:name="第11章-発展カスタマイズのアイデア"/>
+    <w:p>
+      <w:pPr>
+        <w:pStyle w:val="Heading2"/>
+      </w:pPr>
+      <w:r>
+        <w:rPr>
+          <w:rFonts w:hint="eastAsia"/>
+        </w:rPr>
+        <w:t xml:space="preserve">第11章</w:t>
+      </w:r>
+      <w:r>
+        <w:t xml:space="preserve">　</w:t>
+      </w:r>
+      <w:r>
+        <w:rPr>
+          <w:rFonts w:hint="eastAsia"/>
+        </w:rPr>
+        <w:t xml:space="preserve">発展・カスタマイズのアイデア</w:t>
+      </w:r>
+    </w:p>
+    <w:p>
+      <w:pPr>
+        <w:pStyle w:val="FirstParagraph"/>
+      </w:pPr>
+      <w:r>
+        <w:rPr>
+          <w:rFonts w:hint="eastAsia"/>
+        </w:rPr>
+        <w:t xml:space="preserve">基本のシステムが動くようになったら、次のような発展にも挑戦してみましょう。</w:t>
+      </w:r>
+    </w:p>
+    <w:bookmarkStart w:id="77" w:name="物体分類への拡張"/>
+    <w:p>
+      <w:pPr>
+        <w:pStyle w:val="Heading3"/>
+      </w:pPr>
+      <w:r>
+        <w:t xml:space="preserve">11.1　</w:t>
+      </w:r>
+      <w:r>
+        <w:rPr>
+          <w:rFonts w:hint="eastAsia"/>
+        </w:rPr>
+        <w:t xml:space="preserve">物体分類への拡張</w:t>
+      </w:r>
+    </w:p>
+    <w:p>
+      <w:pPr>
+        <w:pStyle w:val="FirstParagraph"/>
+      </w:pPr>
+      <w:r>
+        <w:rPr>
+          <w:rFonts w:hint="eastAsia"/>
+        </w:rPr>
+        <w:t xml:space="preserve">現在の顔検出のラベル機構は、「Face」という固定文字列を返す仕組みですが、設計としては任意の文字列ラベルを載せられるようになっています。K210のKPU（AI推論回路）を使った物体分類モデルを追加すれば、「Face」の代わりに「Cat」「Dog」「Cup」など、より多様なラベルを印刷キャプションに反映させることができます。</w:t>
+      </w:r>
+    </w:p>
     <w:bookmarkEnd w:id="77"/>
-    <w:bookmarkStart w:id="82" w:name="第11章-発展カスタマイズのアイデア"/>
-    <w:p>
-      <w:pPr>
-        <w:pStyle w:val="Heading2"/>
-      </w:pPr>
-      <w:r>
-        <w:rPr>
-          <w:rFonts w:hint="eastAsia"/>
-        </w:rPr>
-        <w:t xml:space="preserve">第11章</w:t>
-      </w:r>
-      <w:r>
-        <w:t xml:space="preserve">　</w:t>
-      </w:r>
-      <w:r>
-        <w:rPr>
-          <w:rFonts w:hint="eastAsia"/>
-        </w:rPr>
-        <w:t xml:space="preserve">発展・カスタマイズのアイデア</w:t>
-      </w:r>
-    </w:p>
-    <w:p>
-      <w:pPr>
-        <w:pStyle w:val="FirstParagraph"/>
-      </w:pPr>
-      <w:r>
-        <w:rPr>
-          <w:rFonts w:hint="eastAsia"/>
-        </w:rPr>
-        <w:t xml:space="preserve">基本のシステムが動くようになったら、次のような発展にも挑戦してみましょう。</w:t>
-      </w:r>
-    </w:p>
-    <w:bookmarkStart w:id="78" w:name="物体分類への拡張"/>
-    <w:p>
-      <w:pPr>
-        <w:pStyle w:val="Heading3"/>
-      </w:pPr>
-      <w:r>
-        <w:t xml:space="preserve">11.1　</w:t>
-      </w:r>
-      <w:r>
-        <w:rPr>
-          <w:rFonts w:hint="eastAsia"/>
-        </w:rPr>
-        <w:t xml:space="preserve">物体分類への拡張</w:t>
-      </w:r>
-    </w:p>
-    <w:p>
-      <w:pPr>
-        <w:pStyle w:val="FirstParagraph"/>
-      </w:pPr>
-      <w:r>
-        <w:rPr>
-          <w:rFonts w:hint="eastAsia"/>
-        </w:rPr>
-        <w:t xml:space="preserve">現在の顔検出のラベル機構は、「Face」という固定文字列を返す仕組みですが、設計としては任意の文字列ラベルを載せられるようになっています。K210のKPU（AI推論回路）を使った物体分類モデルを追加すれば、「Face」の代わりに「Cat」「Dog」「Cup」など、より多様なラベルを印刷キャプションに反映させることができます。</w:t>
-      </w:r>
-    </w:p>
-    <w:bookmarkEnd w:id="78"/>
-    <w:bookmarkStart w:id="79" w:name="印刷トリガーの多様化"/>
+    <w:bookmarkStart w:id="78" w:name="印刷トリガーの多様化"/>
     <w:p>
       <w:pPr>
         <w:pStyle w:val="Heading3"/>
@@ -17261,68 +17251,68 @@
         <w:t xml:space="preserve">別のセンサー（人感センサーなど）と組み合わせて、人が近づいたら自動撮影・印刷する</w:t>
       </w:r>
     </w:p>
+    <w:bookmarkEnd w:id="78"/>
+    <w:bookmarkStart w:id="79" w:name="セキュリティ面の強化"/>
+    <w:p>
+      <w:pPr>
+        <w:pStyle w:val="Heading3"/>
+      </w:pPr>
+      <w:r>
+        <w:t xml:space="preserve">11.3　</w:t>
+      </w:r>
+      <w:r>
+        <w:rPr>
+          <w:rFonts w:hint="eastAsia"/>
+        </w:rPr>
+        <w:t xml:space="preserve">セキュリティ面の強化</w:t>
+      </w:r>
+    </w:p>
+    <w:p>
+      <w:pPr>
+        <w:pStyle w:val="FirstParagraph"/>
+      </w:pPr>
+      <w:r>
+        <w:rPr>
+          <w:rFonts w:hint="eastAsia"/>
+        </w:rPr>
+        <w:t xml:space="preserve">現状、Wi-Fi設定用のアクセスポイントはパスワード無しのオープンネットワークです。設置環境によっては、</w:t>
+      </w:r>
+      <w:r>
+        <w:rPr>
+          <w:rStyle w:val="VerbatimChar"/>
+        </w:rPr>
+        <w:t xml:space="preserve">wifi_manager.cpp</w:t>
+      </w:r>
+      <w:r>
+        <w:rPr>
+          <w:rFonts w:hint="eastAsia"/>
+        </w:rPr>
+        <w:t xml:space="preserve">内の</w:t>
+      </w:r>
+      <w:r>
+        <w:rPr>
+          <w:rStyle w:val="VerbatimChar"/>
+        </w:rPr>
+        <w:t xml:space="preserve">WiFi.softAP(apName)</w:t>
+      </w:r>
+      <w:r>
+        <w:rPr>
+          <w:rFonts w:hint="eastAsia"/>
+        </w:rPr>
+        <w:t xml:space="preserve">にパスワード引数を追加することを検討してください。また、HTTP</w:t>
+      </w:r>
+      <w:r>
+        <w:t xml:space="preserve"> </w:t>
+      </w:r>
+      <w:r>
+        <w:rPr>
+          <w:rFonts w:hint="eastAsia"/>
+        </w:rPr>
+        <w:t xml:space="preserve">APIには認証機構が無いため、外部に公開せず、あくまで信頼できる家庭内LANの範囲で使うことが前提です。</w:t>
+      </w:r>
+    </w:p>
     <w:bookmarkEnd w:id="79"/>
-    <w:bookmarkStart w:id="80" w:name="セキュリティ面の強化"/>
-    <w:p>
-      <w:pPr>
-        <w:pStyle w:val="Heading3"/>
-      </w:pPr>
-      <w:r>
-        <w:t xml:space="preserve">11.3　</w:t>
-      </w:r>
-      <w:r>
-        <w:rPr>
-          <w:rFonts w:hint="eastAsia"/>
-        </w:rPr>
-        <w:t xml:space="preserve">セキュリティ面の強化</w:t>
-      </w:r>
-    </w:p>
-    <w:p>
-      <w:pPr>
-        <w:pStyle w:val="FirstParagraph"/>
-      </w:pPr>
-      <w:r>
-        <w:rPr>
-          <w:rFonts w:hint="eastAsia"/>
-        </w:rPr>
-        <w:t xml:space="preserve">現状、Wi-Fi設定用のアクセスポイントはパスワード無しのオープンネットワークです。設置環境によっては、</w:t>
-      </w:r>
-      <w:r>
-        <w:rPr>
-          <w:rStyle w:val="VerbatimChar"/>
-        </w:rPr>
-        <w:t xml:space="preserve">wifi_manager.cpp</w:t>
-      </w:r>
-      <w:r>
-        <w:rPr>
-          <w:rFonts w:hint="eastAsia"/>
-        </w:rPr>
-        <w:t xml:space="preserve">内の</w:t>
-      </w:r>
-      <w:r>
-        <w:rPr>
-          <w:rStyle w:val="VerbatimChar"/>
-        </w:rPr>
-        <w:t xml:space="preserve">WiFi.softAP(apName)</w:t>
-      </w:r>
-      <w:r>
-        <w:rPr>
-          <w:rFonts w:hint="eastAsia"/>
-        </w:rPr>
-        <w:t xml:space="preserve">にパスワード引数を追加することを検討してください。また、HTTP</w:t>
-      </w:r>
-      <w:r>
-        <w:t xml:space="preserve"> </w:t>
-      </w:r>
-      <w:r>
-        <w:rPr>
-          <w:rFonts w:hint="eastAsia"/>
-        </w:rPr>
-        <w:t xml:space="preserve">APIには認証機構が無いため、外部に公開せず、あくまで信頼できる家庭内LANの範囲で使うことが前提です。</w:t>
-      </w:r>
-    </w:p>
-    <w:bookmarkEnd w:id="80"/>
-    <w:bookmarkStart w:id="81" w:name="印刷幅最大高さの変更"/>
+    <w:bookmarkStart w:id="80" w:name="印刷幅最大高さの変更"/>
     <w:p>
       <w:pPr>
         <w:pStyle w:val="Heading3"/>
@@ -17400,9 +17390,9 @@
         </w:pict>
       </w:r>
     </w:p>
+    <w:bookmarkEnd w:id="80"/>
     <w:bookmarkEnd w:id="81"/>
-    <w:bookmarkEnd w:id="82"/>
-    <w:bookmarkStart w:id="83" w:name="付録a-部品購入リストまとめ"/>
+    <w:bookmarkStart w:id="82" w:name="付録a-部品購入リストまとめ"/>
     <w:p>
       <w:pPr>
         <w:pStyle w:val="Heading2"/>
@@ -17684,8 +17674,8 @@
         </w:tc>
       </w:tr>
     </w:tbl>
-    <w:bookmarkEnd w:id="83"/>
-    <w:bookmarkStart w:id="84" w:name="付録b-用語集"/>
+    <w:bookmarkEnd w:id="82"/>
+    <w:bookmarkStart w:id="83" w:name="付録b-用語集"/>
     <w:p>
       <w:pPr>
         <w:pStyle w:val="Heading2"/>
@@ -18204,404 +18194,404 @@
         </w:tc>
       </w:tr>
     </w:tbl>
+    <w:bookmarkEnd w:id="83"/>
+    <w:bookmarkStart w:id="84" w:name="付録c-プロジェクトのソースコード構成"/>
+    <w:p>
+      <w:pPr>
+        <w:pStyle w:val="Heading2"/>
+      </w:pPr>
+      <w:r>
+        <w:rPr>
+          <w:rFonts w:hint="eastAsia"/>
+        </w:rPr>
+        <w:t xml:space="preserve">付録C</w:t>
+      </w:r>
+      <w:r>
+        <w:t xml:space="preserve">　</w:t>
+      </w:r>
+      <w:r>
+        <w:rPr>
+          <w:rFonts w:hint="eastAsia"/>
+        </w:rPr>
+        <w:t xml:space="preserve">プロジェクトのソースコード構成</w:t>
+      </w:r>
+    </w:p>
+    <w:p>
+      <w:pPr>
+        <w:pStyle w:val="SourceCode"/>
+      </w:pPr>
+      <w:r>
+        <w:rPr>
+          <w:rStyle w:val="VerbatimChar"/>
+        </w:rPr>
+        <w:t xml:space="preserve">platformio.ini          </w:t>
+      </w:r>
+      <w:r>
+        <w:rPr>
+          <w:rStyle w:val="VerbatimChar"/>
+          <w:rFonts w:hint="eastAsia"/>
+        </w:rPr>
+        <w:t xml:space="preserve">PlatformIOのビルド設定</w:t>
+      </w:r>
+      <w:r>
+        <w:br/>
+      </w:r>
+      <w:r>
+        <w:rPr>
+          <w:rStyle w:val="VerbatimChar"/>
+        </w:rPr>
+        <w:t xml:space="preserve">src/</w:t>
+      </w:r>
+      <w:r>
+        <w:br/>
+      </w:r>
+      <w:r>
+        <w:rPr>
+          <w:rStyle w:val="VerbatimChar"/>
+        </w:rPr>
+        <w:t xml:space="preserve">  main.cpp               </w:t>
+      </w:r>
+      <w:r>
+        <w:rPr>
+          <w:rStyle w:val="VerbatimChar"/>
+          <w:rFonts w:hint="eastAsia"/>
+        </w:rPr>
+        <w:t xml:space="preserve">setup/loopの配線（全モジュールの起動と接続）</w:t>
+      </w:r>
+      <w:r>
+        <w:br/>
+      </w:r>
+      <w:r>
+        <w:rPr>
+          <w:rStyle w:val="VerbatimChar"/>
+        </w:rPr>
+        <w:t xml:space="preserve">  wifi_manager.*          </w:t>
+      </w:r>
+      <w:r>
+        <w:rPr>
+          <w:rStyle w:val="VerbatimChar"/>
+          <w:rFonts w:hint="eastAsia"/>
+        </w:rPr>
+        <w:t xml:space="preserve">Wi-Fi(STA)接続／APフォールバック＋キャプティブポータル／mDNS</w:t>
+      </w:r>
+      <w:r>
+        <w:br/>
+      </w:r>
+      <w:r>
+        <w:rPr>
+          <w:rStyle w:val="VerbatimChar"/>
+        </w:rPr>
+        <w:t xml:space="preserve">  printer.*               </w:t>
+      </w:r>
+      <w:r>
+        <w:rPr>
+          <w:rStyle w:val="VerbatimChar"/>
+          <w:rFonts w:hint="eastAsia"/>
+        </w:rPr>
+        <w:t xml:space="preserve">UART経由でのESC/POS風ラスター送信・テキスト/QR送信</w:t>
+      </w:r>
+      <w:r>
+        <w:br/>
+      </w:r>
+      <w:r>
+        <w:rPr>
+          <w:rStyle w:val="VerbatimChar"/>
+        </w:rPr>
+        <w:t xml:space="preserve">  web_server.*            m5webのHTTP </w:t>
+      </w:r>
+      <w:r>
+        <w:rPr>
+          <w:rStyle w:val="VerbatimChar"/>
+          <w:rFonts w:hint="eastAsia"/>
+        </w:rPr>
+        <w:t xml:space="preserve">API（状態取得、Wi-Fi設定、画像/テキスト/QR印刷）</w:t>
+      </w:r>
+      <w:r>
+        <w:br/>
+      </w:r>
+      <w:r>
+        <w:rPr>
+          <w:rStyle w:val="VerbatimChar"/>
+        </w:rPr>
+        <w:t xml:space="preserve">  dither.*                </w:t>
+      </w:r>
+      <w:r>
+        <w:rPr>
+          <w:rStyle w:val="VerbatimChar"/>
+          <w:rFonts w:hint="eastAsia"/>
+        </w:rPr>
+        <w:t xml:space="preserve">誤差拡散(Floyd–Steinberg)の行ストリーミング実装</w:t>
+      </w:r>
+      <w:r>
+        <w:br/>
+      </w:r>
+      <w:r>
+        <w:rPr>
+          <w:rStyle w:val="VerbatimChar"/>
+        </w:rPr>
+        <w:t xml:space="preserve">  camera_link.*           </w:t>
+      </w:r>
+      <w:r>
+        <w:rPr>
+          <w:rStyle w:val="VerbatimChar"/>
+          <w:rFonts w:hint="eastAsia"/>
+        </w:rPr>
+        <w:t xml:space="preserve">M5StickVからのUART直結カメラ画像受信・バッファ保持・確認モード</w:t>
+      </w:r>
+      <w:r>
+        <w:br/>
+      </w:r>
+      <w:r>
+        <w:rPr>
+          <w:rStyle w:val="VerbatimChar"/>
+        </w:rPr>
+        <w:t xml:space="preserve">  gallery.*               </w:t>
+      </w:r>
+      <w:r>
+        <w:rPr>
+          <w:rStyle w:val="VerbatimChar"/>
+          <w:rFonts w:hint="eastAsia"/>
+        </w:rPr>
+        <w:t xml:space="preserve">印刷した写真をLittleFSに保存・一覧・削除・再印刷する履歴機能</w:t>
+      </w:r>
+      <w:r>
+        <w:br/>
+      </w:r>
+      <w:r>
+        <w:rPr>
+          <w:rStyle w:val="VerbatimChar"/>
+        </w:rPr>
+        <w:t xml:space="preserve">  led.*                   ATOM </w:t>
+      </w:r>
+      <w:r>
+        <w:rPr>
+          <w:rStyle w:val="VerbatimChar"/>
+          <w:rFonts w:hint="eastAsia"/>
+        </w:rPr>
+        <w:t xml:space="preserve">Lite内蔵RGB</w:t>
+      </w:r>
+      <w:r>
+        <w:rPr>
+          <w:rStyle w:val="VerbatimChar"/>
+        </w:rPr>
+        <w:t xml:space="preserve"> </w:t>
+      </w:r>
+      <w:r>
+        <w:rPr>
+          <w:rStyle w:val="VerbatimChar"/>
+          <w:rFonts w:hint="eastAsia"/>
+        </w:rPr>
+        <w:t xml:space="preserve">LEDの点灯制御</w:t>
+      </w:r>
+      <w:r>
+        <w:br/>
+      </w:r>
+      <w:r>
+        <w:rPr>
+          <w:rStyle w:val="VerbatimChar"/>
+        </w:rPr>
+        <w:t xml:space="preserve">  font.*                  </w:t>
+      </w:r>
+      <w:r>
+        <w:rPr>
+          <w:rStyle w:val="VerbatimChar"/>
+          <w:rFonts w:hint="eastAsia"/>
+        </w:rPr>
+        <w:t xml:space="preserve">5x7ドットマトリクスフォント（半角英数字のみ）の描画</w:t>
+      </w:r>
+      <w:r>
+        <w:br/>
+      </w:r>
+      <w:r>
+        <w:rPr>
+          <w:rStyle w:val="VerbatimChar"/>
+        </w:rPr>
+        <w:t xml:space="preserve">  caption.*               </w:t>
+      </w:r>
+      <w:r>
+        <w:rPr>
+          <w:rStyle w:val="VerbatimChar"/>
+          <w:rFonts w:hint="eastAsia"/>
+        </w:rPr>
+        <w:t xml:space="preserve">印刷時刻・検出ラベルを印刷画像に追加する（白帯+黒文字）</w:t>
+      </w:r>
+      <w:r>
+        <w:br/>
+      </w:r>
+      <w:r>
+        <w:rPr>
+          <w:rStyle w:val="VerbatimChar"/>
+        </w:rPr>
+        <w:t xml:space="preserve">  clock.*                 </w:t>
+      </w:r>
+      <w:r>
+        <w:rPr>
+          <w:rStyle w:val="VerbatimChar"/>
+          <w:rFonts w:hint="eastAsia"/>
+        </w:rPr>
+        <w:t xml:space="preserve">NTPによる時刻同期（JST固定）</w:t>
+      </w:r>
+      <w:r>
+        <w:br/>
+      </w:r>
+      <w:r>
+        <w:rPr>
+          <w:rStyle w:val="VerbatimChar"/>
+        </w:rPr>
+        <w:t xml:space="preserve">  openai.*                 OpenAI </w:t>
+      </w:r>
+      <w:r>
+        <w:rPr>
+          <w:rStyle w:val="VerbatimChar"/>
+          <w:rFonts w:hint="eastAsia"/>
+        </w:rPr>
+        <w:t xml:space="preserve">APIキーの保存・受け渡しのみ（HTTPS通信自体はブラウザ側、8.4節）</w:t>
+      </w:r>
+      <w:r>
+        <w:br/>
+      </w:r>
+      <w:r>
+        <w:rPr>
+          <w:rStyle w:val="VerbatimChar"/>
+        </w:rPr>
+        <w:t xml:space="preserve">data/</w:t>
+      </w:r>
+      <w:r>
+        <w:br/>
+      </w:r>
+      <w:r>
+        <w:rPr>
+          <w:rStyle w:val="VerbatimChar"/>
+        </w:rPr>
+        <w:t xml:space="preserve">  index.html              </w:t>
+      </w:r>
+      <w:r>
+        <w:rPr>
+          <w:rStyle w:val="VerbatimChar"/>
+          <w:rFonts w:hint="eastAsia"/>
+        </w:rPr>
+        <w:t xml:space="preserve">m5web本体（UI＋Canvas画像変換、外部CDN依存なし・単一ファイル）</w:t>
+      </w:r>
+      <w:r>
+        <w:br/>
+      </w:r>
+      <w:r>
+        <w:rPr>
+          <w:rStyle w:val="VerbatimChar"/>
+        </w:rPr>
+        <w:t xml:space="preserve">arduino/m5web/</w:t>
+      </w:r>
+      <w:r>
+        <w:br/>
+      </w:r>
+      <w:r>
+        <w:rPr>
+          <w:rStyle w:val="VerbatimChar"/>
+        </w:rPr>
+        <w:t xml:space="preserve">  m5web.ino </w:t>
+      </w:r>
+      <w:r>
+        <w:rPr>
+          <w:rStyle w:val="VerbatimChar"/>
+          <w:rFonts w:hint="eastAsia"/>
+        </w:rPr>
+        <w:t xml:space="preserve">＋</w:t>
+      </w:r>
+      <w:r>
+        <w:rPr>
+          <w:rStyle w:val="VerbatimChar"/>
+        </w:rPr>
+        <w:t xml:space="preserve"> </w:t>
+      </w:r>
+      <w:r>
+        <w:rPr>
+          <w:rStyle w:val="VerbatimChar"/>
+          <w:rFonts w:hint="eastAsia"/>
+        </w:rPr>
+        <w:t xml:space="preserve">同名の*.h/*.cpp/data/</w:t>
+      </w:r>
+      <w:r>
+        <w:rPr>
+          <w:rStyle w:val="VerbatimChar"/>
+        </w:rPr>
+        <w:t xml:space="preserve">  Arduino </w:t>
+      </w:r>
+      <w:r>
+        <w:rPr>
+          <w:rStyle w:val="VerbatimChar"/>
+          <w:rFonts w:hint="eastAsia"/>
+        </w:rPr>
+        <w:t xml:space="preserve">IDE用の手動同期コピー</w:t>
+      </w:r>
+      <w:r>
+        <w:br/>
+      </w:r>
+      <w:r>
+        <w:rPr>
+          <w:rStyle w:val="VerbatimChar"/>
+        </w:rPr>
+        <w:t xml:space="preserve">maixpy/</w:t>
+      </w:r>
+      <w:r>
+        <w:br/>
+      </w:r>
+      <w:r>
+        <w:rPr>
+          <w:rStyle w:val="VerbatimChar"/>
+        </w:rPr>
+        <w:t xml:space="preserve">  m5web_capture.py        </w:t>
+      </w:r>
+      <w:r>
+        <w:rPr>
+          <w:rStyle w:val="VerbatimChar"/>
+          <w:rFonts w:hint="eastAsia"/>
+        </w:rPr>
+        <w:t xml:space="preserve">M5StickV側スクリプト（撮影→シャッター音→リサイズ→UART送信）</w:t>
+      </w:r>
+      <w:r>
+        <w:br/>
+      </w:r>
+      <w:r>
+        <w:rPr>
+          <w:rStyle w:val="VerbatimChar"/>
+        </w:rPr>
+        <w:t xml:space="preserve">  shutter.wav              </w:t>
+      </w:r>
+      <w:r>
+        <w:rPr>
+          <w:rStyle w:val="VerbatimChar"/>
+          <w:rFonts w:hint="eastAsia"/>
+        </w:rPr>
+        <w:t xml:space="preserve">シャッター音</w:t>
+      </w:r>
+      <w:r>
+        <w:br/>
+      </w:r>
+      <w:r>
+        <w:rPr>
+          <w:rStyle w:val="VerbatimChar"/>
+        </w:rPr>
+        <w:t xml:space="preserve">m5paper/</w:t>
+      </w:r>
+      <w:r>
+        <w:br/>
+      </w:r>
+      <w:r>
+        <w:rPr>
+          <w:rStyle w:val="VerbatimChar"/>
+        </w:rPr>
+        <w:t xml:space="preserve">  m5paper.ino              </w:t>
+      </w:r>
+      <w:r>
+        <w:rPr>
+          <w:rStyle w:val="VerbatimChar"/>
+          <w:rFonts w:hint="eastAsia"/>
+        </w:rPr>
+        <w:t xml:space="preserve">M5PaperColor用スケッチ</w:t>
+      </w:r>
+    </w:p>
     <w:bookmarkEnd w:id="84"/>
-    <w:bookmarkStart w:id="85" w:name="付録c-プロジェクトのソースコード構成"/>
-    <w:p>
-      <w:pPr>
-        <w:pStyle w:val="Heading2"/>
-      </w:pPr>
-      <w:r>
-        <w:rPr>
-          <w:rFonts w:hint="eastAsia"/>
-        </w:rPr>
-        <w:t xml:space="preserve">付録C</w:t>
-      </w:r>
-      <w:r>
-        <w:t xml:space="preserve">　</w:t>
-      </w:r>
-      <w:r>
-        <w:rPr>
-          <w:rFonts w:hint="eastAsia"/>
-        </w:rPr>
-        <w:t xml:space="preserve">プロジェクトのソースコード構成</w:t>
-      </w:r>
-    </w:p>
-    <w:p>
-      <w:pPr>
-        <w:pStyle w:val="SourceCode"/>
-      </w:pPr>
-      <w:r>
-        <w:rPr>
-          <w:rStyle w:val="VerbatimChar"/>
-        </w:rPr>
-        <w:t xml:space="preserve">platformio.ini          </w:t>
-      </w:r>
-      <w:r>
-        <w:rPr>
-          <w:rStyle w:val="VerbatimChar"/>
-          <w:rFonts w:hint="eastAsia"/>
-        </w:rPr>
-        <w:t xml:space="preserve">PlatformIOのビルド設定</w:t>
-      </w:r>
-      <w:r>
-        <w:br/>
-      </w:r>
-      <w:r>
-        <w:rPr>
-          <w:rStyle w:val="VerbatimChar"/>
-        </w:rPr>
-        <w:t xml:space="preserve">src/</w:t>
-      </w:r>
-      <w:r>
-        <w:br/>
-      </w:r>
-      <w:r>
-        <w:rPr>
-          <w:rStyle w:val="VerbatimChar"/>
-        </w:rPr>
-        <w:t xml:space="preserve">  main.cpp               </w:t>
-      </w:r>
-      <w:r>
-        <w:rPr>
-          <w:rStyle w:val="VerbatimChar"/>
-          <w:rFonts w:hint="eastAsia"/>
-        </w:rPr>
-        <w:t xml:space="preserve">setup/loopの配線（全モジュールの起動と接続）</w:t>
-      </w:r>
-      <w:r>
-        <w:br/>
-      </w:r>
-      <w:r>
-        <w:rPr>
-          <w:rStyle w:val="VerbatimChar"/>
-        </w:rPr>
-        <w:t xml:space="preserve">  wifi_manager.*          </w:t>
-      </w:r>
-      <w:r>
-        <w:rPr>
-          <w:rStyle w:val="VerbatimChar"/>
-          <w:rFonts w:hint="eastAsia"/>
-        </w:rPr>
-        <w:t xml:space="preserve">Wi-Fi(STA)接続／APフォールバック＋キャプティブポータル／mDNS</w:t>
-      </w:r>
-      <w:r>
-        <w:br/>
-      </w:r>
-      <w:r>
-        <w:rPr>
-          <w:rStyle w:val="VerbatimChar"/>
-        </w:rPr>
-        <w:t xml:space="preserve">  printer.*               </w:t>
-      </w:r>
-      <w:r>
-        <w:rPr>
-          <w:rStyle w:val="VerbatimChar"/>
-          <w:rFonts w:hint="eastAsia"/>
-        </w:rPr>
-        <w:t xml:space="preserve">UART経由でのESC/POS風ラスター送信・テキスト/QR送信</w:t>
-      </w:r>
-      <w:r>
-        <w:br/>
-      </w:r>
-      <w:r>
-        <w:rPr>
-          <w:rStyle w:val="VerbatimChar"/>
-        </w:rPr>
-        <w:t xml:space="preserve">  web_server.*            m5webのHTTP </w:t>
-      </w:r>
-      <w:r>
-        <w:rPr>
-          <w:rStyle w:val="VerbatimChar"/>
-          <w:rFonts w:hint="eastAsia"/>
-        </w:rPr>
-        <w:t xml:space="preserve">API（状態取得、Wi-Fi設定、画像/テキスト/QR印刷）</w:t>
-      </w:r>
-      <w:r>
-        <w:br/>
-      </w:r>
-      <w:r>
-        <w:rPr>
-          <w:rStyle w:val="VerbatimChar"/>
-        </w:rPr>
-        <w:t xml:space="preserve">  dither.*                </w:t>
-      </w:r>
-      <w:r>
-        <w:rPr>
-          <w:rStyle w:val="VerbatimChar"/>
-          <w:rFonts w:hint="eastAsia"/>
-        </w:rPr>
-        <w:t xml:space="preserve">誤差拡散(Floyd–Steinberg)の行ストリーミング実装</w:t>
-      </w:r>
-      <w:r>
-        <w:br/>
-      </w:r>
-      <w:r>
-        <w:rPr>
-          <w:rStyle w:val="VerbatimChar"/>
-        </w:rPr>
-        <w:t xml:space="preserve">  camera_link.*           </w:t>
-      </w:r>
-      <w:r>
-        <w:rPr>
-          <w:rStyle w:val="VerbatimChar"/>
-          <w:rFonts w:hint="eastAsia"/>
-        </w:rPr>
-        <w:t xml:space="preserve">M5StickVからのUART直結カメラ画像受信・バッファ保持・確認モード</w:t>
-      </w:r>
-      <w:r>
-        <w:br/>
-      </w:r>
-      <w:r>
-        <w:rPr>
-          <w:rStyle w:val="VerbatimChar"/>
-        </w:rPr>
-        <w:t xml:space="preserve">  gallery.*               </w:t>
-      </w:r>
-      <w:r>
-        <w:rPr>
-          <w:rStyle w:val="VerbatimChar"/>
-          <w:rFonts w:hint="eastAsia"/>
-        </w:rPr>
-        <w:t xml:space="preserve">印刷した写真をLittleFSに保存・一覧・削除・再印刷する履歴機能</w:t>
-      </w:r>
-      <w:r>
-        <w:br/>
-      </w:r>
-      <w:r>
-        <w:rPr>
-          <w:rStyle w:val="VerbatimChar"/>
-        </w:rPr>
-        <w:t xml:space="preserve">  led.*                   ATOM </w:t>
-      </w:r>
-      <w:r>
-        <w:rPr>
-          <w:rStyle w:val="VerbatimChar"/>
-          <w:rFonts w:hint="eastAsia"/>
-        </w:rPr>
-        <w:t xml:space="preserve">Lite内蔵RGB</w:t>
-      </w:r>
-      <w:r>
-        <w:rPr>
-          <w:rStyle w:val="VerbatimChar"/>
-        </w:rPr>
-        <w:t xml:space="preserve"> </w:t>
-      </w:r>
-      <w:r>
-        <w:rPr>
-          <w:rStyle w:val="VerbatimChar"/>
-          <w:rFonts w:hint="eastAsia"/>
-        </w:rPr>
-        <w:t xml:space="preserve">LEDの点灯制御</w:t>
-      </w:r>
-      <w:r>
-        <w:br/>
-      </w:r>
-      <w:r>
-        <w:rPr>
-          <w:rStyle w:val="VerbatimChar"/>
-        </w:rPr>
-        <w:t xml:space="preserve">  font.*                  </w:t>
-      </w:r>
-      <w:r>
-        <w:rPr>
-          <w:rStyle w:val="VerbatimChar"/>
-          <w:rFonts w:hint="eastAsia"/>
-        </w:rPr>
-        <w:t xml:space="preserve">5x7ドットマトリクスフォント（半角英数字のみ）の描画</w:t>
-      </w:r>
-      <w:r>
-        <w:br/>
-      </w:r>
-      <w:r>
-        <w:rPr>
-          <w:rStyle w:val="VerbatimChar"/>
-        </w:rPr>
-        <w:t xml:space="preserve">  caption.*               </w:t>
-      </w:r>
-      <w:r>
-        <w:rPr>
-          <w:rStyle w:val="VerbatimChar"/>
-          <w:rFonts w:hint="eastAsia"/>
-        </w:rPr>
-        <w:t xml:space="preserve">印刷時刻・検出ラベルを印刷画像に追加する（白帯+黒文字）</w:t>
-      </w:r>
-      <w:r>
-        <w:br/>
-      </w:r>
-      <w:r>
-        <w:rPr>
-          <w:rStyle w:val="VerbatimChar"/>
-        </w:rPr>
-        <w:t xml:space="preserve">  clock.*                 </w:t>
-      </w:r>
-      <w:r>
-        <w:rPr>
-          <w:rStyle w:val="VerbatimChar"/>
-          <w:rFonts w:hint="eastAsia"/>
-        </w:rPr>
-        <w:t xml:space="preserve">NTPによる時刻同期（JST固定）</w:t>
-      </w:r>
-      <w:r>
-        <w:br/>
-      </w:r>
-      <w:r>
-        <w:rPr>
-          <w:rStyle w:val="VerbatimChar"/>
-        </w:rPr>
-        <w:t xml:space="preserve">  openai.*                 OpenAI Chat Completions </w:t>
-      </w:r>
-      <w:r>
-        <w:rPr>
-          <w:rStyle w:val="VerbatimChar"/>
-          <w:rFonts w:hint="eastAsia"/>
-        </w:rPr>
-        <w:t xml:space="preserve">APIへのHTTPSクライアント（俳句生成、8.4節）</w:t>
-      </w:r>
-      <w:r>
-        <w:br/>
-      </w:r>
-      <w:r>
-        <w:rPr>
-          <w:rStyle w:val="VerbatimChar"/>
-        </w:rPr>
-        <w:t xml:space="preserve">data/</w:t>
-      </w:r>
-      <w:r>
-        <w:br/>
-      </w:r>
-      <w:r>
-        <w:rPr>
-          <w:rStyle w:val="VerbatimChar"/>
-        </w:rPr>
-        <w:t xml:space="preserve">  index.html              </w:t>
-      </w:r>
-      <w:r>
-        <w:rPr>
-          <w:rStyle w:val="VerbatimChar"/>
-          <w:rFonts w:hint="eastAsia"/>
-        </w:rPr>
-        <w:t xml:space="preserve">m5web本体（UI＋Canvas画像変換、外部CDN依存なし・単一ファイル）</w:t>
-      </w:r>
-      <w:r>
-        <w:br/>
-      </w:r>
-      <w:r>
-        <w:rPr>
-          <w:rStyle w:val="VerbatimChar"/>
-        </w:rPr>
-        <w:t xml:space="preserve">arduino/m5web/</w:t>
-      </w:r>
-      <w:r>
-        <w:br/>
-      </w:r>
-      <w:r>
-        <w:rPr>
-          <w:rStyle w:val="VerbatimChar"/>
-        </w:rPr>
-        <w:t xml:space="preserve">  m5web.ino </w:t>
-      </w:r>
-      <w:r>
-        <w:rPr>
-          <w:rStyle w:val="VerbatimChar"/>
-          <w:rFonts w:hint="eastAsia"/>
-        </w:rPr>
-        <w:t xml:space="preserve">＋</w:t>
-      </w:r>
-      <w:r>
-        <w:rPr>
-          <w:rStyle w:val="VerbatimChar"/>
-        </w:rPr>
-        <w:t xml:space="preserve"> </w:t>
-      </w:r>
-      <w:r>
-        <w:rPr>
-          <w:rStyle w:val="VerbatimChar"/>
-          <w:rFonts w:hint="eastAsia"/>
-        </w:rPr>
-        <w:t xml:space="preserve">同名の*.h/*.cpp/data/</w:t>
-      </w:r>
-      <w:r>
-        <w:rPr>
-          <w:rStyle w:val="VerbatimChar"/>
-        </w:rPr>
-        <w:t xml:space="preserve">  Arduino </w:t>
-      </w:r>
-      <w:r>
-        <w:rPr>
-          <w:rStyle w:val="VerbatimChar"/>
-          <w:rFonts w:hint="eastAsia"/>
-        </w:rPr>
-        <w:t xml:space="preserve">IDE用の手動同期コピー</w:t>
-      </w:r>
-      <w:r>
-        <w:br/>
-      </w:r>
-      <w:r>
-        <w:rPr>
-          <w:rStyle w:val="VerbatimChar"/>
-        </w:rPr>
-        <w:t xml:space="preserve">maixpy/</w:t>
-      </w:r>
-      <w:r>
-        <w:br/>
-      </w:r>
-      <w:r>
-        <w:rPr>
-          <w:rStyle w:val="VerbatimChar"/>
-        </w:rPr>
-        <w:t xml:space="preserve">  m5web_capture.py        </w:t>
-      </w:r>
-      <w:r>
-        <w:rPr>
-          <w:rStyle w:val="VerbatimChar"/>
-          <w:rFonts w:hint="eastAsia"/>
-        </w:rPr>
-        <w:t xml:space="preserve">M5StickV側スクリプト（撮影→シャッター音→リサイズ→UART送信）</w:t>
-      </w:r>
-      <w:r>
-        <w:br/>
-      </w:r>
-      <w:r>
-        <w:rPr>
-          <w:rStyle w:val="VerbatimChar"/>
-        </w:rPr>
-        <w:t xml:space="preserve">  shutter.wav              </w:t>
-      </w:r>
-      <w:r>
-        <w:rPr>
-          <w:rStyle w:val="VerbatimChar"/>
-          <w:rFonts w:hint="eastAsia"/>
-        </w:rPr>
-        <w:t xml:space="preserve">シャッター音</w:t>
-      </w:r>
-      <w:r>
-        <w:br/>
-      </w:r>
-      <w:r>
-        <w:rPr>
-          <w:rStyle w:val="VerbatimChar"/>
-        </w:rPr>
-        <w:t xml:space="preserve">m5paper/</w:t>
-      </w:r>
-      <w:r>
-        <w:br/>
-      </w:r>
-      <w:r>
-        <w:rPr>
-          <w:rStyle w:val="VerbatimChar"/>
-        </w:rPr>
-        <w:t xml:space="preserve">  m5paper.ino              </w:t>
-      </w:r>
-      <w:r>
-        <w:rPr>
-          <w:rStyle w:val="VerbatimChar"/>
-          <w:rFonts w:hint="eastAsia"/>
-        </w:rPr>
-        <w:t xml:space="preserve">M5PaperColor用スケッチ</w:t>
-      </w:r>
-    </w:p>
-    <w:bookmarkEnd w:id="85"/>
-    <w:bookmarkStart w:id="86" w:name="付録d-参考文献リンク"/>
+    <w:bookmarkStart w:id="85" w:name="付録d-参考文献リンク"/>
     <w:p>
       <w:pPr>
         <w:pStyle w:val="Heading2"/>
@@ -18740,8 +18730,8 @@
         </w:pict>
       </w:r>
     </w:p>
-    <w:bookmarkEnd w:id="86"/>
-    <w:bookmarkStart w:id="87" w:name="おわりに"/>
+    <w:bookmarkEnd w:id="85"/>
+    <w:bookmarkStart w:id="86" w:name="おわりに"/>
     <w:p>
       <w:pPr>
         <w:pStyle w:val="Heading2"/>
@@ -18808,8 +18798,7 @@
         <w:t xml:space="preserve">あなたの手元で紙が印刷される、その最初の1枚を楽しみにしています。</w:t>
       </w:r>
     </w:p>
-    <w:bookmarkEnd w:id="87"/>
-    <w:bookmarkEnd w:id="88"/>
+    <w:bookmarkEnd w:id="86"/>
     <w:sectPr>
       <w:footnotePr>
         <w:numRestart w:val="eachSect"/>
@@ -19672,7 +19661,7 @@
         <w:rFonts w:asciiTheme="minorHAnsi" w:cstheme="minorBidi" w:eastAsiaTheme="minorEastAsia" w:hAnsiTheme="minorHAnsi"/>
         <w:sz w:val="24"/>
         <w:szCs w:val="24"/>
-        <w:lang w:bidi="ar-SA" w:eastAsia="zh-CN" w:val="en-US"/>
+        <w:lang w:bidi="ar-SA" w:eastAsia="ja" w:val="en-US"/>
       </w:rPr>
     </w:rPrDefault>
     <w:pPrDefault>

</xml_diff>

<commit_message>
Add detailed hardware spec sections and diagrams for each device
Adds original labeled diagrams (not vendor photos, for copyright reasons)
and detailed spec write-ups for ATOM Lite, the thermal printer unit,
M5StickV, and M5PaperColor to the Kindle guide's device chapter, each
tied back to how this project's firmware actually uses the pins/buttons/
sensors. Specs were verified against M5Stack's official docs.

Also adds the KDP front-cover artwork (png/jpg, 8.268x10.118in @300dpi)
generated earlier, and regenerates the docx/pdf to include the new
diagrams while keeping the KDP trim size and page numbers.

Co-Authored-By: Claude Sonnet 5 <noreply@anthropic.com>
</commit_message>
<xml_diff>
--- a/docs/iot-camera-printer-guide.docx
+++ b/docs/iot-camera-printer-guide.docx
@@ -2646,7 +2646,7 @@
     </w:p>
     <w:bookmarkEnd w:id="21"/>
     <w:bookmarkEnd w:id="22"/>
-    <w:bookmarkStart w:id="28" w:name="第3章-使用デバイスの解説"/>
+    <w:bookmarkStart w:id="44" w:name="第3章-使用デバイスの解説"/>
     <w:p>
       <w:pPr>
         <w:pStyle w:val="Heading2"/>
@@ -3348,7 +3348,7 @@
       </w:r>
     </w:p>
     <w:bookmarkEnd w:id="23"/>
-    <w:bookmarkStart w:id="24" w:name="atom-printer-kitatom-lite-58mm感熱プリンター"/>
+    <w:bookmarkStart w:id="32" w:name="atom-printer-kitatom-lite-58mm感熱プリンター"/>
     <w:p>
       <w:pPr>
         <w:pStyle w:val="Heading3"/>
@@ -3462,45 +3462,80 @@
         <w:t xml:space="preserve">Groveコネクタで外部機器と簡単に接続可能</w:t>
       </w:r>
     </w:p>
-    <w:p>
-      <w:pPr>
-        <w:pStyle w:val="FirstParagraph"/>
-      </w:pPr>
-      <w:r>
-        <w:rPr>
-          <w:b/>
-          <w:bCs/>
-        </w:rPr>
-        <w:t xml:space="preserve">ATOM Printer Kit</w:t>
-      </w:r>
-      <w:r>
-        <w:t xml:space="preserve">は、このATOM </w:t>
-      </w:r>
-      <w:r>
-        <w:rPr>
-          <w:rFonts w:hint="eastAsia"/>
-        </w:rPr>
-        <w:t xml:space="preserve">Liteと58mm幅の感熱プリンターユニットをセットにした製品です。感熱プリンターとは、レシートなどでおなじみの、専用の感熱紙に熱を加えることでインクなしに印字する方式のプリンターです。インクリボンやトナーが不要な代わりに、専用紙（感熱紙）が必要になります。</w:t>
-      </w:r>
-    </w:p>
-    <w:p>
-      <w:pPr>
-        <w:pStyle w:val="BodyText"/>
-      </w:pPr>
-      <w:r>
-        <w:rPr>
-          <w:rFonts w:hint="eastAsia"/>
-        </w:rPr>
-        <w:t xml:space="preserve">配線は非常にシンプルで、ATOM</w:t>
-      </w:r>
-      <w:r>
-        <w:t xml:space="preserve"> </w:t>
-      </w:r>
-      <w:r>
-        <w:rPr>
-          <w:rFonts w:hint="eastAsia"/>
-        </w:rPr>
-        <w:t xml:space="preserve">LiteのUARTピン（TX/RX）とプリンター側を接続するだけです。</w:t>
+    <w:bookmarkStart w:id="27" w:name="atom-liteの詳細ハードウェア仕様"/>
+    <w:p>
+      <w:pPr>
+        <w:pStyle w:val="Heading4"/>
+      </w:pPr>
+      <w:r>
+        <w:t xml:space="preserve">ATOM </w:t>
+      </w:r>
+      <w:r>
+        <w:rPr>
+          <w:rFonts w:hint="eastAsia"/>
+        </w:rPr>
+        <w:t xml:space="preserve">Liteの詳細ハードウェア仕様</w:t>
+      </w:r>
+    </w:p>
+    <w:p>
+      <w:pPr>
+        <w:pStyle w:val="CaptionedFigure"/>
+      </w:pPr>
+      <w:r>
+        <w:drawing>
+          <wp:inline>
+            <wp:extent cx="5334000" cy="3810000"/>
+            <wp:effectExtent b="0" l="0" r="0" t="0"/>
+            <wp:docPr descr="ATOM Lite本体の仕様図" title="" id="25" name="Picture"/>
+            <a:graphic>
+              <a:graphicData uri="http://schemas.openxmlformats.org/drawingml/2006/picture">
+                <pic:pic>
+                  <pic:nvPicPr>
+                    <pic:cNvPr descr="images/device-atom-lite.png" id="26" name="Picture"/>
+                    <pic:cNvPicPr>
+                      <a:picLocks noChangeArrowheads="1" noChangeAspect="1"/>
+                    </pic:cNvPicPr>
+                  </pic:nvPicPr>
+                  <pic:blipFill>
+                    <a:blip r:embed="rId24"/>
+                    <a:stretch>
+                      <a:fillRect/>
+                    </a:stretch>
+                  </pic:blipFill>
+                  <pic:spPr bwMode="auto">
+                    <a:xfrm>
+                      <a:off x="0" y="0"/>
+                      <a:ext cx="5334000" cy="3810000"/>
+                    </a:xfrm>
+                    <a:prstGeom prst="rect">
+                      <a:avLst/>
+                    </a:prstGeom>
+                    <a:noFill/>
+                    <a:ln w="9525">
+                      <a:noFill/>
+                      <a:headEnd/>
+                      <a:tailEnd/>
+                    </a:ln>
+                  </pic:spPr>
+                </pic:pic>
+              </a:graphicData>
+            </a:graphic>
+          </wp:inline>
+        </w:drawing>
+      </w:r>
+    </w:p>
+    <w:p>
+      <w:pPr>
+        <w:pStyle w:val="ImageCaption"/>
+      </w:pPr>
+      <w:r>
+        <w:t xml:space="preserve">ATOM </w:t>
+      </w:r>
+      <w:r>
+        <w:rPr>
+          <w:rFonts w:hint="eastAsia"/>
+        </w:rPr>
+        <w:t xml:space="preserve">Lite本体の仕様図</w:t>
       </w:r>
     </w:p>
     <w:tbl>
@@ -3524,18 +3559,24 @@
               <w:pStyle w:val="Compact"/>
             </w:pPr>
             <w:r>
-              <w:t xml:space="preserve">ATOM Lite</w:t>
-            </w:r>
-          </w:p>
-        </w:tc>
-        <w:tc>
-          <w:tcPr/>
-          <w:p>
-            <w:pPr>
-              <w:pStyle w:val="Compact"/>
-            </w:pPr>
-            <w:r>
-              <w:t xml:space="preserve">プリンター</w:t>
+              <w:rPr>
+                <w:rFonts w:hint="eastAsia"/>
+              </w:rPr>
+              <w:t xml:space="preserve">項目</w:t>
+            </w:r>
+          </w:p>
+        </w:tc>
+        <w:tc>
+          <w:tcPr/>
+          <w:p>
+            <w:pPr>
+              <w:pStyle w:val="Compact"/>
+            </w:pPr>
+            <w:r>
+              <w:rPr>
+                <w:rFonts w:hint="eastAsia"/>
+              </w:rPr>
+              <w:t xml:space="preserve">内容</w:t>
             </w:r>
           </w:p>
         </w:tc>
@@ -3548,21 +3589,30 @@
               <w:pStyle w:val="Compact"/>
             </w:pPr>
             <w:r>
-              <w:rPr>
-                <w:rFonts w:hint="eastAsia"/>
-              </w:rPr>
-              <w:t xml:space="preserve">G23（TX）</w:t>
-            </w:r>
-          </w:p>
-        </w:tc>
-        <w:tc>
-          <w:tcPr/>
-          <w:p>
-            <w:pPr>
-              <w:pStyle w:val="Compact"/>
-            </w:pPr>
-            <w:r>
-              <w:t xml:space="preserve">RX</w:t>
+              <w:t xml:space="preserve">SoC</w:t>
+            </w:r>
+          </w:p>
+        </w:tc>
+        <w:tc>
+          <w:tcPr/>
+          <w:p>
+            <w:pPr>
+              <w:pStyle w:val="Compact"/>
+            </w:pPr>
+            <w:r>
+              <w:rPr>
+                <w:rFonts w:hint="eastAsia"/>
+              </w:rPr>
+              <w:t xml:space="preserve">ESP32-PICO-D4（Xtensa®</w:t>
+            </w:r>
+            <w:r>
+              <w:t xml:space="preserve"> LX6 </w:t>
+            </w:r>
+            <w:r>
+              <w:rPr>
+                <w:rFonts w:hint="eastAsia"/>
+              </w:rPr>
+              <w:t xml:space="preserve">デュアルコア、最大240MHz）</w:t>
             </w:r>
           </w:p>
         </w:tc>
@@ -3575,21 +3625,33 @@
               <w:pStyle w:val="Compact"/>
             </w:pPr>
             <w:r>
-              <w:rPr>
-                <w:rFonts w:hint="eastAsia"/>
-              </w:rPr>
-              <w:t xml:space="preserve">G33（RX）</w:t>
-            </w:r>
-          </w:p>
-        </w:tc>
-        <w:tc>
-          <w:tcPr/>
-          <w:p>
-            <w:pPr>
-              <w:pStyle w:val="Compact"/>
-            </w:pPr>
-            <w:r>
-              <w:t xml:space="preserve">TX</w:t>
+              <w:t xml:space="preserve">メモリ</w:t>
+            </w:r>
+          </w:p>
+        </w:tc>
+        <w:tc>
+          <w:tcPr/>
+          <w:p>
+            <w:pPr>
+              <w:pStyle w:val="Compact"/>
+            </w:pPr>
+            <w:r>
+              <w:t xml:space="preserve">SRAM </w:t>
+            </w:r>
+            <w:r>
+              <w:rPr>
+                <w:rFonts w:hint="eastAsia"/>
+              </w:rPr>
+              <w:t xml:space="preserve">520KB／Flash</w:t>
+            </w:r>
+            <w:r>
+              <w:t xml:space="preserve"> </w:t>
+            </w:r>
+            <w:r>
+              <w:rPr>
+                <w:rFonts w:hint="eastAsia"/>
+              </w:rPr>
+              <w:t xml:space="preserve">4MB（SPI）</w:t>
             </w:r>
           </w:p>
         </w:tc>
@@ -3602,10 +3664,206 @@
               <w:pStyle w:val="Compact"/>
             </w:pPr>
             <w:r>
-              <w:t xml:space="preserve">5V / GND</w:t>
-            </w:r>
-          </w:p>
-        </w:tc>
+              <w:rPr>
+                <w:rFonts w:hint="eastAsia"/>
+              </w:rPr>
+              <w:t xml:space="preserve">通信</w:t>
+            </w:r>
+          </w:p>
+        </w:tc>
+        <w:tc>
+          <w:tcPr/>
+          <w:p>
+            <w:pPr>
+              <w:pStyle w:val="Compact"/>
+            </w:pPr>
+            <w:r>
+              <w:t xml:space="preserve">2.4GHz </w:t>
+            </w:r>
+            <w:r>
+              <w:rPr>
+                <w:rFonts w:hint="eastAsia"/>
+              </w:rPr>
+              <w:t xml:space="preserve">Wi-Fi（3Dアンテナ内蔵）・Bluetooth</w:t>
+            </w:r>
+          </w:p>
+        </w:tc>
+      </w:tr>
+      <w:tr>
+        <w:tc>
+          <w:tcPr/>
+          <w:p>
+            <w:pPr>
+              <w:pStyle w:val="Compact"/>
+            </w:pPr>
+            <w:r>
+              <w:t xml:space="preserve">ボタン</w:t>
+            </w:r>
+          </w:p>
+        </w:tc>
+        <w:tc>
+          <w:tcPr/>
+          <w:p>
+            <w:pPr>
+              <w:pStyle w:val="Compact"/>
+            </w:pPr>
+            <w:r>
+              <w:rPr>
+                <w:rFonts w:hint="eastAsia"/>
+              </w:rPr>
+              <w:t xml:space="preserve">カスタムボタン×1（G39）</w:t>
+            </w:r>
+          </w:p>
+        </w:tc>
+      </w:tr>
+      <w:tr>
+        <w:tc>
+          <w:tcPr/>
+          <w:p>
+            <w:pPr>
+              <w:pStyle w:val="Compact"/>
+            </w:pPr>
+            <w:r>
+              <w:t xml:space="preserve">LED</w:t>
+            </w:r>
+          </w:p>
+        </w:tc>
+        <w:tc>
+          <w:tcPr/>
+          <w:p>
+            <w:pPr>
+              <w:pStyle w:val="Compact"/>
+            </w:pPr>
+            <w:r>
+              <w:t xml:space="preserve">RGB </w:t>
+            </w:r>
+            <w:r>
+              <w:rPr>
+                <w:rFonts w:hint="eastAsia"/>
+              </w:rPr>
+              <w:t xml:space="preserve">LED（SK6812</w:t>
+            </w:r>
+            <w:r>
+              <w:t xml:space="preserve"> </w:t>
+            </w:r>
+            <w:r>
+              <w:rPr>
+                <w:rFonts w:hint="eastAsia"/>
+              </w:rPr>
+              <w:t xml:space="preserve">3535、G27）</w:t>
+            </w:r>
+          </w:p>
+        </w:tc>
+      </w:tr>
+      <w:tr>
+        <w:tc>
+          <w:tcPr/>
+          <w:p>
+            <w:pPr>
+              <w:pStyle w:val="Compact"/>
+            </w:pPr>
+            <w:r>
+              <w:rPr>
+                <w:rFonts w:hint="eastAsia"/>
+              </w:rPr>
+              <w:t xml:space="preserve">赤外線</w:t>
+            </w:r>
+          </w:p>
+        </w:tc>
+        <w:tc>
+          <w:tcPr/>
+          <w:p>
+            <w:pPr>
+              <w:pStyle w:val="Compact"/>
+            </w:pPr>
+            <w:r>
+              <w:rPr>
+                <w:rFonts w:hint="eastAsia"/>
+              </w:rPr>
+              <w:t xml:space="preserve">IR送信×1（G12、本書では未使用）</w:t>
+            </w:r>
+          </w:p>
+        </w:tc>
+      </w:tr>
+      <w:tr>
+        <w:tc>
+          <w:tcPr/>
+          <w:p>
+            <w:pPr>
+              <w:pStyle w:val="Compact"/>
+            </w:pPr>
+            <w:r>
+              <w:t xml:space="preserve">ポート</w:t>
+            </w:r>
+          </w:p>
+        </w:tc>
+        <w:tc>
+          <w:tcPr/>
+          <w:p>
+            <w:pPr>
+              <w:pStyle w:val="Compact"/>
+            </w:pPr>
+            <w:r>
+              <w:t xml:space="preserve">USB </w:t>
+            </w:r>
+            <w:r>
+              <w:rPr>
+                <w:rFonts w:hint="eastAsia"/>
+              </w:rPr>
+              <w:t xml:space="preserve">Type-C×1、Grove(HY2.0-4P)×1（GND/5V/G26/G32）</w:t>
+            </w:r>
+          </w:p>
+        </w:tc>
+      </w:tr>
+      <w:tr>
+        <w:tc>
+          <w:tcPr/>
+          <w:p>
+            <w:pPr>
+              <w:pStyle w:val="Compact"/>
+            </w:pPr>
+            <w:r>
+              <w:rPr>
+                <w:rFonts w:hint="eastAsia"/>
+              </w:rPr>
+              <w:t xml:space="preserve">拡張GPIO</w:t>
+            </w:r>
+          </w:p>
+        </w:tc>
+        <w:tc>
+          <w:tcPr/>
+          <w:p>
+            <w:pPr>
+              <w:pStyle w:val="Compact"/>
+            </w:pPr>
+            <w:r>
+              <w:rPr>
+                <w:rFonts w:hint="eastAsia"/>
+              </w:rPr>
+              <w:t xml:space="preserve">G19／G21(I2C</w:t>
+            </w:r>
+            <w:r>
+              <w:t xml:space="preserve"> </w:t>
+            </w:r>
+            <w:r>
+              <w:rPr>
+                <w:rFonts w:hint="eastAsia"/>
+              </w:rPr>
+              <w:t xml:space="preserve">SCL)／G22／G23／G25(I2C</w:t>
+            </w:r>
+            <w:r>
+              <w:t xml:space="preserve"> </w:t>
+            </w:r>
+            <w:r>
+              <w:rPr>
+                <w:rFonts w:hint="eastAsia"/>
+              </w:rPr>
+              <w:t xml:space="preserve">SDA)／G33</w:t>
+            </w:r>
+          </w:p>
+        </w:tc>
+      </w:tr>
+      <w:tr>
         <w:tc>
           <w:tcPr/>
           <w:p>
@@ -3617,6 +3875,131 @@
                 <w:rFonts w:hint="eastAsia"/>
               </w:rPr>
               <w:t xml:space="preserve">電源</w:t>
+            </w:r>
+          </w:p>
+        </w:tc>
+        <w:tc>
+          <w:tcPr/>
+          <w:p>
+            <w:pPr>
+              <w:pStyle w:val="Compact"/>
+            </w:pPr>
+            <w:r>
+              <w:rPr>
+                <w:rFonts w:hint="eastAsia"/>
+              </w:rPr>
+              <w:t xml:space="preserve">入力5V</w:t>
+            </w:r>
+            <w:r>
+              <w:t xml:space="preserve"> @ </w:t>
+            </w:r>
+            <w:r>
+              <w:rPr>
+                <w:rFonts w:hint="eastAsia"/>
+              </w:rPr>
+              <w:t xml:space="preserve">500mA（USB</w:t>
+            </w:r>
+            <w:r>
+              <w:t xml:space="preserve"> </w:t>
+            </w:r>
+            <w:r>
+              <w:rPr>
+                <w:rFonts w:hint="eastAsia"/>
+              </w:rPr>
+              <w:t xml:space="preserve">Type-C給電）</w:t>
+            </w:r>
+          </w:p>
+        </w:tc>
+      </w:tr>
+      <w:tr>
+        <w:tc>
+          <w:tcPr/>
+          <w:p>
+            <w:pPr>
+              <w:pStyle w:val="Compact"/>
+            </w:pPr>
+            <w:r>
+              <w:rPr>
+                <w:rFonts w:hint="eastAsia"/>
+              </w:rPr>
+              <w:t xml:space="preserve">サイズ・重量</w:t>
+            </w:r>
+          </w:p>
+        </w:tc>
+        <w:tc>
+          <w:tcPr/>
+          <w:p>
+            <w:pPr>
+              <w:pStyle w:val="Compact"/>
+            </w:pPr>
+            <w:r>
+              <w:t xml:space="preserve">24.0 × 24.0 × </w:t>
+            </w:r>
+            <w:r>
+              <w:rPr>
+                <w:rFonts w:hint="eastAsia"/>
+              </w:rPr>
+              <w:t xml:space="preserve">9.5mm／5.5g</w:t>
+            </w:r>
+          </w:p>
+        </w:tc>
+      </w:tr>
+      <w:tr>
+        <w:tc>
+          <w:tcPr/>
+          <w:p>
+            <w:pPr>
+              <w:pStyle w:val="Compact"/>
+            </w:pPr>
+            <w:r>
+              <w:rPr>
+                <w:rFonts w:hint="eastAsia"/>
+              </w:rPr>
+              <w:t xml:space="preserve">筐体</w:t>
+            </w:r>
+          </w:p>
+        </w:tc>
+        <w:tc>
+          <w:tcPr/>
+          <w:p>
+            <w:pPr>
+              <w:pStyle w:val="Compact"/>
+            </w:pPr>
+            <w:r>
+              <w:t xml:space="preserve">ポリカーボネート(PC) + </w:t>
+            </w:r>
+            <w:r>
+              <w:rPr>
+                <w:rFonts w:hint="eastAsia"/>
+              </w:rPr>
+              <w:t xml:space="preserve">ABS樹脂</w:t>
+            </w:r>
+          </w:p>
+        </w:tc>
+      </w:tr>
+      <w:tr>
+        <w:tc>
+          <w:tcPr/>
+          <w:p>
+            <w:pPr>
+              <w:pStyle w:val="Compact"/>
+            </w:pPr>
+            <w:r>
+              <w:rPr>
+                <w:rFonts w:hint="eastAsia"/>
+              </w:rPr>
+              <w:t xml:space="preserve">動作温度</w:t>
+            </w:r>
+          </w:p>
+        </w:tc>
+        <w:tc>
+          <w:tcPr/>
+          <w:p>
+            <w:pPr>
+              <w:pStyle w:val="Compact"/>
+            </w:pPr>
+            <w:r>
+              <w:t xml:space="preserve">0〜40℃</w:t>
             </w:r>
           </w:p>
         </w:tc>
@@ -3629,22 +4012,16 @@
       <w:r>
         <w:rPr>
           <w:rFonts w:hint="eastAsia"/>
-        </w:rPr>
-        <w:t xml:space="preserve">ここで初心者がつまずきやすいのが、</w:t>
-      </w:r>
-      <w:r>
-        <w:rPr>
-          <w:rFonts w:hint="eastAsia"/>
           <w:b/>
           <w:bCs/>
         </w:rPr>
-        <w:t xml:space="preserve">電源系統が2つに分かれている</w:t>
-      </w:r>
-      <w:r>
-        <w:rPr>
-          <w:rFonts w:hint="eastAsia"/>
-        </w:rPr>
-        <w:t xml:space="preserve">という点です。ATOM</w:t>
+        <w:t xml:space="preserve">本書での使い方との対応</w:t>
+      </w:r>
+      <w:r>
+        <w:rPr>
+          <w:rFonts w:hint="eastAsia"/>
+        </w:rPr>
+        <w:t xml:space="preserve">：カスタムボタン（G39）は単押しと5秒以上の長押しを判定しており、単押しは直近フレームの再印刷（6.7節）、長押しはWi-Fi設定のリセット（5.3節）に割り当てています。RGB</w:t>
       </w:r>
       <w:r>
         <w:t xml:space="preserve"> </w:t>
@@ -3653,21 +4030,40 @@
         <w:rPr>
           <w:rFonts w:hint="eastAsia"/>
         </w:rPr>
-        <w:t xml:space="preserve">Lite自体はUSBから給電できますが、プリンターの印字ヘッドは大きな電流を必要とするため、別途</w:t>
-      </w:r>
-      <w:r>
-        <w:rPr>
-          <w:rFonts w:hint="eastAsia"/>
+        <w:t xml:space="preserve">LED（G27）は</w:t>
+      </w:r>
+      <w:r>
+        <w:rPr>
+          <w:rStyle w:val="VerbatimChar"/>
+        </w:rPr>
+        <w:t xml:space="preserve">src/led.*</w:t>
+      </w:r>
+      <w:r>
+        <w:rPr>
+          <w:rFonts w:hint="eastAsia"/>
+        </w:rPr>
+        <w:t xml:space="preserve">が状態表示に使い、ギャラリー保存時の緑点滅・印刷可能状態の点灯などを制御します（6.8節）。Grove端子のG26/G32は、M5StickVとのUART直結という本書の核となる配線にそのまま使われています（6.1節）。IR送信（G12）は本プロジェクトでは配線・コードともに未使用です。</w:t>
+      </w:r>
+    </w:p>
+    <w:p>
+      <w:pPr>
+        <w:pStyle w:val="BodyText"/>
+      </w:pPr>
+      <w:r>
+        <w:rPr>
           <w:b/>
           <w:bCs/>
         </w:rPr>
-        <w:t xml:space="preserve">DC12V・2.5A以上のACアダプタ</w:t>
-      </w:r>
-      <w:r>
-        <w:rPr>
-          <w:rFonts w:hint="eastAsia"/>
-        </w:rPr>
-        <w:t xml:space="preserve">が必要です。USBだけ繋いでプリンターが動かない場合は、まずこのACアダプタの接続を疑ってください。</w:t>
+        <w:t xml:space="preserve">ATOM Printer Kit</w:t>
+      </w:r>
+      <w:r>
+        <w:t xml:space="preserve">は、このATOM </w:t>
+      </w:r>
+      <w:r>
+        <w:rPr>
+          <w:rFonts w:hint="eastAsia"/>
+        </w:rPr>
+        <w:t xml:space="preserve">Liteと58mm幅の感熱プリンターユニットをセットにした製品です。感熱プリンターとは、レシートなどでおなじみの、専用の感熱紙に熱を加えることでインクなしに印字する方式のプリンターです。インクリボンやトナーが不要な代わりに、専用紙（感熱紙）が必要になります。</w:t>
       </w:r>
     </w:p>
     <w:p>
@@ -3678,19 +4074,653 @@
         <w:rPr>
           <w:rFonts w:hint="eastAsia"/>
         </w:rPr>
-        <w:t xml:space="preserve">UART通信の速度（ボーレート）は9600bpsに固定されています。これは決して高速ではなく、本書の制限事項の章で触れるように、大きな画像を印刷する際は転送に数十秒かかることがあります。</w:t>
-      </w:r>
-    </w:p>
-    <w:p>
-      <w:pPr>
-        <w:pStyle w:val="BlockText"/>
-      </w:pPr>
+        <w:t xml:space="preserve">配線は非常にシンプルで、ATOM</w:t>
+      </w:r>
+      <w:r>
+        <w:t xml:space="preserve"> </w:t>
+      </w:r>
+      <w:r>
+        <w:rPr>
+          <w:rFonts w:hint="eastAsia"/>
+        </w:rPr>
+        <w:t xml:space="preserve">LiteのUARTピン（TX/RX）とプリンター側を接続するだけです。</w:t>
+      </w:r>
+    </w:p>
+    <w:tbl>
+      <w:tblPr>
+        <w:tblStyle w:val="Table"/>
+        <w:tblW w:type="auto" w:w="0"/>
+        <w:tblLook w:firstRow="1" w:lastRow="0" w:firstColumn="0" w:lastColumn="0" w:noHBand="0" w:noVBand="0" w:val="0020"/>
+      </w:tblPr>
+      <w:tblGrid>
+        <w:gridCol w:w="3960"/>
+        <w:gridCol w:w="3960"/>
+      </w:tblGrid>
+      <w:tr>
+        <w:trPr>
+          <w:tblHeader w:val="on"/>
+        </w:trPr>
+        <w:tc>
+          <w:tcPr/>
+          <w:p>
+            <w:pPr>
+              <w:pStyle w:val="Compact"/>
+            </w:pPr>
+            <w:r>
+              <w:t xml:space="preserve">ATOM Lite</w:t>
+            </w:r>
+          </w:p>
+        </w:tc>
+        <w:tc>
+          <w:tcPr/>
+          <w:p>
+            <w:pPr>
+              <w:pStyle w:val="Compact"/>
+            </w:pPr>
+            <w:r>
+              <w:t xml:space="preserve">プリンター</w:t>
+            </w:r>
+          </w:p>
+        </w:tc>
+      </w:tr>
+      <w:tr>
+        <w:tc>
+          <w:tcPr/>
+          <w:p>
+            <w:pPr>
+              <w:pStyle w:val="Compact"/>
+            </w:pPr>
+            <w:r>
+              <w:rPr>
+                <w:rFonts w:hint="eastAsia"/>
+              </w:rPr>
+              <w:t xml:space="preserve">G23（TX）</w:t>
+            </w:r>
+          </w:p>
+        </w:tc>
+        <w:tc>
+          <w:tcPr/>
+          <w:p>
+            <w:pPr>
+              <w:pStyle w:val="Compact"/>
+            </w:pPr>
+            <w:r>
+              <w:t xml:space="preserve">RX</w:t>
+            </w:r>
+          </w:p>
+        </w:tc>
+      </w:tr>
+      <w:tr>
+        <w:tc>
+          <w:tcPr/>
+          <w:p>
+            <w:pPr>
+              <w:pStyle w:val="Compact"/>
+            </w:pPr>
+            <w:r>
+              <w:rPr>
+                <w:rFonts w:hint="eastAsia"/>
+              </w:rPr>
+              <w:t xml:space="preserve">G33（RX）</w:t>
+            </w:r>
+          </w:p>
+        </w:tc>
+        <w:tc>
+          <w:tcPr/>
+          <w:p>
+            <w:pPr>
+              <w:pStyle w:val="Compact"/>
+            </w:pPr>
+            <w:r>
+              <w:t xml:space="preserve">TX</w:t>
+            </w:r>
+          </w:p>
+        </w:tc>
+      </w:tr>
+      <w:tr>
+        <w:tc>
+          <w:tcPr/>
+          <w:p>
+            <w:pPr>
+              <w:pStyle w:val="Compact"/>
+            </w:pPr>
+            <w:r>
+              <w:t xml:space="preserve">5V / GND</w:t>
+            </w:r>
+          </w:p>
+        </w:tc>
+        <w:tc>
+          <w:tcPr/>
+          <w:p>
+            <w:pPr>
+              <w:pStyle w:val="Compact"/>
+            </w:pPr>
+            <w:r>
+              <w:rPr>
+                <w:rFonts w:hint="eastAsia"/>
+              </w:rPr>
+              <w:t xml:space="preserve">電源</w:t>
+            </w:r>
+          </w:p>
+        </w:tc>
+      </w:tr>
+    </w:tbl>
+    <w:p>
+      <w:pPr>
+        <w:pStyle w:val="BodyText"/>
+      </w:pPr>
+      <w:r>
+        <w:rPr>
+          <w:rFonts w:hint="eastAsia"/>
+        </w:rPr>
+        <w:t xml:space="preserve">ここで初心者がつまずきやすいのが、</w:t>
+      </w:r>
       <w:r>
         <w:rPr>
           <w:rFonts w:hint="eastAsia"/>
           <w:b/>
           <w:bCs/>
         </w:rPr>
+        <w:t xml:space="preserve">電源系統が2つに分かれている</w:t>
+      </w:r>
+      <w:r>
+        <w:rPr>
+          <w:rFonts w:hint="eastAsia"/>
+        </w:rPr>
+        <w:t xml:space="preserve">という点です。ATOM</w:t>
+      </w:r>
+      <w:r>
+        <w:t xml:space="preserve"> </w:t>
+      </w:r>
+      <w:r>
+        <w:rPr>
+          <w:rFonts w:hint="eastAsia"/>
+        </w:rPr>
+        <w:t xml:space="preserve">Lite自体はUSBから給電できますが、プリンターの印字ヘッドは大きな電流を必要とするため、別途</w:t>
+      </w:r>
+      <w:r>
+        <w:rPr>
+          <w:rFonts w:hint="eastAsia"/>
+          <w:b/>
+          <w:bCs/>
+        </w:rPr>
+        <w:t xml:space="preserve">DC12V・2.5A以上のACアダプタ</w:t>
+      </w:r>
+      <w:r>
+        <w:rPr>
+          <w:rFonts w:hint="eastAsia"/>
+        </w:rPr>
+        <w:t xml:space="preserve">が必要です。USBだけ繋いでプリンターが動かない場合は、まずこのACアダプタの接続を疑ってください。</w:t>
+      </w:r>
+    </w:p>
+    <w:p>
+      <w:pPr>
+        <w:pStyle w:val="BodyText"/>
+      </w:pPr>
+      <w:r>
+        <w:rPr>
+          <w:rFonts w:hint="eastAsia"/>
+        </w:rPr>
+        <w:t xml:space="preserve">UART通信の速度（ボーレート）は9600bpsに固定されています。これは決して高速ではなく、本書の制限事項の章で触れるように、大きな画像を印刷する際は転送に数十秒かかることがあります。</w:t>
+      </w:r>
+    </w:p>
+    <w:bookmarkEnd w:id="27"/>
+    <w:bookmarkStart w:id="31" w:name="感熱プリンターユニットの詳細ハードウェア仕様"/>
+    <w:p>
+      <w:pPr>
+        <w:pStyle w:val="Heading4"/>
+      </w:pPr>
+      <w:r>
+        <w:rPr>
+          <w:rFonts w:hint="eastAsia"/>
+        </w:rPr>
+        <w:t xml:space="preserve">感熱プリンターユニットの詳細ハードウェア仕様</w:t>
+      </w:r>
+    </w:p>
+    <w:p>
+      <w:pPr>
+        <w:pStyle w:val="CaptionedFigure"/>
+      </w:pPr>
+      <w:r>
+        <w:drawing>
+          <wp:inline>
+            <wp:extent cx="5334000" cy="3810000"/>
+            <wp:effectExtent b="0" l="0" r="0" t="0"/>
+            <wp:docPr descr="感熱プリンターユニットの仕様図" title="" id="29" name="Picture"/>
+            <a:graphic>
+              <a:graphicData uri="http://schemas.openxmlformats.org/drawingml/2006/picture">
+                <pic:pic>
+                  <pic:nvPicPr>
+                    <pic:cNvPr descr="images/device-printer.png" id="30" name="Picture"/>
+                    <pic:cNvPicPr>
+                      <a:picLocks noChangeArrowheads="1" noChangeAspect="1"/>
+                    </pic:cNvPicPr>
+                  </pic:nvPicPr>
+                  <pic:blipFill>
+                    <a:blip r:embed="rId28"/>
+                    <a:stretch>
+                      <a:fillRect/>
+                    </a:stretch>
+                  </pic:blipFill>
+                  <pic:spPr bwMode="auto">
+                    <a:xfrm>
+                      <a:off x="0" y="0"/>
+                      <a:ext cx="5334000" cy="3810000"/>
+                    </a:xfrm>
+                    <a:prstGeom prst="rect">
+                      <a:avLst/>
+                    </a:prstGeom>
+                    <a:noFill/>
+                    <a:ln w="9525">
+                      <a:noFill/>
+                      <a:headEnd/>
+                      <a:tailEnd/>
+                    </a:ln>
+                  </pic:spPr>
+                </pic:pic>
+              </a:graphicData>
+            </a:graphic>
+          </wp:inline>
+        </w:drawing>
+      </w:r>
+    </w:p>
+    <w:p>
+      <w:pPr>
+        <w:pStyle w:val="ImageCaption"/>
+      </w:pPr>
+      <w:r>
+        <w:rPr>
+          <w:rFonts w:hint="eastAsia"/>
+        </w:rPr>
+        <w:t xml:space="preserve">感熱プリンターユニットの仕様図</w:t>
+      </w:r>
+    </w:p>
+    <w:tbl>
+      <w:tblPr>
+        <w:tblStyle w:val="Table"/>
+        <w:tblW w:type="pct" w:w="5000"/>
+        <w:tblLayout w:type="fixed"/>
+        <w:tblLook w:firstRow="1" w:lastRow="0" w:firstColumn="0" w:lastColumn="0" w:noHBand="0" w:noVBand="0" w:val="0020"/>
+      </w:tblPr>
+      <w:tblGrid>
+        <w:gridCol w:w="3960"/>
+        <w:gridCol w:w="3960"/>
+      </w:tblGrid>
+      <w:tr>
+        <w:trPr>
+          <w:tblHeader w:val="on"/>
+        </w:trPr>
+        <w:tc>
+          <w:tcPr/>
+          <w:p>
+            <w:pPr>
+              <w:pStyle w:val="Compact"/>
+            </w:pPr>
+            <w:r>
+              <w:rPr>
+                <w:rFonts w:hint="eastAsia"/>
+              </w:rPr>
+              <w:t xml:space="preserve">項目</w:t>
+            </w:r>
+          </w:p>
+        </w:tc>
+        <w:tc>
+          <w:tcPr/>
+          <w:p>
+            <w:pPr>
+              <w:pStyle w:val="Compact"/>
+            </w:pPr>
+            <w:r>
+              <w:rPr>
+                <w:rFonts w:hint="eastAsia"/>
+              </w:rPr>
+              <w:t xml:space="preserve">内容</w:t>
+            </w:r>
+          </w:p>
+        </w:tc>
+      </w:tr>
+      <w:tr>
+        <w:tc>
+          <w:tcPr/>
+          <w:p>
+            <w:pPr>
+              <w:pStyle w:val="Compact"/>
+            </w:pPr>
+            <w:r>
+              <w:rPr>
+                <w:rFonts w:hint="eastAsia"/>
+              </w:rPr>
+              <w:t xml:space="preserve">印字方式</w:t>
+            </w:r>
+          </w:p>
+        </w:tc>
+        <w:tc>
+          <w:tcPr/>
+          <w:p>
+            <w:pPr>
+              <w:pStyle w:val="Compact"/>
+            </w:pPr>
+            <w:r>
+              <w:rPr>
+                <w:rFonts w:hint="eastAsia"/>
+              </w:rPr>
+              <w:t xml:space="preserve">感熱式（モノクロ専用、インクリボン不要）</w:t>
+            </w:r>
+          </w:p>
+        </w:tc>
+      </w:tr>
+      <w:tr>
+        <w:tc>
+          <w:tcPr/>
+          <w:p>
+            <w:pPr>
+              <w:pStyle w:val="Compact"/>
+            </w:pPr>
+            <w:r>
+              <w:rPr>
+                <w:rFonts w:hint="eastAsia"/>
+              </w:rPr>
+              <w:t xml:space="preserve">解像度</w:t>
+            </w:r>
+          </w:p>
+        </w:tc>
+        <w:tc>
+          <w:tcPr/>
+          <w:p>
+            <w:pPr>
+              <w:pStyle w:val="Compact"/>
+            </w:pPr>
+            <w:r>
+              <w:rPr>
+                <w:rFonts w:hint="eastAsia"/>
+              </w:rPr>
+              <w:t xml:space="preserve">203dpi（8dot/mm）・最大384dot/ライン</w:t>
+            </w:r>
+          </w:p>
+        </w:tc>
+      </w:tr>
+      <w:tr>
+        <w:tc>
+          <w:tcPr/>
+          <w:p>
+            <w:pPr>
+              <w:pStyle w:val="Compact"/>
+            </w:pPr>
+            <w:r>
+              <w:rPr>
+                <w:rFonts w:hint="eastAsia"/>
+              </w:rPr>
+              <w:t xml:space="preserve">印字速度</w:t>
+            </w:r>
+          </w:p>
+        </w:tc>
+        <w:tc>
+          <w:tcPr/>
+          <w:p>
+            <w:pPr>
+              <w:pStyle w:val="Compact"/>
+            </w:pPr>
+            <w:r>
+              <w:t xml:space="preserve">60mm/s</w:t>
+            </w:r>
+          </w:p>
+        </w:tc>
+      </w:tr>
+      <w:tr>
+        <w:tc>
+          <w:tcPr/>
+          <w:p>
+            <w:pPr>
+              <w:pStyle w:val="Compact"/>
+            </w:pPr>
+            <w:r>
+              <w:rPr>
+                <w:rFonts w:hint="eastAsia"/>
+              </w:rPr>
+              <w:t xml:space="preserve">印字寿命</w:t>
+            </w:r>
+          </w:p>
+        </w:tc>
+        <w:tc>
+          <w:tcPr/>
+          <w:p>
+            <w:pPr>
+              <w:pStyle w:val="Compact"/>
+            </w:pPr>
+            <w:r>
+              <w:rPr>
+                <w:rFonts w:hint="eastAsia"/>
+              </w:rPr>
+              <w:t xml:space="preserve">約50km（累計印字距離の目安）</w:t>
+            </w:r>
+          </w:p>
+        </w:tc>
+      </w:tr>
+      <w:tr>
+        <w:tc>
+          <w:tcPr/>
+          <w:p>
+            <w:pPr>
+              <w:pStyle w:val="Compact"/>
+            </w:pPr>
+            <w:r>
+              <w:rPr>
+                <w:rFonts w:hint="eastAsia"/>
+              </w:rPr>
+              <w:t xml:space="preserve">用紙</w:t>
+            </w:r>
+          </w:p>
+        </w:tc>
+        <w:tc>
+          <w:tcPr/>
+          <w:p>
+            <w:pPr>
+              <w:pStyle w:val="Compact"/>
+            </w:pPr>
+            <w:r>
+              <w:rPr>
+                <w:rFonts w:hint="eastAsia"/>
+              </w:rPr>
+              <w:t xml:space="preserve">58mm幅（±0.05mm）ロール紙、厚さ0.05〜0.1mm、ロール径≤40mm、手切りカット</w:t>
+            </w:r>
+          </w:p>
+        </w:tc>
+      </w:tr>
+      <w:tr>
+        <w:tc>
+          <w:tcPr/>
+          <w:p>
+            <w:pPr>
+              <w:pStyle w:val="Compact"/>
+            </w:pPr>
+            <w:r>
+              <w:rPr>
+                <w:rFonts w:hint="eastAsia"/>
+              </w:rPr>
+              <w:t xml:space="preserve">接続方式</w:t>
+            </w:r>
+          </w:p>
+        </w:tc>
+        <w:tc>
+          <w:tcPr/>
+          <w:p>
+            <w:pPr>
+              <w:pStyle w:val="Compact"/>
+            </w:pPr>
+            <w:r>
+              <w:rPr>
+                <w:rFonts w:hint="eastAsia"/>
+              </w:rPr>
+              <w:t xml:space="preserve">USB／RS232／TTLの3方式に対応（本書はTTL・UART</w:t>
+            </w:r>
+            <w:r>
+              <w:t xml:space="preserve"> 9600bps </w:t>
+            </w:r>
+            <w:r>
+              <w:rPr>
+                <w:rFonts w:hint="eastAsia"/>
+              </w:rPr>
+              <w:t xml:space="preserve">8N1のみ使用）</w:t>
+            </w:r>
+          </w:p>
+        </w:tc>
+      </w:tr>
+      <w:tr>
+        <w:tc>
+          <w:tcPr/>
+          <w:p>
+            <w:pPr>
+              <w:pStyle w:val="Compact"/>
+            </w:pPr>
+            <w:r>
+              <w:rPr>
+                <w:rFonts w:hint="eastAsia"/>
+              </w:rPr>
+              <w:t xml:space="preserve">TTL配線</w:t>
+            </w:r>
+          </w:p>
+        </w:tc>
+        <w:tc>
+          <w:tcPr/>
+          <w:p>
+            <w:pPr>
+              <w:pStyle w:val="Compact"/>
+            </w:pPr>
+            <w:r>
+              <w:rPr>
+                <w:rFonts w:hint="eastAsia"/>
+              </w:rPr>
+              <w:t xml:space="preserve">TX=G23、RX=G33、CTS=G19（コネクタ上にCTSも存在するが、本書のファームウェアはTX/RXの2線のみ配線・使用）</w:t>
+            </w:r>
+          </w:p>
+        </w:tc>
+      </w:tr>
+      <w:tr>
+        <w:tc>
+          <w:tcPr/>
+          <w:p>
+            <w:pPr>
+              <w:pStyle w:val="Compact"/>
+            </w:pPr>
+            <w:r>
+              <w:rPr>
+                <w:rFonts w:hint="eastAsia"/>
+              </w:rPr>
+              <w:t xml:space="preserve">電源</w:t>
+            </w:r>
+          </w:p>
+        </w:tc>
+        <w:tc>
+          <w:tcPr/>
+          <w:p>
+            <w:pPr>
+              <w:pStyle w:val="Compact"/>
+            </w:pPr>
+            <w:r>
+              <w:rPr>
+                <w:rFonts w:hint="eastAsia"/>
+              </w:rPr>
+              <w:t xml:space="preserve">DC12V（2.5A以上のACアダプタ推奨、別売）</w:t>
+            </w:r>
+          </w:p>
+        </w:tc>
+      </w:tr>
+      <w:tr>
+        <w:tc>
+          <w:tcPr/>
+          <w:p>
+            <w:pPr>
+              <w:pStyle w:val="Compact"/>
+            </w:pPr>
+            <w:r>
+              <w:rPr>
+                <w:rFonts w:hint="eastAsia"/>
+              </w:rPr>
+              <w:t xml:space="preserve">サイズ・重量</w:t>
+            </w:r>
+          </w:p>
+        </w:tc>
+        <w:tc>
+          <w:tcPr/>
+          <w:p>
+            <w:pPr>
+              <w:pStyle w:val="Compact"/>
+            </w:pPr>
+            <w:r>
+              <w:t xml:space="preserve">151 × 79 × </w:t>
+            </w:r>
+            <w:r>
+              <w:rPr>
+                <w:rFonts w:hint="eastAsia"/>
+              </w:rPr>
+              <w:t xml:space="preserve">66mm／285g</w:t>
+            </w:r>
+          </w:p>
+        </w:tc>
+      </w:tr>
+    </w:tbl>
+    <w:p>
+      <w:pPr>
+        <w:pStyle w:val="BodyText"/>
+      </w:pPr>
+      <w:r>
+        <w:rPr>
+          <w:rFonts w:hint="eastAsia"/>
+          <w:b/>
+          <w:bCs/>
+        </w:rPr>
+        <w:t xml:space="preserve">本書での使い方との対応</w:t>
+      </w:r>
+      <w:r>
+        <w:rPr>
+          <w:rFonts w:hint="eastAsia"/>
+        </w:rPr>
+        <w:t xml:space="preserve">：</w:t>
+      </w:r>
+      <w:r>
+        <w:rPr>
+          <w:rStyle w:val="VerbatimChar"/>
+        </w:rPr>
+        <w:t xml:space="preserve">src/printer.cpp</w:t>
+      </w:r>
+      <w:r>
+        <w:t xml:space="preserve">はESP32の</w:t>
+      </w:r>
+      <w:r>
+        <w:rPr>
+          <w:rStyle w:val="VerbatimChar"/>
+        </w:rPr>
+        <w:t xml:space="preserve">HardwareSerial</w:t>
+      </w:r>
+      <w:r>
+        <w:rPr>
+          <w:rFonts w:hint="eastAsia"/>
+        </w:rPr>
+        <w:t xml:space="preserve">（Serial2）をTX(G23)・RX(G33)の2線のみで</w:t>
+      </w:r>
+      <w:r>
+        <w:rPr>
+          <w:rStyle w:val="VerbatimChar"/>
+        </w:rPr>
+        <w:t xml:space="preserve">begin(9600, SERIAL_8N1, kRxPin, kTxPin)</w:t>
+      </w:r>
+      <w:r>
+        <w:rPr>
+          <w:rFonts w:hint="eastAsia"/>
+        </w:rPr>
+        <w:t xml:space="preserve">初期化しており、CTSによるハードウェアフロー制御は行っていません。印字速度60mm/sという制約が、本書の制限事項の章で触れる「大きな画像ほど転送・印字に時間がかかる」という体験に直結しています。</w:t>
+      </w:r>
+    </w:p>
+    <w:p>
+      <w:pPr>
+        <w:pStyle w:val="BlockText"/>
+      </w:pPr>
+      <w:r>
+        <w:rPr>
+          <w:rFonts w:hint="eastAsia"/>
+          <w:b/>
+          <w:bCs/>
+        </w:rPr>
         <w:t xml:space="preserve">コラム：ATOMSシリーズとの違い</w:t>
       </w:r>
       <w:r>
@@ -3766,8 +4796,9 @@
         <w:t xml:space="preserve">）を前提に解説します。</w:t>
       </w:r>
     </w:p>
-    <w:bookmarkEnd w:id="24"/>
-    <w:bookmarkStart w:id="25" w:name="m5stickvkendryte-k210搭載aiカメラ"/>
+    <w:bookmarkEnd w:id="31"/>
+    <w:bookmarkEnd w:id="32"/>
+    <w:bookmarkStart w:id="37" w:name="m5stickvkendryte-k210搭載aiカメラ"/>
     <w:p>
       <w:pPr>
         <w:pStyle w:val="Heading3"/>
@@ -3918,9 +4949,602 @@
         <w:t xml:space="preserve">IDE」を使う）</w:t>
       </w:r>
     </w:p>
-    <w:p>
-      <w:pPr>
-        <w:pStyle w:val="FirstParagraph"/>
+    <w:bookmarkStart w:id="36" w:name="m5stickvの詳細ハードウェア仕様"/>
+    <w:p>
+      <w:pPr>
+        <w:pStyle w:val="Heading4"/>
+      </w:pPr>
+      <w:r>
+        <w:rPr>
+          <w:rFonts w:hint="eastAsia"/>
+        </w:rPr>
+        <w:t xml:space="preserve">M5StickVの詳細ハードウェア仕様</w:t>
+      </w:r>
+    </w:p>
+    <w:p>
+      <w:pPr>
+        <w:pStyle w:val="CaptionedFigure"/>
+      </w:pPr>
+      <w:r>
+        <w:drawing>
+          <wp:inline>
+            <wp:extent cx="5334000" cy="4318000"/>
+            <wp:effectExtent b="0" l="0" r="0" t="0"/>
+            <wp:docPr descr="M5StickV本体の仕様図" title="" id="34" name="Picture"/>
+            <a:graphic>
+              <a:graphicData uri="http://schemas.openxmlformats.org/drawingml/2006/picture">
+                <pic:pic>
+                  <pic:nvPicPr>
+                    <pic:cNvPr descr="images/device-stickv.png" id="35" name="Picture"/>
+                    <pic:cNvPicPr>
+                      <a:picLocks noChangeArrowheads="1" noChangeAspect="1"/>
+                    </pic:cNvPicPr>
+                  </pic:nvPicPr>
+                  <pic:blipFill>
+                    <a:blip r:embed="rId33"/>
+                    <a:stretch>
+                      <a:fillRect/>
+                    </a:stretch>
+                  </pic:blipFill>
+                  <pic:spPr bwMode="auto">
+                    <a:xfrm>
+                      <a:off x="0" y="0"/>
+                      <a:ext cx="5334000" cy="4318000"/>
+                    </a:xfrm>
+                    <a:prstGeom prst="rect">
+                      <a:avLst/>
+                    </a:prstGeom>
+                    <a:noFill/>
+                    <a:ln w="9525">
+                      <a:noFill/>
+                      <a:headEnd/>
+                      <a:tailEnd/>
+                    </a:ln>
+                  </pic:spPr>
+                </pic:pic>
+              </a:graphicData>
+            </a:graphic>
+          </wp:inline>
+        </w:drawing>
+      </w:r>
+    </w:p>
+    <w:p>
+      <w:pPr>
+        <w:pStyle w:val="ImageCaption"/>
+      </w:pPr>
+      <w:r>
+        <w:rPr>
+          <w:rFonts w:hint="eastAsia"/>
+        </w:rPr>
+        <w:t xml:space="preserve">M5StickV本体の仕様図</w:t>
+      </w:r>
+    </w:p>
+    <w:tbl>
+      <w:tblPr>
+        <w:tblStyle w:val="Table"/>
+        <w:tblW w:type="pct" w:w="5000"/>
+        <w:tblLayout w:type="fixed"/>
+        <w:tblLook w:firstRow="1" w:lastRow="0" w:firstColumn="0" w:lastColumn="0" w:noHBand="0" w:noVBand="0" w:val="0020"/>
+      </w:tblPr>
+      <w:tblGrid>
+        <w:gridCol w:w="3960"/>
+        <w:gridCol w:w="3960"/>
+      </w:tblGrid>
+      <w:tr>
+        <w:trPr>
+          <w:tblHeader w:val="on"/>
+        </w:trPr>
+        <w:tc>
+          <w:tcPr/>
+          <w:p>
+            <w:pPr>
+              <w:pStyle w:val="Compact"/>
+            </w:pPr>
+            <w:r>
+              <w:rPr>
+                <w:rFonts w:hint="eastAsia"/>
+              </w:rPr>
+              <w:t xml:space="preserve">項目</w:t>
+            </w:r>
+          </w:p>
+        </w:tc>
+        <w:tc>
+          <w:tcPr/>
+          <w:p>
+            <w:pPr>
+              <w:pStyle w:val="Compact"/>
+            </w:pPr>
+            <w:r>
+              <w:rPr>
+                <w:rFonts w:hint="eastAsia"/>
+              </w:rPr>
+              <w:t xml:space="preserve">内容</w:t>
+            </w:r>
+          </w:p>
+        </w:tc>
+      </w:tr>
+      <w:tr>
+        <w:tc>
+          <w:tcPr/>
+          <w:p>
+            <w:pPr>
+              <w:pStyle w:val="Compact"/>
+            </w:pPr>
+            <w:r>
+              <w:t xml:space="preserve">チップ</w:t>
+            </w:r>
+          </w:p>
+        </w:tc>
+        <w:tc>
+          <w:tcPr/>
+          <w:p>
+            <w:pPr>
+              <w:pStyle w:val="Compact"/>
+            </w:pPr>
+            <w:r>
+              <w:t xml:space="preserve">Kendryte </w:t>
+            </w:r>
+            <w:r>
+              <w:rPr>
+                <w:rFonts w:hint="eastAsia"/>
+              </w:rPr>
+              <w:t xml:space="preserve">K210（RISC-V</w:t>
+            </w:r>
+            <w:r>
+              <w:t xml:space="preserve"> 64bit デュアルコア </w:t>
+            </w:r>
+            <w:r>
+              <w:rPr>
+                <w:rFonts w:hint="eastAsia"/>
+              </w:rPr>
+              <w:t xml:space="preserve">400MHz＋NPU</w:t>
+            </w:r>
+            <w:r>
+              <w:t xml:space="preserve"> </w:t>
+            </w:r>
+            <w:r>
+              <w:rPr>
+                <w:rFonts w:hint="eastAsia"/>
+              </w:rPr>
+              <w:t xml:space="preserve">0.8TOPS）</w:t>
+            </w:r>
+          </w:p>
+        </w:tc>
+      </w:tr>
+      <w:tr>
+        <w:tc>
+          <w:tcPr/>
+          <w:p>
+            <w:pPr>
+              <w:pStyle w:val="Compact"/>
+            </w:pPr>
+            <w:r>
+              <w:t xml:space="preserve">メモリ</w:t>
+            </w:r>
+          </w:p>
+        </w:tc>
+        <w:tc>
+          <w:tcPr/>
+          <w:p>
+            <w:pPr>
+              <w:pStyle w:val="Compact"/>
+            </w:pPr>
+            <w:r>
+              <w:t xml:space="preserve">SRAM </w:t>
+            </w:r>
+            <w:r>
+              <w:rPr>
+                <w:rFonts w:hint="eastAsia"/>
+              </w:rPr>
+              <w:t xml:space="preserve">8MB／Flash</w:t>
+            </w:r>
+            <w:r>
+              <w:t xml:space="preserve"> 16MB</w:t>
+            </w:r>
+          </w:p>
+        </w:tc>
+      </w:tr>
+      <w:tr>
+        <w:tc>
+          <w:tcPr/>
+          <w:p>
+            <w:pPr>
+              <w:pStyle w:val="Compact"/>
+            </w:pPr>
+            <w:r>
+              <w:t xml:space="preserve">カメラ</w:t>
+            </w:r>
+          </w:p>
+        </w:tc>
+        <w:tc>
+          <w:tcPr/>
+          <w:p>
+            <w:pPr>
+              <w:pStyle w:val="Compact"/>
+            </w:pPr>
+            <w:r>
+              <w:rPr>
+                <w:rFonts w:hint="eastAsia"/>
+              </w:rPr>
+              <w:t xml:space="preserve">OV7740（0.3MP、画角55°、VGA</w:t>
+            </w:r>
+            <w:r>
+              <w:t xml:space="preserve"> </w:t>
+            </w:r>
+            <w:r>
+              <w:rPr>
+                <w:rFonts w:hint="eastAsia"/>
+              </w:rPr>
+              <w:t xml:space="preserve">60fps／QVGA</w:t>
+            </w:r>
+            <w:r>
+              <w:t xml:space="preserve"> </w:t>
+            </w:r>
+            <w:r>
+              <w:rPr>
+                <w:rFonts w:hint="eastAsia"/>
+              </w:rPr>
+              <w:t xml:space="preserve">120fps）</w:t>
+            </w:r>
+          </w:p>
+        </w:tc>
+      </w:tr>
+      <w:tr>
+        <w:tc>
+          <w:tcPr/>
+          <w:p>
+            <w:pPr>
+              <w:pStyle w:val="Compact"/>
+            </w:pPr>
+            <w:r>
+              <w:t xml:space="preserve">ディスプレイ</w:t>
+            </w:r>
+          </w:p>
+        </w:tc>
+        <w:tc>
+          <w:tcPr/>
+          <w:p>
+            <w:pPr>
+              <w:pStyle w:val="Compact"/>
+            </w:pPr>
+            <w:r>
+              <w:rPr>
+                <w:rFonts w:hint="eastAsia"/>
+              </w:rPr>
+              <w:t xml:space="preserve">1.14型</w:t>
+            </w:r>
+            <w:r>
+              <w:t xml:space="preserve"> IPS </w:t>
+            </w:r>
+            <w:r>
+              <w:rPr>
+                <w:rFonts w:hint="eastAsia"/>
+              </w:rPr>
+              <w:t xml:space="preserve">135×240（ST7789）</w:t>
+            </w:r>
+          </w:p>
+        </w:tc>
+      </w:tr>
+      <w:tr>
+        <w:tc>
+          <w:tcPr/>
+          <w:p>
+            <w:pPr>
+              <w:pStyle w:val="Compact"/>
+            </w:pPr>
+            <w:r>
+              <w:t xml:space="preserve">ボタン</w:t>
+            </w:r>
+          </w:p>
+        </w:tc>
+        <w:tc>
+          <w:tcPr/>
+          <w:p>
+            <w:pPr>
+              <w:pStyle w:val="Compact"/>
+            </w:pPr>
+            <w:r>
+              <w:rPr>
+                <w:rFonts w:hint="eastAsia"/>
+              </w:rPr>
+              <w:t xml:space="preserve">正面ボタン(A)・側面ボタン(B)の2つ</w:t>
+            </w:r>
+          </w:p>
+        </w:tc>
+      </w:tr>
+      <w:tr>
+        <w:tc>
+          <w:tcPr/>
+          <w:p>
+            <w:pPr>
+              <w:pStyle w:val="Compact"/>
+            </w:pPr>
+            <w:r>
+              <w:t xml:space="preserve">LED</w:t>
+            </w:r>
+          </w:p>
+        </w:tc>
+        <w:tc>
+          <w:tcPr/>
+          <w:p>
+            <w:pPr>
+              <w:pStyle w:val="Compact"/>
+            </w:pPr>
+            <w:r>
+              <w:t xml:space="preserve">RGBWインジケーターLED×1</w:t>
+            </w:r>
+          </w:p>
+        </w:tc>
+      </w:tr>
+      <w:tr>
+        <w:tc>
+          <w:tcPr/>
+          <w:p>
+            <w:pPr>
+              <w:pStyle w:val="Compact"/>
+            </w:pPr>
+            <w:r>
+              <w:t xml:space="preserve">センサー</w:t>
+            </w:r>
+          </w:p>
+        </w:tc>
+        <w:tc>
+          <w:tcPr/>
+          <w:p>
+            <w:pPr>
+              <w:pStyle w:val="Compact"/>
+            </w:pPr>
+            <w:r>
+              <w:rPr>
+                <w:rFonts w:hint="eastAsia"/>
+              </w:rPr>
+              <w:t xml:space="preserve">6軸IMU</w:t>
+            </w:r>
+            <w:r>
+              <w:t xml:space="preserve"> </w:t>
+            </w:r>
+            <w:r>
+              <w:rPr>
+                <w:rFonts w:hint="eastAsia"/>
+              </w:rPr>
+              <w:t xml:space="preserve">MPU6886（加速度・ジャイロ）</w:t>
+            </w:r>
+          </w:p>
+        </w:tc>
+      </w:tr>
+      <w:tr>
+        <w:tc>
+          <w:tcPr/>
+          <w:p>
+            <w:pPr>
+              <w:pStyle w:val="Compact"/>
+            </w:pPr>
+            <w:r>
+              <w:t xml:space="preserve">オーディオ</w:t>
+            </w:r>
+          </w:p>
+        </w:tc>
+        <w:tc>
+          <w:tcPr/>
+          <w:p>
+            <w:pPr>
+              <w:pStyle w:val="Compact"/>
+            </w:pPr>
+            <w:r>
+              <w:rPr>
+                <w:rFonts w:hint="eastAsia"/>
+              </w:rPr>
+              <w:t xml:space="preserve">スピーカー(MAX98357)＋マイク（2020年3月以降のロットで搭載）</w:t>
+            </w:r>
+          </w:p>
+        </w:tc>
+      </w:tr>
+      <w:tr>
+        <w:tc>
+          <w:tcPr/>
+          <w:p>
+            <w:pPr>
+              <w:pStyle w:val="Compact"/>
+            </w:pPr>
+            <w:r>
+              <w:t xml:space="preserve">バッテリー</w:t>
+            </w:r>
+          </w:p>
+        </w:tc>
+        <w:tc>
+          <w:tcPr/>
+          <w:p>
+            <w:pPr>
+              <w:pStyle w:val="Compact"/>
+            </w:pPr>
+            <w:r>
+              <w:rPr>
+                <w:rFonts w:hint="eastAsia"/>
+              </w:rPr>
+              <w:t xml:space="preserve">200mAhリポ電池（PMU:</w:t>
+            </w:r>
+            <w:r>
+              <w:t xml:space="preserve"> </w:t>
+            </w:r>
+            <w:r>
+              <w:rPr>
+                <w:rFonts w:hint="eastAsia"/>
+              </w:rPr>
+              <w:t xml:space="preserve">AXP192）</w:t>
+            </w:r>
+          </w:p>
+        </w:tc>
+      </w:tr>
+      <w:tr>
+        <w:tc>
+          <w:tcPr/>
+          <w:p>
+            <w:pPr>
+              <w:pStyle w:val="Compact"/>
+            </w:pPr>
+            <w:r>
+              <w:t xml:space="preserve">ストレージ</w:t>
+            </w:r>
+          </w:p>
+        </w:tc>
+        <w:tc>
+          <w:tcPr/>
+          <w:p>
+            <w:pPr>
+              <w:pStyle w:val="Compact"/>
+            </w:pPr>
+            <w:r>
+              <w:t xml:space="preserve">microSD/TFカードスロット</w:t>
+            </w:r>
+          </w:p>
+        </w:tc>
+      </w:tr>
+      <w:tr>
+        <w:tc>
+          <w:tcPr/>
+          <w:p>
+            <w:pPr>
+              <w:pStyle w:val="Compact"/>
+            </w:pPr>
+            <w:r>
+              <w:t xml:space="preserve">ポート</w:t>
+            </w:r>
+          </w:p>
+        </w:tc>
+        <w:tc>
+          <w:tcPr/>
+          <w:p>
+            <w:pPr>
+              <w:pStyle w:val="Compact"/>
+            </w:pPr>
+            <w:r>
+              <w:t xml:space="preserve">USB </w:t>
+            </w:r>
+            <w:r>
+              <w:rPr>
+                <w:rFonts w:hint="eastAsia"/>
+              </w:rPr>
+              <w:t xml:space="preserve">Type-C×1、Grove(HY2.0-4P)×1（I2C/UART/IO）</w:t>
+            </w:r>
+          </w:p>
+        </w:tc>
+      </w:tr>
+      <w:tr>
+        <w:tc>
+          <w:tcPr/>
+          <w:p>
+            <w:pPr>
+              <w:pStyle w:val="Compact"/>
+            </w:pPr>
+            <w:r>
+              <w:rPr>
+                <w:rFonts w:hint="eastAsia"/>
+              </w:rPr>
+              <w:t xml:space="preserve">サイズ・重量</w:t>
+            </w:r>
+          </w:p>
+        </w:tc>
+        <w:tc>
+          <w:tcPr/>
+          <w:p>
+            <w:pPr>
+              <w:pStyle w:val="Compact"/>
+            </w:pPr>
+            <w:r>
+              <w:t xml:space="preserve">48.0 × 24.0 × </w:t>
+            </w:r>
+            <w:r>
+              <w:rPr>
+                <w:rFonts w:hint="eastAsia"/>
+              </w:rPr>
+              <w:t xml:space="preserve">22.0mm／23.0g</w:t>
+            </w:r>
+          </w:p>
+        </w:tc>
+      </w:tr>
+      <w:tr>
+        <w:tc>
+          <w:tcPr/>
+          <w:p>
+            <w:pPr>
+              <w:pStyle w:val="Compact"/>
+            </w:pPr>
+            <w:r>
+              <w:rPr>
+                <w:rFonts w:hint="eastAsia"/>
+              </w:rPr>
+              <w:t xml:space="preserve">付属品</w:t>
+            </w:r>
+          </w:p>
+        </w:tc>
+        <w:tc>
+          <w:tcPr/>
+          <w:p>
+            <w:pPr>
+              <w:pStyle w:val="Compact"/>
+            </w:pPr>
+            <w:r>
+              <w:rPr>
+                <w:rFonts w:hint="eastAsia"/>
+              </w:rPr>
+              <w:t xml:space="preserve">USBケーブル(100cm)・スタンド・六角レンチ</w:t>
+            </w:r>
+          </w:p>
+        </w:tc>
+      </w:tr>
+    </w:tbl>
+    <w:p>
+      <w:pPr>
+        <w:pStyle w:val="BodyText"/>
+      </w:pPr>
+      <w:r>
+        <w:rPr>
+          <w:rFonts w:hint="eastAsia"/>
+          <w:b/>
+          <w:bCs/>
+        </w:rPr>
+        <w:t xml:space="preserve">本書での使い方との対応</w:t>
+      </w:r>
+      <w:r>
+        <w:rPr>
+          <w:rFonts w:hint="eastAsia"/>
+        </w:rPr>
+        <w:t xml:space="preserve">：正面ボタン(A)は</w:t>
+      </w:r>
+      <w:r>
+        <w:rPr>
+          <w:rStyle w:val="VerbatimChar"/>
+        </w:rPr>
+        <w:t xml:space="preserve">m5web_capture.py</w:t>
+      </w:r>
+      <w:r>
+        <w:rPr>
+          <w:rFonts w:hint="eastAsia"/>
+        </w:rPr>
+        <w:t xml:space="preserve">でシャッターボタンとして使い、押すと撮影→顔検出→ATOM</w:t>
+      </w:r>
+      <w:r>
+        <w:t xml:space="preserve"> </w:t>
+      </w:r>
+      <w:r>
+        <w:rPr>
+          <w:rFonts w:hint="eastAsia"/>
+        </w:rPr>
+        <w:t xml:space="preserve">Liteへの送信という一連の処理が始まります（6.3節）。RGBWインジケーターLEDは処理中に白、送信完了時に緑へ切り替わる合図として使われます（同節）。側面ボタン(B)・6軸IMU・スピーカー/マイク・microSDスロットは、本書のファームウェアでは未使用です（K210のKPUを使った物体分類への拡張案は11.1節で触れます）。Grove端子はATOM</w:t>
+      </w:r>
+      <w:r>
+        <w:t xml:space="preserve"> </w:t>
+      </w:r>
+      <w:r>
+        <w:rPr>
+          <w:rFonts w:hint="eastAsia"/>
+        </w:rPr>
+        <w:t xml:space="preserve">LiteとのUART直結（G34→G32、G35←G26）にそのまま使われています（6.1節）。Wi-Fiが無いこの構成上の制約が、本書がM5StickVだけ直結UARTという別経路を選んだ理由です。</w:t>
+      </w:r>
+    </w:p>
+    <w:p>
+      <w:pPr>
+        <w:pStyle w:val="BodyText"/>
       </w:pPr>
       <w:r>
         <w:rPr>
@@ -4203,8 +5827,9 @@
         <w:t xml:space="preserve">K210は高性能なAIチップですが、MicroPythonが自由に使えるヒープメモリ（プログラムが動的に確保できる作業用メモリ）は非常に限られています。本書の第6章で詳しく扱いますが、「384×512ピクセル程度の画像バッファを1つ作っただけでメモリ不足になる」という制約が、実際のプログラム設計に大きな影響を与えています。小型AIカメラを使いこなす上で、こうしたメモリ制約への対処は避けて通れないテーマです。</w:t>
       </w:r>
     </w:p>
-    <w:bookmarkEnd w:id="25"/>
-    <w:bookmarkStart w:id="26" w:name="m5papercolor電子ペーパー端末"/>
+    <w:bookmarkEnd w:id="36"/>
+    <w:bookmarkEnd w:id="37"/>
+    <w:bookmarkStart w:id="42" w:name="m5papercolor電子ペーパー端末"/>
     <w:p>
       <w:pPr>
         <w:pStyle w:val="Heading3"/>
@@ -4244,6 +5869,536 @@
           <w:rFonts w:hint="eastAsia"/>
         </w:rPr>
         <w:t xml:space="preserve">6カラー電子ペーパーディスプレイを搭載したM5Stack社の製品です（ESP32-S3ベース）。電子ペーパーは、電源を切っても表示内容が消えない・直射日光下でも見やすい・消費電力が非常に低いという特徴を持ちます。従来のモノクロ「M5Paper」（M5EPDライブラリを使用）とは別機種・別ライブラリ構成なので、購入・書き込みの際は取り違えないよう注意してください。</w:t>
+      </w:r>
+    </w:p>
+    <w:bookmarkStart w:id="41" w:name="m5papercolorの詳細ハードウェア仕様"/>
+    <w:p>
+      <w:pPr>
+        <w:pStyle w:val="Heading4"/>
+      </w:pPr>
+      <w:r>
+        <w:rPr>
+          <w:rFonts w:hint="eastAsia"/>
+        </w:rPr>
+        <w:t xml:space="preserve">M5PaperColorの詳細ハードウェア仕様</w:t>
+      </w:r>
+    </w:p>
+    <w:p>
+      <w:pPr>
+        <w:pStyle w:val="CaptionedFigure"/>
+      </w:pPr>
+      <w:r>
+        <w:drawing>
+          <wp:inline>
+            <wp:extent cx="5334000" cy="4318000"/>
+            <wp:effectExtent b="0" l="0" r="0" t="0"/>
+            <wp:docPr descr="M5PaperColor本体の仕様図" title="" id="39" name="Picture"/>
+            <a:graphic>
+              <a:graphicData uri="http://schemas.openxmlformats.org/drawingml/2006/picture">
+                <pic:pic>
+                  <pic:nvPicPr>
+                    <pic:cNvPr descr="images/device-papercolor.png" id="40" name="Picture"/>
+                    <pic:cNvPicPr>
+                      <a:picLocks noChangeArrowheads="1" noChangeAspect="1"/>
+                    </pic:cNvPicPr>
+                  </pic:nvPicPr>
+                  <pic:blipFill>
+                    <a:blip r:embed="rId38"/>
+                    <a:stretch>
+                      <a:fillRect/>
+                    </a:stretch>
+                  </pic:blipFill>
+                  <pic:spPr bwMode="auto">
+                    <a:xfrm>
+                      <a:off x="0" y="0"/>
+                      <a:ext cx="5334000" cy="4318000"/>
+                    </a:xfrm>
+                    <a:prstGeom prst="rect">
+                      <a:avLst/>
+                    </a:prstGeom>
+                    <a:noFill/>
+                    <a:ln w="9525">
+                      <a:noFill/>
+                      <a:headEnd/>
+                      <a:tailEnd/>
+                    </a:ln>
+                  </pic:spPr>
+                </pic:pic>
+              </a:graphicData>
+            </a:graphic>
+          </wp:inline>
+        </w:drawing>
+      </w:r>
+    </w:p>
+    <w:p>
+      <w:pPr>
+        <w:pStyle w:val="ImageCaption"/>
+      </w:pPr>
+      <w:r>
+        <w:rPr>
+          <w:rFonts w:hint="eastAsia"/>
+        </w:rPr>
+        <w:t xml:space="preserve">M5PaperColor本体の仕様図</w:t>
+      </w:r>
+    </w:p>
+    <w:tbl>
+      <w:tblPr>
+        <w:tblStyle w:val="Table"/>
+        <w:tblW w:type="pct" w:w="5000"/>
+        <w:tblLayout w:type="fixed"/>
+        <w:tblLook w:firstRow="1" w:lastRow="0" w:firstColumn="0" w:lastColumn="0" w:noHBand="0" w:noVBand="0" w:val="0020"/>
+      </w:tblPr>
+      <w:tblGrid>
+        <w:gridCol w:w="3960"/>
+        <w:gridCol w:w="3960"/>
+      </w:tblGrid>
+      <w:tr>
+        <w:trPr>
+          <w:tblHeader w:val="on"/>
+        </w:trPr>
+        <w:tc>
+          <w:tcPr/>
+          <w:p>
+            <w:pPr>
+              <w:pStyle w:val="Compact"/>
+            </w:pPr>
+            <w:r>
+              <w:rPr>
+                <w:rFonts w:hint="eastAsia"/>
+              </w:rPr>
+              <w:t xml:space="preserve">項目</w:t>
+            </w:r>
+          </w:p>
+        </w:tc>
+        <w:tc>
+          <w:tcPr/>
+          <w:p>
+            <w:pPr>
+              <w:pStyle w:val="Compact"/>
+            </w:pPr>
+            <w:r>
+              <w:rPr>
+                <w:rFonts w:hint="eastAsia"/>
+              </w:rPr>
+              <w:t xml:space="preserve">内容</w:t>
+            </w:r>
+          </w:p>
+        </w:tc>
+      </w:tr>
+      <w:tr>
+        <w:tc>
+          <w:tcPr/>
+          <w:p>
+            <w:pPr>
+              <w:pStyle w:val="Compact"/>
+            </w:pPr>
+            <w:r>
+              <w:t xml:space="preserve">SoC</w:t>
+            </w:r>
+          </w:p>
+        </w:tc>
+        <w:tc>
+          <w:tcPr/>
+          <w:p>
+            <w:pPr>
+              <w:pStyle w:val="Compact"/>
+            </w:pPr>
+            <w:r>
+              <w:rPr>
+                <w:rFonts w:hint="eastAsia"/>
+              </w:rPr>
+              <w:t xml:space="preserve">ESP32-S3R8（Xtensa®</w:t>
+            </w:r>
+            <w:r>
+              <w:t xml:space="preserve"> LX7 </w:t>
+            </w:r>
+            <w:r>
+              <w:rPr>
+                <w:rFonts w:hint="eastAsia"/>
+              </w:rPr>
+              <w:t xml:space="preserve">デュアルコア、最大240MHz）</w:t>
+            </w:r>
+          </w:p>
+        </w:tc>
+      </w:tr>
+      <w:tr>
+        <w:tc>
+          <w:tcPr/>
+          <w:p>
+            <w:pPr>
+              <w:pStyle w:val="Compact"/>
+            </w:pPr>
+            <w:r>
+              <w:t xml:space="preserve">メモリ</w:t>
+            </w:r>
+          </w:p>
+        </w:tc>
+        <w:tc>
+          <w:tcPr/>
+          <w:p>
+            <w:pPr>
+              <w:pStyle w:val="Compact"/>
+            </w:pPr>
+            <w:r>
+              <w:t xml:space="preserve">Flash </w:t>
+            </w:r>
+            <w:r>
+              <w:rPr>
+                <w:rFonts w:hint="eastAsia"/>
+              </w:rPr>
+              <w:t xml:space="preserve">16MB／PSRAM</w:t>
+            </w:r>
+            <w:r>
+              <w:t xml:space="preserve"> </w:t>
+            </w:r>
+            <w:r>
+              <w:rPr>
+                <w:rFonts w:hint="eastAsia"/>
+              </w:rPr>
+              <w:t xml:space="preserve">8MB（Octal）</w:t>
+            </w:r>
+          </w:p>
+        </w:tc>
+      </w:tr>
+      <w:tr>
+        <w:tc>
+          <w:tcPr/>
+          <w:p>
+            <w:pPr>
+              <w:pStyle w:val="Compact"/>
+            </w:pPr>
+            <w:r>
+              <w:rPr>
+                <w:rFonts w:hint="eastAsia"/>
+              </w:rPr>
+              <w:t xml:space="preserve">通信</w:t>
+            </w:r>
+          </w:p>
+        </w:tc>
+        <w:tc>
+          <w:tcPr/>
+          <w:p>
+            <w:pPr>
+              <w:pStyle w:val="Compact"/>
+            </w:pPr>
+            <w:r>
+              <w:t xml:space="preserve">2.4GHz Wi-Fi</w:t>
+            </w:r>
+          </w:p>
+        </w:tc>
+      </w:tr>
+      <w:tr>
+        <w:tc>
+          <w:tcPr/>
+          <w:p>
+            <w:pPr>
+              <w:pStyle w:val="Compact"/>
+            </w:pPr>
+            <w:r>
+              <w:t xml:space="preserve">ディスプレイ</w:t>
+            </w:r>
+          </w:p>
+        </w:tc>
+        <w:tc>
+          <w:tcPr/>
+          <w:p>
+            <w:pPr>
+              <w:pStyle w:val="Compact"/>
+            </w:pPr>
+            <w:r>
+              <w:rPr>
+                <w:rFonts w:hint="eastAsia"/>
+              </w:rPr>
+              <w:t xml:space="preserve">4型</w:t>
+            </w:r>
+            <w:r>
+              <w:t xml:space="preserve"> E Ink Spectra 6 </w:t>
+            </w:r>
+            <w:r>
+              <w:rPr>
+                <w:rFonts w:hint="eastAsia"/>
+              </w:rPr>
+              <w:t xml:space="preserve">フルカラー、400×600、更新約15〜30秒</w:t>
+            </w:r>
+          </w:p>
+        </w:tc>
+      </w:tr>
+      <w:tr>
+        <w:tc>
+          <w:tcPr/>
+          <w:p>
+            <w:pPr>
+              <w:pStyle w:val="Compact"/>
+            </w:pPr>
+            <w:r>
+              <w:t xml:space="preserve">ボタン</w:t>
+            </w:r>
+          </w:p>
+        </w:tc>
+        <w:tc>
+          <w:tcPr/>
+          <w:p>
+            <w:pPr>
+              <w:pStyle w:val="Compact"/>
+            </w:pPr>
+            <w:r>
+              <w:rPr>
+                <w:rFonts w:hint="eastAsia"/>
+              </w:rPr>
+              <w:t xml:space="preserve">ユーザーボタンA/B/Cの3つ＋電源ボタン1つ</w:t>
+            </w:r>
+          </w:p>
+        </w:tc>
+      </w:tr>
+      <w:tr>
+        <w:tc>
+          <w:tcPr/>
+          <w:p>
+            <w:pPr>
+              <w:pStyle w:val="Compact"/>
+            </w:pPr>
+            <w:r>
+              <w:t xml:space="preserve">センサー</w:t>
+            </w:r>
+          </w:p>
+        </w:tc>
+        <w:tc>
+          <w:tcPr/>
+          <w:p>
+            <w:pPr>
+              <w:pStyle w:val="Compact"/>
+            </w:pPr>
+            <w:r>
+              <w:rPr>
+                <w:rFonts w:hint="eastAsia"/>
+              </w:rPr>
+              <w:t xml:space="preserve">SHT40（温湿度）、RX8130CE（RTC）</w:t>
+            </w:r>
+          </w:p>
+        </w:tc>
+      </w:tr>
+      <w:tr>
+        <w:tc>
+          <w:tcPr/>
+          <w:p>
+            <w:pPr>
+              <w:pStyle w:val="Compact"/>
+            </w:pPr>
+            <w:r>
+              <w:t xml:space="preserve">オーディオ</w:t>
+            </w:r>
+          </w:p>
+        </w:tc>
+        <w:tc>
+          <w:tcPr/>
+          <w:p>
+            <w:pPr>
+              <w:pStyle w:val="Compact"/>
+            </w:pPr>
+            <w:r>
+              <w:rPr>
+                <w:rFonts w:hint="eastAsia"/>
+              </w:rPr>
+              <w:t xml:space="preserve">ES8311コーデック＋ES7210マイク(AEC)＋1Wスピーカー(AW8737A)</w:t>
+            </w:r>
+          </w:p>
+        </w:tc>
+      </w:tr>
+      <w:tr>
+        <w:tc>
+          <w:tcPr/>
+          <w:p>
+            <w:pPr>
+              <w:pStyle w:val="Compact"/>
+            </w:pPr>
+            <w:r>
+              <w:rPr>
+                <w:rFonts w:hint="eastAsia"/>
+              </w:rPr>
+              <w:t xml:space="preserve">LED・赤外線</w:t>
+            </w:r>
+          </w:p>
+        </w:tc>
+        <w:tc>
+          <w:tcPr/>
+          <w:p>
+            <w:pPr>
+              <w:pStyle w:val="Compact"/>
+            </w:pPr>
+            <w:r>
+              <w:t xml:space="preserve">RGB </w:t>
+            </w:r>
+            <w:r>
+              <w:rPr>
+                <w:rFonts w:hint="eastAsia"/>
+              </w:rPr>
+              <w:t xml:space="preserve">LED×2、IR送信×1</w:t>
+            </w:r>
+          </w:p>
+        </w:tc>
+      </w:tr>
+      <w:tr>
+        <w:tc>
+          <w:tcPr/>
+          <w:p>
+            <w:pPr>
+              <w:pStyle w:val="Compact"/>
+            </w:pPr>
+            <w:r>
+              <w:t xml:space="preserve">バッテリー</w:t>
+            </w:r>
+          </w:p>
+        </w:tc>
+        <w:tc>
+          <w:tcPr/>
+          <w:p>
+            <w:pPr>
+              <w:pStyle w:val="Compact"/>
+            </w:pPr>
+            <w:r>
+              <w:rPr>
+                <w:rFonts w:hint="eastAsia"/>
+              </w:rPr>
+              <w:t xml:space="preserve">1250mAh（待機時92.53µA／フル動作時211.97mA）</w:t>
+            </w:r>
+          </w:p>
+        </w:tc>
+      </w:tr>
+      <w:tr>
+        <w:tc>
+          <w:tcPr/>
+          <w:p>
+            <w:pPr>
+              <w:pStyle w:val="Compact"/>
+            </w:pPr>
+            <w:r>
+              <w:t xml:space="preserve">ストレージ</w:t>
+            </w:r>
+          </w:p>
+        </w:tc>
+        <w:tc>
+          <w:tcPr/>
+          <w:p>
+            <w:pPr>
+              <w:pStyle w:val="Compact"/>
+            </w:pPr>
+            <w:r>
+              <w:t xml:space="preserve">microSDスロット</w:t>
+            </w:r>
+          </w:p>
+        </w:tc>
+      </w:tr>
+      <w:tr>
+        <w:tc>
+          <w:tcPr/>
+          <w:p>
+            <w:pPr>
+              <w:pStyle w:val="Compact"/>
+            </w:pPr>
+            <w:r>
+              <w:t xml:space="preserve">ポート</w:t>
+            </w:r>
+          </w:p>
+        </w:tc>
+        <w:tc>
+          <w:tcPr/>
+          <w:p>
+            <w:pPr>
+              <w:pStyle w:val="Compact"/>
+            </w:pPr>
+            <w:r>
+              <w:t xml:space="preserve">USB </w:t>
+            </w:r>
+            <w:r>
+              <w:rPr>
+                <w:rFonts w:hint="eastAsia"/>
+              </w:rPr>
+              <w:t xml:space="preserve">Type-C×1（DC5V）、Grove(HY2.0-4P)拡張ポート×1</w:t>
+            </w:r>
+          </w:p>
+        </w:tc>
+      </w:tr>
+      <w:tr>
+        <w:tc>
+          <w:tcPr/>
+          <w:p>
+            <w:pPr>
+              <w:pStyle w:val="Compact"/>
+            </w:pPr>
+            <w:r>
+              <w:rPr>
+                <w:rFonts w:hint="eastAsia"/>
+              </w:rPr>
+              <w:t xml:space="preserve">サイズ・重量</w:t>
+            </w:r>
+          </w:p>
+        </w:tc>
+        <w:tc>
+          <w:tcPr/>
+          <w:p>
+            <w:pPr>
+              <w:pStyle w:val="Compact"/>
+            </w:pPr>
+            <w:r>
+              <w:t xml:space="preserve">70.8 × 103.9 × </w:t>
+            </w:r>
+            <w:r>
+              <w:rPr>
+                <w:rFonts w:hint="eastAsia"/>
+              </w:rPr>
+              <w:t xml:space="preserve">8.5mm／73.3g</w:t>
+            </w:r>
+          </w:p>
+        </w:tc>
+      </w:tr>
+    </w:tbl>
+    <w:p>
+      <w:pPr>
+        <w:pStyle w:val="BodyText"/>
+      </w:pPr>
+      <w:r>
+        <w:rPr>
+          <w:rFonts w:hint="eastAsia"/>
+          <w:b/>
+          <w:bCs/>
+        </w:rPr>
+        <w:t xml:space="preserve">本書での使い方との対応</w:t>
+      </w:r>
+      <w:r>
+        <w:rPr>
+          <w:rFonts w:hint="eastAsia"/>
+        </w:rPr>
+        <w:t xml:space="preserve">：</w:t>
+      </w:r>
+      <w:r>
+        <w:rPr>
+          <w:rStyle w:val="VerbatimChar"/>
+        </w:rPr>
+        <w:t xml:space="preserve">m5paper.ino</w:t>
+      </w:r>
+      <w:r>
+        <w:rPr>
+          <w:rFonts w:hint="eastAsia"/>
+        </w:rPr>
+        <w:t xml:space="preserve">はボタンA/Bをギャラリーの前へ/次への送りに、ボタンCを「表示中の写真を再印刷」に割り当てています（7.3節）。電源ボタンは単押しで電源ON、長押しでOFFという機器本来の挙動のままです。SHT40・RX8130CE・オーディオコーデック・RGB</w:t>
+      </w:r>
+      <w:r>
+        <w:t xml:space="preserve"> </w:t>
+      </w:r>
+      <w:r>
+        <w:rPr>
+          <w:rFonts w:hint="eastAsia"/>
+        </w:rPr>
+        <w:t xml:space="preserve">LED・IR送信・microSDスロットは、いずれも本書のスケッチでは未使用です（ビープ音の再生にはES8311コーデック経由のスピーカーを使っています）。E</w:t>
+      </w:r>
+      <w:r>
+        <w:t xml:space="preserve"> Ink Spectra </w:t>
+      </w:r>
+      <w:r>
+        <w:rPr>
+          <w:rFonts w:hint="eastAsia"/>
+        </w:rPr>
+        <w:t xml:space="preserve">6ディスプレイは6色対応ですが、印刷画像自体がすでに1bpp白黒ビットマップのため、本書ではWHITE/BLACKの2色しか使っていません（7.4節）。</w:t>
       </w:r>
     </w:p>
     <w:p>
@@ -4535,8 +6690,9 @@
         <w:t xml:space="preserve">Blanchon氏）の3つを使用します。</w:t>
       </w:r>
     </w:p>
-    <w:bookmarkEnd w:id="26"/>
-    <w:bookmarkStart w:id="27" w:name="部品リストのまとめ"/>
+    <w:bookmarkEnd w:id="41"/>
+    <w:bookmarkEnd w:id="42"/>
+    <w:bookmarkStart w:id="43" w:name="部品リストのまとめ"/>
     <w:p>
       <w:pPr>
         <w:pStyle w:val="Heading3"/>
@@ -4751,9 +6907,9 @@
         </w:pict>
       </w:r>
     </w:p>
-    <w:bookmarkEnd w:id="27"/>
-    <w:bookmarkEnd w:id="28"/>
-    <w:bookmarkStart w:id="37" w:name="第4章-開発環境を準備する"/>
+    <w:bookmarkEnd w:id="43"/>
+    <w:bookmarkEnd w:id="44"/>
+    <w:bookmarkStart w:id="53" w:name="第4章-開発環境を準備する"/>
     <w:p>
       <w:pPr>
         <w:pStyle w:val="Heading2"/>
@@ -4907,7 +7063,7 @@
         </w:tc>
       </w:tr>
     </w:tbl>
-    <w:bookmarkStart w:id="30" w:name="platformioのセットアップatom-lite用推奨"/>
+    <w:bookmarkStart w:id="46" w:name="platformioのセットアップatom-lite用推奨"/>
     <w:p>
       <w:pPr>
         <w:pStyle w:val="Heading3"/>
@@ -4985,7 +7141,7 @@
           <w:numId w:val="1013"/>
         </w:numPr>
       </w:pPr>
-      <w:hyperlink r:id="rId29">
+      <w:hyperlink r:id="rId45">
         <w:r>
           <w:rPr>
             <w:rStyle w:val="Hyperlink"/>
@@ -5291,8 +7447,8 @@
         <w:t xml:space="preserve">missing」という表示になってしまいます。両方を必ずセットで実行する習慣をつけましょう。</w:t>
       </w:r>
     </w:p>
-    <w:bookmarkEnd w:id="30"/>
-    <w:bookmarkStart w:id="33" w:name="m5stackシリーズをarduino-ideで利用するための設定方法"/>
+    <w:bookmarkEnd w:id="46"/>
+    <w:bookmarkStart w:id="49" w:name="m5stackシリーズをarduino-ideで利用するための設定方法"/>
     <w:p>
       <w:pPr>
         <w:pStyle w:val="Heading3"/>
@@ -5395,7 +7551,7 @@
       <w:pPr>
         <w:pStyle w:val="BodyText"/>
       </w:pPr>
-      <w:hyperlink r:id="rId31">
+      <w:hyperlink r:id="rId47">
         <w:r>
           <w:rPr>
             <w:rStyle w:val="Hyperlink"/>
@@ -6875,7 +9031,7 @@
         </w:rPr>
         <w:t xml:space="preserve">2.x系では</w:t>
       </w:r>
-      <w:hyperlink r:id="rId32">
+      <w:hyperlink r:id="rId48">
         <w:r>
           <w:rPr>
             <w:rStyle w:val="Hyperlink"/>
@@ -7153,8 +9309,8 @@
         <w:t xml:space="preserve">：esp32ボードパッケージのバージョンと、インストールしたM5Stack公式ライブラリのバージョンの組み合わせが対応していない可能性があります。ライブラリのGitHubリポジトリのREADMEやリリースノートで、動作確認済みのesp32パッケージバージョンを確認してください。</w:t>
       </w:r>
     </w:p>
-    <w:bookmarkEnd w:id="33"/>
-    <w:bookmarkStart w:id="35" w:name="maixpy-ideのセットアップm5stickv用"/>
+    <w:bookmarkEnd w:id="49"/>
+    <w:bookmarkStart w:id="51" w:name="maixpy-ideのセットアップm5stickv用"/>
     <w:p>
       <w:pPr>
         <w:pStyle w:val="Heading3"/>
@@ -7201,7 +9357,7 @@
           <w:numId w:val="1015"/>
         </w:numPr>
       </w:pPr>
-      <w:hyperlink r:id="rId34">
+      <w:hyperlink r:id="rId50">
         <w:r>
           <w:rPr>
             <w:rStyle w:val="Hyperlink"/>
@@ -7302,8 +9458,8 @@
         <w:t xml:space="preserve">として保存するという流れになります。</w:t>
       </w:r>
     </w:p>
-    <w:bookmarkEnd w:id="35"/>
-    <w:bookmarkStart w:id="36" w:name="開発環境準備のチェックリスト"/>
+    <w:bookmarkEnd w:id="51"/>
+    <w:bookmarkStart w:id="52" w:name="開発環境準備のチェックリスト"/>
     <w:p>
       <w:pPr>
         <w:pStyle w:val="Heading3"/>
@@ -7461,9 +9617,9 @@
         </w:pict>
       </w:r>
     </w:p>
-    <w:bookmarkEnd w:id="36"/>
-    <w:bookmarkEnd w:id="37"/>
-    <w:bookmarkStart w:id="42" w:name="第5章-atom-printer-kitを組み立てる"/>
+    <w:bookmarkEnd w:id="52"/>
+    <w:bookmarkEnd w:id="53"/>
+    <w:bookmarkStart w:id="58" w:name="第5章-atom-printer-kitを組み立てる"/>
     <w:p>
       <w:pPr>
         <w:pStyle w:val="Heading2"/>
@@ -7504,7 +9660,7 @@
         <w:t xml:space="preserve">Kitのセットアップを行います。この章が終わると、iPhoneのブラウザから写真をアップロードして印刷できる、単体でも動くシステムが完成します。</w:t>
       </w:r>
     </w:p>
-    <w:bookmarkStart w:id="38" w:name="配線を確認する"/>
+    <w:bookmarkStart w:id="54" w:name="配線を確認する"/>
     <w:p>
       <w:pPr>
         <w:pStyle w:val="Heading3"/>
@@ -7686,8 +9842,8 @@
         <w:t xml:space="preserve">Lite本体へのUSB給電と、プリンターへのDC12V給電は別系統です。両方が入って初めて印刷可能な状態になります。</w:t>
       </w:r>
     </w:p>
-    <w:bookmarkEnd w:id="38"/>
-    <w:bookmarkStart w:id="39" w:name="ファームウェアを書き込む"/>
+    <w:bookmarkEnd w:id="54"/>
+    <w:bookmarkStart w:id="55" w:name="ファームウェアを書き込む"/>
     <w:p>
       <w:pPr>
         <w:pStyle w:val="Heading3"/>
@@ -7904,8 +10060,8 @@
         <w:t xml:space="preserve">フォルダの内容をLittleFSへアップロードします。</w:t>
       </w:r>
     </w:p>
-    <w:bookmarkEnd w:id="39"/>
-    <w:bookmarkStart w:id="40" w:name="初回のwi-fi設定"/>
+    <w:bookmarkEnd w:id="55"/>
+    <w:bookmarkStart w:id="56" w:name="初回のwi-fi設定"/>
     <w:p>
       <w:pPr>
         <w:pStyle w:val="Heading3"/>
@@ -8172,8 +10328,8 @@
         <w:t xml:space="preserve">Lite本体のボタンを5秒以上長押しすると、保存済みのWi-Fi設定が消去されて再起動し、再びアクセスポイントモードに戻ります。接続済みの状態から別のネットワークへ切り替えたいだけであれば、リセットせずに、後述する設定タブの「Wi-Fi設定」カードから変更できます。</w:t>
       </w:r>
     </w:p>
-    <w:bookmarkEnd w:id="40"/>
-    <w:bookmarkStart w:id="41" w:name="web-uim5webページの使い方"/>
+    <w:bookmarkEnd w:id="56"/>
+    <w:bookmarkStart w:id="57" w:name="web-uim5webページの使い方"/>
     <w:p>
       <w:pPr>
         <w:pStyle w:val="Heading3"/>
@@ -8753,9 +10909,9 @@
         </w:pict>
       </w:r>
     </w:p>
-    <w:bookmarkEnd w:id="41"/>
-    <w:bookmarkEnd w:id="42"/>
-    <w:bookmarkStart w:id="53" w:name="第6章-m5stickvカメラ連携を構築する"/>
+    <w:bookmarkEnd w:id="57"/>
+    <w:bookmarkEnd w:id="58"/>
+    <w:bookmarkStart w:id="69" w:name="第6章-m5stickvカメラ連携を構築する"/>
     <w:p>
       <w:pPr>
         <w:pStyle w:val="Heading2"/>
@@ -8819,7 +10975,7 @@
         <w:t xml:space="preserve">で実現されています。</w:t>
       </w:r>
     </w:p>
-    <w:bookmarkStart w:id="43" w:name="配線"/>
+    <w:bookmarkStart w:id="59" w:name="配線"/>
     <w:p>
       <w:pPr>
         <w:pStyle w:val="Heading3"/>
@@ -9069,8 +11225,8 @@
         </w:tc>
       </w:tr>
     </w:tbl>
-    <w:bookmarkEnd w:id="43"/>
-    <w:bookmarkStart w:id="44" w:name="m5stickv側スクリプトの書き込み"/>
+    <w:bookmarkEnd w:id="59"/>
+    <w:bookmarkStart w:id="60" w:name="m5stickv側スクリプトの書き込み"/>
     <w:p>
       <w:pPr>
         <w:pStyle w:val="Heading3"/>
@@ -9296,8 +11452,8 @@
         <w:t xml:space="preserve">です（通常のファームウェア書き込みだけで対応済みです）。</w:t>
       </w:r>
     </w:p>
-    <w:bookmarkEnd w:id="44"/>
-    <w:bookmarkStart w:id="45" w:name="撮影の流れとledの合図"/>
+    <w:bookmarkEnd w:id="60"/>
+    <w:bookmarkStart w:id="61" w:name="撮影の流れとledの合図"/>
     <w:p>
       <w:pPr>
         <w:pStyle w:val="Heading3"/>
@@ -9533,8 +11689,8 @@
         <w:t xml:space="preserve">ファイルが見つからない・読み込めないといった状況でもエラーで処理を止めることはなく、無音のまま撮影・送信が続行されます。</w:t>
       </w:r>
     </w:p>
-    <w:bookmarkEnd w:id="45"/>
-    <w:bookmarkStart w:id="46" w:name="カメラの向きの補正"/>
+    <w:bookmarkEnd w:id="61"/>
+    <w:bookmarkStart w:id="62" w:name="カメラの向きの補正"/>
     <w:p>
       <w:pPr>
         <w:pStyle w:val="Heading3"/>
@@ -9820,8 +11976,8 @@
         <w:t xml:space="preserve">内の座標変換式を直接書き換えます。式の導出根拠は関数のdocstringに記載されています。</w:t>
       </w:r>
     </w:p>
-    <w:bookmarkEnd w:id="46"/>
-    <w:bookmarkStart w:id="47" w:name="顔検出のしくみ"/>
+    <w:bookmarkEnd w:id="62"/>
+    <w:bookmarkStart w:id="63" w:name="顔検出のしくみ"/>
     <w:p>
       <w:pPr>
         <w:pStyle w:val="Heading3"/>
@@ -10003,8 +12159,8 @@
         <w:t xml:space="preserve">現時点では顔以外の判定（物体分類など）は実装されていませんが、K210のKPU機能を使った物体分類モデルを追加すれば、同じラベル欄に乗せる形で拡張できる設計になっています。</w:t>
       </w:r>
     </w:p>
-    <w:bookmarkEnd w:id="47"/>
-    <w:bookmarkStart w:id="48" w:name="印刷時のキャプション時刻検出ラベル"/>
+    <w:bookmarkEnd w:id="63"/>
+    <w:bookmarkStart w:id="64" w:name="印刷時のキャプション時刻検出ラベル"/>
     <w:p>
       <w:pPr>
         <w:pStyle w:val="Heading3"/>
@@ -10190,8 +12346,8 @@
         <w:t xml:space="preserve">画像の高さがキャプション帯（18ドット）以下という極端に小さい写真の場合は、キャプション自体が省略されます。</w:t>
       </w:r>
     </w:p>
-    <w:bookmarkEnd w:id="48"/>
-    <w:bookmarkStart w:id="49" w:name="web上での確認印刷モード"/>
+    <w:bookmarkEnd w:id="64"/>
+    <w:bookmarkStart w:id="65" w:name="web上での確認印刷モード"/>
     <w:p>
       <w:pPr>
         <w:pStyle w:val="Heading3"/>
@@ -10473,8 +12629,8 @@
         <w:t xml:space="preserve">、M5StickV側から届いたグレースケール画像をディザリング変換する前に適用されます。既に受信・表示中の1枚には遡って反映されません。</w:t>
       </w:r>
     </w:p>
-    <w:bookmarkEnd w:id="49"/>
-    <w:bookmarkStart w:id="50" w:name="atom-lite本体のrgb-ledによる状態表示"/>
+    <w:bookmarkEnd w:id="65"/>
+    <w:bookmarkStart w:id="66" w:name="atom-lite本体のrgb-ledによる状態表示"/>
     <w:p>
       <w:pPr>
         <w:pStyle w:val="Heading3"/>
@@ -10653,8 +12809,8 @@
         <w:t xml:space="preserve">Lite本体のLEDを見るだけで「再印刷できる写真がある」「確認待ちの写真がある」という状態を把握できます。</w:t>
       </w:r>
     </w:p>
-    <w:bookmarkEnd w:id="50"/>
-    <w:bookmarkStart w:id="51" w:name="通信プロトコルの詳細"/>
+    <w:bookmarkEnd w:id="66"/>
+    <w:bookmarkStart w:id="67" w:name="通信プロトコルの詳細"/>
     <w:p>
       <w:pPr>
         <w:pStyle w:val="Heading3"/>
@@ -10907,8 +13063,8 @@
         <w:t xml:space="preserve">このプロトコル設計を読み解くと、「未検証のデータを不用意に印刷してしまわない」という安全性への配慮が随所に見られます。</w:t>
       </w:r>
     </w:p>
-    <w:bookmarkEnd w:id="51"/>
-    <w:bookmarkStart w:id="52" w:name="既知の注意点"/>
+    <w:bookmarkEnd w:id="67"/>
+    <w:bookmarkStart w:id="68" w:name="既知の注意点"/>
     <w:p>
       <w:pPr>
         <w:pStyle w:val="Heading3"/>
@@ -11346,9 +13502,9 @@
         </w:pict>
       </w:r>
     </w:p>
-    <w:bookmarkEnd w:id="52"/>
-    <w:bookmarkEnd w:id="53"/>
-    <w:bookmarkStart w:id="58" w:name="第7章-m5papercolorで写真を確認印刷する"/>
+    <w:bookmarkEnd w:id="68"/>
+    <w:bookmarkEnd w:id="69"/>
+    <w:bookmarkStart w:id="74" w:name="第7章-m5papercolorで写真を確認印刷する"/>
     <w:p>
       <w:pPr>
         <w:pStyle w:val="Heading2"/>
@@ -11380,7 +13536,7 @@
         <w:t xml:space="preserve">本章では、iPhoneのブラウザを使わずに、M5PaperColor単体でギャラリー（M5StickVカメラ撮影・アップロード両方の保存履歴）を確認・印刷できるようにします。</w:t>
       </w:r>
     </w:p>
-    <w:bookmarkStart w:id="54" w:name="m5papercolorの役割"/>
+    <w:bookmarkStart w:id="70" w:name="m5papercolorの役割"/>
     <w:p>
       <w:pPr>
         <w:pStyle w:val="Heading3"/>
@@ -11510,8 +13666,8 @@
         <w:t xml:space="preserve">Lite側を変更せずに新しい入り口を増やせる――が実際に体現されています。</w:t>
       </w:r>
     </w:p>
-    <w:bookmarkEnd w:id="54"/>
-    <w:bookmarkStart w:id="55" w:name="導入手順"/>
+    <w:bookmarkEnd w:id="70"/>
+    <w:bookmarkStart w:id="71" w:name="導入手順"/>
     <w:p>
       <w:pPr>
         <w:pStyle w:val="Heading3"/>
@@ -11758,8 +13914,8 @@
         <w:t xml:space="preserve">Liteと同じWi-Fiネットワークを選んでパスワードを入力すると、本機のAPは終了して指定したネットワークにクライアントとして参加します。設定はNVSに保存され、次回起動時から自動的にそのネットワークへ接続します。</w:t>
       </w:r>
     </w:p>
-    <w:bookmarkEnd w:id="55"/>
-    <w:bookmarkStart w:id="56" w:name="使い方"/>
+    <w:bookmarkEnd w:id="71"/>
+    <w:bookmarkStart w:id="72" w:name="使い方"/>
     <w:p>
       <w:pPr>
         <w:pStyle w:val="Heading3"/>
@@ -11925,8 +14081,8 @@
         <w:t xml:space="preserve">Lite本体のNVSに保存され、M5PaperColor側は5秒おきにこの設定自体を確認しているため、M5PaperColorを再起動しなくても切り替えがすぐに反映されます。いずれの方式でも、選択中の写真は（新しい写真が増えて順番がずれても）IDで追跡され続けます。フラッシュ本体からの削除は現状m5webページ側でのみ行えます。</w:t>
       </w:r>
     </w:p>
-    <w:bookmarkEnd w:id="56"/>
-    <w:bookmarkStart w:id="57" w:name="既知の注意点-1"/>
+    <w:bookmarkEnd w:id="72"/>
+    <w:bookmarkStart w:id="73" w:name="既知の注意点-1"/>
     <w:p>
       <w:pPr>
         <w:pStyle w:val="Heading3"/>
@@ -12165,9 +14321,9 @@
         </w:pict>
       </w:r>
     </w:p>
-    <w:bookmarkEnd w:id="57"/>
-    <w:bookmarkEnd w:id="58"/>
-    <w:bookmarkStart w:id="64" w:name="第8章-プログラムから使うweb-api"/>
+    <w:bookmarkEnd w:id="73"/>
+    <w:bookmarkEnd w:id="74"/>
+    <w:bookmarkStart w:id="80" w:name="第8章-プログラムから使うweb-api"/>
     <w:p>
       <w:pPr>
         <w:pStyle w:val="Heading2"/>
@@ -12253,7 +14409,7 @@
         <w:t xml:space="preserve">（またはIPアドレス）です。</w:t>
       </w:r>
     </w:p>
-    <w:bookmarkStart w:id="59" w:name="apiリファレンス"/>
+    <w:bookmarkStart w:id="75" w:name="apiリファレンス"/>
     <w:p>
       <w:pPr>
         <w:pStyle w:val="Heading3"/>
@@ -13744,8 +15900,8 @@
         </w:tc>
       </w:tr>
     </w:tbl>
-    <w:bookmarkEnd w:id="59"/>
-    <w:bookmarkStart w:id="60" w:name="curlでの基本操作"/>
+    <w:bookmarkEnd w:id="75"/>
+    <w:bookmarkStart w:id="76" w:name="curlでの基本操作"/>
     <w:p>
       <w:pPr>
         <w:pStyle w:val="Heading3"/>
@@ -14047,8 +16203,8 @@
         <w:t xml:space="preserve">/api/status"</w:t>
       </w:r>
     </w:p>
-    <w:bookmarkEnd w:id="60"/>
-    <w:bookmarkStart w:id="61" w:name="pythonから画像を印刷する"/>
+    <w:bookmarkEnd w:id="76"/>
+    <w:bookmarkStart w:id="77" w:name="pythonから画像を印刷する"/>
     <w:p>
       <w:pPr>
         <w:pStyle w:val="Heading3"/>
@@ -15074,8 +17230,8 @@
         <w:t xml:space="preserve">このAPIを応用すれば、例えば「定期的に天気予報を取得して印刷する」「チャットボットの返答を印刷する」といった、写真以外の自動化にも展開できます。</w:t>
       </w:r>
     </w:p>
-    <w:bookmarkEnd w:id="61"/>
-    <w:bookmarkStart w:id="63" w:name="俳句生成openai連携"/>
+    <w:bookmarkEnd w:id="77"/>
+    <w:bookmarkStart w:id="79" w:name="俳句生成openai連携"/>
     <w:p>
       <w:pPr>
         <w:pStyle w:val="Heading3"/>
@@ -15467,7 +17623,7 @@
         </w:rPr>
         <w:t xml:space="preserve">利用の前提として、設定タブの「OpenAI設定」カードでAPIキーを登録しておく必要があります（</w:t>
       </w:r>
-      <w:hyperlink r:id="rId62">
+      <w:hyperlink r:id="rId78">
         <w:r>
           <w:rPr>
             <w:rStyle w:val="Hyperlink"/>
@@ -15926,9 +18082,9 @@
         </w:pict>
       </w:r>
     </w:p>
-    <w:bookmarkEnd w:id="63"/>
-    <w:bookmarkEnd w:id="64"/>
-    <w:bookmarkStart w:id="68" w:name="第9章-印刷のしくみを覗く"/>
+    <w:bookmarkEnd w:id="79"/>
+    <w:bookmarkEnd w:id="80"/>
+    <w:bookmarkStart w:id="84" w:name="第9章-印刷のしくみを覗く"/>
     <w:p>
       <w:pPr>
         <w:pStyle w:val="Heading2"/>
@@ -15960,7 +18116,7 @@
         <w:t xml:space="preserve">ここまでの章で「印刷される」という結果は何度も登場しましたが、本章ではその裏側にある技術――白黒変換のアルゴリズムと、プリンターへの命令の送り方――を掘り下げます。</w:t>
       </w:r>
     </w:p>
-    <w:bookmarkStart w:id="65" w:name="誤差拡散floydsteinbergとは何か"/>
+    <w:bookmarkStart w:id="81" w:name="誤差拡散floydsteinbergとは何か"/>
     <w:p>
       <w:pPr>
         <w:pStyle w:val="Heading3"/>
@@ -16086,8 +18242,8 @@
         <w:t xml:space="preserve">する実装になっています。</w:t>
       </w:r>
     </w:p>
-    <w:bookmarkEnd w:id="65"/>
-    <w:bookmarkStart w:id="66" w:name="プリンターへの命令方式escpos風コマンド"/>
+    <w:bookmarkEnd w:id="81"/>
+    <w:bookmarkStart w:id="82" w:name="プリンターへの命令方式escpos風コマンド"/>
     <w:p>
       <w:pPr>
         <w:pStyle w:val="Heading3"/>
@@ -16195,8 +18351,8 @@
         <w:t xml:space="preserve">Lite側、QRコードの生成はプリンター側、という役割分担になっています。</w:t>
       </w:r>
     </w:p>
-    <w:bookmarkEnd w:id="66"/>
-    <w:bookmarkStart w:id="67" w:name="印刷サイズの制限"/>
+    <w:bookmarkEnd w:id="82"/>
+    <w:bookmarkStart w:id="83" w:name="印刷サイズの制限"/>
     <w:p>
       <w:pPr>
         <w:pStyle w:val="Heading3"/>
@@ -16295,9 +18451,9 @@
         </w:pict>
       </w:r>
     </w:p>
-    <w:bookmarkEnd w:id="67"/>
-    <w:bookmarkEnd w:id="68"/>
-    <w:bookmarkStart w:id="76" w:name="第10章-トラブルシューティング"/>
+    <w:bookmarkEnd w:id="83"/>
+    <w:bookmarkEnd w:id="84"/>
+    <w:bookmarkStart w:id="92" w:name="第10章-トラブルシューティング"/>
     <w:p>
       <w:pPr>
         <w:pStyle w:val="Heading2"/>
@@ -16323,7 +18479,7 @@
         <w:t xml:space="preserve">実際に手を動かす中でよく遭遇するトラブルと、その対処法をまとめます。</w:t>
       </w:r>
     </w:p>
-    <w:bookmarkStart w:id="69" w:name="atom-liteが起動しない書き込みできない"/>
+    <w:bookmarkStart w:id="85" w:name="atom-liteが起動しない書き込みできない"/>
     <w:p>
       <w:pPr>
         <w:pStyle w:val="Heading3"/>
@@ -16407,8 +18563,8 @@
         <w:t xml:space="preserve">書き込み中にエラーが出る場合、ボード上のリセットボタンを押しながら書き込みを開始する、といった機種特有の作法が必要な場合があります。</w:t>
       </w:r>
     </w:p>
-    <w:bookmarkEnd w:id="69"/>
-    <w:bookmarkStart w:id="70" w:name="httpm5web.localにアクセスできない"/>
+    <w:bookmarkEnd w:id="85"/>
+    <w:bookmarkStart w:id="86" w:name="httpm5web.localにアクセスできない"/>
     <w:p>
       <w:pPr>
         <w:pStyle w:val="Heading3"/>
@@ -16531,8 +18687,8 @@
         <w:t xml:space="preserve">（またはLittleFSへのアップロード）を実行し忘れています。第5章の手順を再確認してください。</w:t>
       </w:r>
     </w:p>
-    <w:bookmarkEnd w:id="70"/>
-    <w:bookmarkStart w:id="71" w:name="プリンターが反応しない印刷ボタンを押しても何も起きない"/>
+    <w:bookmarkEnd w:id="86"/>
+    <w:bookmarkStart w:id="87" w:name="プリンターが反応しない印刷ボタンを押しても何も起きない"/>
     <w:p>
       <w:pPr>
         <w:pStyle w:val="Heading3"/>
@@ -16625,8 +18781,8 @@
         <w:t xml:space="preserve">UIを介さずに印刷できるか切り分けてみてください。</w:t>
       </w:r>
     </w:p>
-    <w:bookmarkEnd w:id="71"/>
-    <w:bookmarkStart w:id="72" w:name="m5stickvからatom-liteに写真が届かない"/>
+    <w:bookmarkEnd w:id="87"/>
+    <w:bookmarkStart w:id="88" w:name="m5stickvからatom-liteに写真が届かない"/>
     <w:p>
       <w:pPr>
         <w:pStyle w:val="Heading3"/>
@@ -16707,8 +18863,8 @@
         <w:t xml:space="preserve">IDEのシリアルコンソールで、M5StickV側のログにエラーが出ていないか確認してください。</w:t>
       </w:r>
     </w:p>
-    <w:bookmarkEnd w:id="72"/>
-    <w:bookmarkStart w:id="73" w:name="顔検出が効かないクラッシュする"/>
+    <w:bookmarkEnd w:id="88"/>
+    <w:bookmarkStart w:id="89" w:name="顔検出が効かないクラッシュする"/>
     <w:p>
       <w:pPr>
         <w:pStyle w:val="Heading3"/>
@@ -16813,8 +18969,8 @@
         <w:t xml:space="preserve">パラメータを調整してください。</w:t>
       </w:r>
     </w:p>
-    <w:bookmarkEnd w:id="73"/>
-    <w:bookmarkStart w:id="74" w:name="撮った写真の向きがおかしい"/>
+    <w:bookmarkEnd w:id="89"/>
+    <w:bookmarkStart w:id="90" w:name="撮った写真の向きがおかしい"/>
     <w:p>
       <w:pPr>
         <w:pStyle w:val="Heading3"/>
@@ -16898,8 +19054,8 @@
         <w:t xml:space="preserve">版のループへの切り替えを試してください。</w:t>
       </w:r>
     </w:p>
-    <w:bookmarkEnd w:id="74"/>
-    <w:bookmarkStart w:id="75" w:name="m5papercolorの画面が更新されないボタンが反応しない音が鳴らない"/>
+    <w:bookmarkEnd w:id="90"/>
+    <w:bookmarkStart w:id="91" w:name="m5papercolorの画面が更新されないボタンが反応しない音が鳴らない"/>
     <w:p>
       <w:pPr>
         <w:pStyle w:val="Heading3"/>
@@ -17101,9 +19257,9 @@
         </w:pict>
       </w:r>
     </w:p>
-    <w:bookmarkEnd w:id="75"/>
-    <w:bookmarkEnd w:id="76"/>
-    <w:bookmarkStart w:id="81" w:name="第11章-発展カスタマイズのアイデア"/>
+    <w:bookmarkEnd w:id="91"/>
+    <w:bookmarkEnd w:id="92"/>
+    <w:bookmarkStart w:id="97" w:name="第11章-発展カスタマイズのアイデア"/>
     <w:p>
       <w:pPr>
         <w:pStyle w:val="Heading2"/>
@@ -17135,7 +19291,7 @@
         <w:t xml:space="preserve">基本のシステムが動くようになったら、次のような発展にも挑戦してみましょう。</w:t>
       </w:r>
     </w:p>
-    <w:bookmarkStart w:id="77" w:name="物体分類への拡張"/>
+    <w:bookmarkStart w:id="93" w:name="物体分類への拡張"/>
     <w:p>
       <w:pPr>
         <w:pStyle w:val="Heading3"/>
@@ -17161,8 +19317,8 @@
         <w:t xml:space="preserve">現在の顔検出のラベル機構は、「Face」という固定文字列を返す仕組みですが、設計としては任意の文字列ラベルを載せられるようになっています。K210のKPU（AI推論回路）を使った物体分類モデルを追加すれば、「Face」の代わりに「Cat」「Dog」「Cup」など、より多様なラベルを印刷キャプションに反映させることができます。</w:t>
       </w:r>
     </w:p>
-    <w:bookmarkEnd w:id="77"/>
-    <w:bookmarkStart w:id="78" w:name="印刷トリガーの多様化"/>
+    <w:bookmarkEnd w:id="93"/>
+    <w:bookmarkStart w:id="94" w:name="印刷トリガーの多様化"/>
     <w:p>
       <w:pPr>
         <w:pStyle w:val="Heading3"/>
@@ -17251,8 +19407,8 @@
         <w:t xml:space="preserve">別のセンサー（人感センサーなど）と組み合わせて、人が近づいたら自動撮影・印刷する</w:t>
       </w:r>
     </w:p>
-    <w:bookmarkEnd w:id="78"/>
-    <w:bookmarkStart w:id="79" w:name="セキュリティ面の強化"/>
+    <w:bookmarkEnd w:id="94"/>
+    <w:bookmarkStart w:id="95" w:name="セキュリティ面の強化"/>
     <w:p>
       <w:pPr>
         <w:pStyle w:val="Heading3"/>
@@ -17311,8 +19467,8 @@
         <w:t xml:space="preserve">APIには認証機構が無いため、外部に公開せず、あくまで信頼できる家庭内LANの範囲で使うことが前提です。</w:t>
       </w:r>
     </w:p>
-    <w:bookmarkEnd w:id="79"/>
-    <w:bookmarkStart w:id="80" w:name="印刷幅最大高さの変更"/>
+    <w:bookmarkEnd w:id="95"/>
+    <w:bookmarkStart w:id="96" w:name="印刷幅最大高さの変更"/>
     <w:p>
       <w:pPr>
         <w:pStyle w:val="Heading3"/>
@@ -17390,9 +19546,9 @@
         </w:pict>
       </w:r>
     </w:p>
-    <w:bookmarkEnd w:id="80"/>
-    <w:bookmarkEnd w:id="81"/>
-    <w:bookmarkStart w:id="82" w:name="付録a-部品購入リストまとめ"/>
+    <w:bookmarkEnd w:id="96"/>
+    <w:bookmarkEnd w:id="97"/>
+    <w:bookmarkStart w:id="98" w:name="付録a-部品購入リストまとめ"/>
     <w:p>
       <w:pPr>
         <w:pStyle w:val="Heading2"/>
@@ -17674,8 +19830,8 @@
         </w:tc>
       </w:tr>
     </w:tbl>
-    <w:bookmarkEnd w:id="82"/>
-    <w:bookmarkStart w:id="83" w:name="付録b-用語集"/>
+    <w:bookmarkEnd w:id="98"/>
+    <w:bookmarkStart w:id="99" w:name="付録b-用語集"/>
     <w:p>
       <w:pPr>
         <w:pStyle w:val="Heading2"/>
@@ -18194,8 +20350,8 @@
         </w:tc>
       </w:tr>
     </w:tbl>
-    <w:bookmarkEnd w:id="83"/>
-    <w:bookmarkStart w:id="84" w:name="付録c-プロジェクトのソースコード構成"/>
+    <w:bookmarkEnd w:id="99"/>
+    <w:bookmarkStart w:id="100" w:name="付録c-プロジェクトのソースコード構成"/>
     <w:p>
       <w:pPr>
         <w:pStyle w:val="Heading2"/>
@@ -18590,8 +20746,8 @@
         <w:t xml:space="preserve">M5PaperColor用スケッチ</w:t>
       </w:r>
     </w:p>
-    <w:bookmarkEnd w:id="84"/>
-    <w:bookmarkStart w:id="85" w:name="付録d-参考文献リンク"/>
+    <w:bookmarkEnd w:id="100"/>
+    <w:bookmarkStart w:id="101" w:name="付録d-参考文献リンク"/>
     <w:p>
       <w:pPr>
         <w:pStyle w:val="Heading2"/>
@@ -18730,8 +20886,8 @@
         </w:pict>
       </w:r>
     </w:p>
-    <w:bookmarkEnd w:id="85"/>
-    <w:bookmarkStart w:id="86" w:name="おわりに"/>
+    <w:bookmarkEnd w:id="101"/>
+    <w:bookmarkStart w:id="102" w:name="おわりに"/>
     <w:p>
       <w:pPr>
         <w:pStyle w:val="Heading2"/>
@@ -18798,11 +20954,14 @@
         <w:t xml:space="preserve">あなたの手元で紙が印刷される、その最初の1枚を楽しみにしています。</w:t>
       </w:r>
     </w:p>
-    <w:bookmarkEnd w:id="86"/>
+    <w:bookmarkEnd w:id="102"/>
     <w:sectPr>
+      <w:footerReference w:type="default" r:id="rId9"/>
       <w:footnotePr>
         <w:numRestart w:val="eachSect"/>
       </w:footnotePr>
+      <w:pgSz w:w="11906" w:h="14570"/>
+      <w:pgMar w:top="1080" w:bottom="1224" w:left="1080" w:right="864" w:gutter="216" w:header="576" w:footer="576"/>
     </w:sectPr>
   </w:body>
 </w:document>
@@ -18810,6 +20969,28 @@
 
 <file path=word/comments.xml><?xml version="1.0" encoding="utf-8"?>
 <w:comments xmlns:w="http://schemas.openxmlformats.org/wordprocessingml/2006/main" xmlns:m="http://schemas.openxmlformats.org/officeDocument/2006/math" xmlns:r="http://schemas.openxmlformats.org/officeDocument/2006/relationships" xmlns:o="urn:schemas-microsoft-com:office:office" xmlns:v="urn:schemas-microsoft-com:vml" xmlns:w10="urn:schemas-microsoft-com:office:word" xmlns:a="http://schemas.openxmlformats.org/drawingml/2006/main" xmlns:pic="http://schemas.openxmlformats.org/drawingml/2006/picture" xmlns:wp="http://schemas.openxmlformats.org/drawingml/2006/wordprocessingDrawing"/>
+</file>
+
+<file path=word/footer1.xml><?xml version="1.0" encoding="utf-8"?>
+<w:ftr xmlns:m="http://schemas.openxmlformats.org/officeDocument/2006/math" xmlns:mc="http://schemas.openxmlformats.org/markup-compatibility/2006" xmlns:mo="http://schemas.microsoft.com/office/mac/office/2008/main" xmlns:mv="urn:schemas-microsoft-com:mac:vml" xmlns:o="urn:schemas-microsoft-com:office:office" xmlns:r="http://schemas.openxmlformats.org/officeDocument/2006/relationships" xmlns:v="urn:schemas-microsoft-com:vml" xmlns:w10="urn:schemas-microsoft-com:office:word" xmlns:w14="http://schemas.microsoft.com/office/word/2010/wordml" xmlns:w="http://schemas.openxmlformats.org/wordprocessingml/2006/main" xmlns:wne="http://schemas.microsoft.com/office/word/2006/wordml" xmlns:wp14="http://schemas.microsoft.com/office/word/2010/wordprocessingDrawing" xmlns:wp="http://schemas.openxmlformats.org/drawingml/2006/wordprocessingDrawing" xmlns:wpc="http://schemas.microsoft.com/office/word/2010/wordprocessingCanvas" xmlns:wpg="http://schemas.microsoft.com/office/word/2010/wordprocessingGroup" xmlns:wpi="http://schemas.microsoft.com/office/word/2010/wordprocessingInk" xmlns:wps="http://schemas.microsoft.com/office/word/2010/wordprocessingShape" mc:Ignorable="w14 wp14">
+  <w:p>
+    <w:pPr>
+      <w:pStyle w:val="Footer"/>
+      <w:jc w:val="center"/>
+    </w:pPr>
+    <w:r/>
+    <w:r>
+      <w:rPr>
+        <w:sz w:val="20"/>
+      </w:rPr>
+      <w:fldChar w:fldCharType="begin"/>
+      <w:instrText xml:space="preserve">PAGE</w:instrText>
+      <w:fldChar w:fldCharType="separate"/>
+      <w:t>1</w:t>
+      <w:fldChar w:fldCharType="end"/>
+    </w:r>
+  </w:p>
+</w:ftr>
 </file>
 
 <file path=word/footnotes.xml><?xml version="1.0" encoding="utf-8"?>

</xml_diff>